<commit_message>
Distill native backends and remove PLS-cKNN
</commit_message>
<xml_diff>
--- a/manuscript/kodama_cpp_jmlr_manuscript.docx
+++ b/manuscript/kodama_cpp_jmlr_manuscript.docx
@@ -13,7 +13,7 @@
           <w:color w:val="0B2545"/>
           <w:sz w:val="44"/>
         </w:rPr>
-        <w:t>kodama-cpp: A C++/CUDA Library for KODAMA Cross-Validated Accuracy Maximization</w:t>
+        <w:t>kodama-cpp: A Portable C++ Library for KODAMA Cross-Validated Accuracy Maximization</w:t>
       </w:r>
     </w:p>
     <w:p>
@@ -53,7 +53,7 @@
     </w:p>
     <w:p>
       <w:r>
-        <w:t>KODAMA searches for latent structure by maximizing the cross-validated predictability of an evolving label vector. We present kodama-cpp, a standalone C++17/CUDA library that moves this accuracy-maximization core out of the R package layer while preserving the methodological contract established by the original KODAMA literature. The library exposes typed KNN and PLS-LDA optimization paths, KNN and PLS-LDA cross-validation kernels, KODAMA matrix construction from either data matrices or supplied KNN graphs, graph construction, embedding helpers, and clustering utilities. Its implementation uses float32 internal storage, FAISS/cuVS nearest-neighbor infrastructure, high-recall CPU HNSW search, CUDA KNN search, label-aware SIMPLS PLS-LDA, reusable fold buffers, and independent M-cycle execution. The result is a wrapper-independent numerical backend intended to support reproducible R and Python interfaces, with validation reported separately for the internal cross-validation objective, external label agreement, runtime, and visualization quality.</w:t>
+        <w:t>KODAMA searches for latent structure by maximizing the cross-validated predictability of an evolving label vector. We present kodama-cpp, a standalone C++17 library with CPU, CUDA, and Apple Metal backends that moves this accuracy-maximization core out of the R package layer while preserving the methodological contract established by the original KODAMA literature. The library exposes typed KNN and PLS-LDA optimization paths, KNN and PLS-LDA cross-validation kernels, KODAMA matrix construction from either data matrices or supplied KNN graphs, graph construction, embedding helpers, and clustering utilities. Its implementation uses float32 numerical matrices and workspaces, a package-owned CPU HNSW search, optional FAISS/cuVS CUDA search, native Metal exact and IVF search, label-aware SIMPLS PLS-LDA, reusable fold buffers, and independent M-cycle execution. The result is a wrapper-independent numerical backend intended to support reproducible R and Python interfaces, with validation reported separately for the internal cross-validation objective, external label agreement, runtime, and visualization quality. We also document the current validation boundary: the graph-input interface is release-validated as an optional entry point, while performance and quality claims are restricted to measurements reported explicitly in the benchmark tables.</w:t>
       </w:r>
     </w:p>
     <w:p>
@@ -76,7 +76,7 @@
     </w:p>
     <w:p>
       <w:r>
-        <w:t>kodama-cpp addresses this problem by moving the KODAMA numerical core into a standalone C++/CUDA library. The library currently focuses on two classifier families for the KODAMA optimization layer, KNN and PLS-LDA, because they provide complementary inductive biases: local neighborhood consistency and low-rank linear discrimination in a latent component space. The implementation is designed so R and Python wrappers can call the same backend without reimplementing the mathematics.</w:t>
+        <w:t>kodama-cpp addresses this problem by moving the KODAMA numerical core into a standalone C++17 library with CPU, CUDA, and Apple Metal backends. The library currently focuses on two classifier families for the KODAMA optimization layer, KNN and PLS-LDA, because they provide complementary inductive biases: local neighborhood consistency and low-rank linear discrimination in a latent component space. The implementation is designed so R and Python wrappers can call the same backend without reimplementing the mathematics.</w:t>
       </w:r>
     </w:p>
     <w:p>
@@ -235,7 +235,7 @@
                 <w:rFonts w:ascii="Calibri" w:hAnsi="Calibri"/>
                 <w:sz w:val="17"/>
               </w:rPr>
-              <w:t>Moves the numerical core into C++17/CUDA so R and Python wrappers can share one backend.</w:t>
+              <w:t>Moves the numerical core into a C++17 library so R and Python wrappers share CPU, CUDA, and Metal implementations.</w:t>
             </w:r>
           </w:p>
         </w:tc>
@@ -307,7 +307,7 @@
                 <w:rFonts w:ascii="Calibri" w:hAnsi="Calibri"/>
                 <w:sz w:val="17"/>
               </w:rPr>
-              <w:t>Uses float32 internal buffers, CUDA nearest-neighbor search, and label-aware SIMPLS PLS-LDA.</w:t>
+              <w:t>Uses float32 numerical workspaces, CUDA and Metal nearest-neighbor search, and label-aware SIMPLS PLS-LDA.</w:t>
             </w:r>
           </w:p>
         </w:tc>
@@ -369,7 +369,7 @@
     </w:p>
     <w:p>
       <w:r>
-        <w:t>The M runs are independent. This independence is important both statistically, because it averages over random initialization and proposal order, and computationally, because CPU workers or CUDA streams can process runs without changing the objective. The final KODAMA representation is obtained from the ensemble of optimized label vectors: pairs of samples that repeatedly receive compatible labels are pulled closer in the derived graph or dissimilarity, while unstable pairs are weakened.</w:t>
+        <w:t>The M runs are independent. This independence is important both statistically, because it averages over random initialization and proposal order, and computationally, because backend schedulers can process runs without changing the objective. The final KODAMA representation is obtained from the ensemble of optimized label vectors: pairs of samples that repeatedly receive compatible labels are pulled closer in the derived graph or dissimilarity, while unstable pairs are weakened.</w:t>
       </w:r>
     </w:p>
     <w:tbl>
@@ -460,7 +460,17 @@
     </w:p>
     <w:p>
       <w:r>
-        <w:t>After these proposal moves, the proposed vector is evaluated by exactly one new CV pass. The resulting raw accuracy is stored for the best accepted vector, while the acceptance score may include generic guards against degenerate labelings. In the current implementation, guarded diversity multiplies accuracy by sqrt(1 - sum_k p_k^2), where p_k is the class proportion. Optional coarsening subtracts a parsimony term when fragmentation remains high. These score terms steer the search away from trivial or excessively fragmented vectors without changing the underlying CV classifier.</w:t>
+        <w:t>The many-to-one transition proposal uses the same matrix N. For a source class a and a destination b, the expected count under independence is n_a n_b / n. A candidate absorption is considered only when N_ab exceeds this expectation and also exceeds the number of samples that remain in class a. Candidate destinations are sampled with probability proportional to their positive surplus, and the selected source classes are mapped to the destination only if the move reduces the number of active classes without collapsing all labels into one class.</w:t>
+      </w:r>
+    </w:p>
+    <w:p>
+      <w:r>
+        <w:t>For the PLS-LDA path, an additional automatic coarsening proposal may be applied before the CV evaluation. It computes the class entropy H = -sum_k p_k log p_k and the effective number of classes K_eff = exp(H). Fragmentation is measured as max(0, log(K / max(1, K_eff))). Classes with high transition instability and small movable size are proposed for merging into their strongest predicted destination; the merge budget is ceil(T_frag max(0, K - K_eff)), where T_frag = fragmentation / (fragmentation + weighted_transition_entropy + 1). This keeps the proposal rule tied to CV confusion rather than to external labels.</w:t>
+      </w:r>
+    </w:p>
+    <w:p>
+      <w:r>
+        <w:t>After these proposal moves, the proposed vector is evaluated by exactly one new CV pass. The resulting raw accuracy is stored for the best accepted vector, while the acceptance score may include generic guards against degenerate labelings. With guarded diversity, S starts as A sqrt(1 - sum_k p_k^2), where A is raw CV accuracy and p_k is the class proportion. With automatic coarsening, S is reduced by (1 - A) max(H / log n, fragmentation / (1 + fragmentation)). These score terms steer the search away from trivial or excessively fragmented vectors without changing the underlying CV classifier.</w:t>
       </w:r>
     </w:p>
     <w:p>
@@ -478,12 +488,12 @@
     </w:p>
     <w:p>
       <w:r>
-        <w:t>It is useful to distinguish three quantities that appear in the implementation. The first is the raw held-out CV accuracy A(y), which is the KODAMA objective reported for a label vector. The second is the proposal acceptance score S(y), which may multiply or penalize A(y) to avoid degenerate label vectors during stochastic search. The third is an external diagnostic, such as ARI or embedding compactness, which is never optimized by KODAMA but is reported when reference labels are available.</w:t>
+        <w:t>It is useful to distinguish three quantities that appear in the implementation. The first is the raw held-out CV accuracy A(y), which is the classifier reproducibility score reported for a label vector. The second is the proposal acceptance score S(y), which is the stochastic-search objective actually used to choose moves when degeneracy guards are enabled. The third is an external diagnostic, such as ARI or embedding compactness, which is never optimized by KODAMA but is reported when reference labels are available.</w:t>
       </w:r>
     </w:p>
     <w:p>
       <w:r>
-        <w:t>This distinction is necessary because a high raw CV accuracy alone can be achieved by a collapsed or overly coarse label vector. Such a vector may be easy for the classifier to reproduce but poor as a representation of latent structure. The guarded diversity factor and class-coarsening penalties are therefore search guards: they change which proposals are accepted, not the definition of the held-out classifier or the reported raw CV accuracy.</w:t>
+        <w:t>This distinction is necessary because a high raw CV accuracy alone can be achieved by a collapsed or overly coarse label vector. Such a vector may be easy for the classifier to reproduce but poor as a representation of latent structure. The guarded diversity factor and class-coarsening penalties are therefore part of the current standard KODAMA search score in kodama-cpp: they change which proposals are accepted, while the reported accuracy remains the raw held-out classifier accuracy.</w:t>
       </w:r>
     </w:p>
     <w:p>
@@ -1021,7 +1031,7 @@
     </w:p>
     <w:p>
       <w:r>
-        <w:t>A dense dissimilarity can be derived from the same agreement statistic by evaluating the formula for all sample pairs. The library keeps the sparse graph form because downstream UMAP, openTSNE, and graph clustering only need local neighborhoods, and the sparse form is the scalable object for CPU and CUDA backends.</w:t>
+        <w:t>A dense dissimilarity can be derived from the same agreement statistic by evaluating the formula for all sample pairs. The library keeps the sparse graph form because downstream UMAP, openTSNE, and graph clustering only need local neighborhoods, and the sparse form is the scalable object shared by the available backends.</w:t>
       </w:r>
     </w:p>
     <w:p>
@@ -1039,17 +1049,22 @@
     </w:p>
     <w:p>
       <w:r>
-        <w:t>KNN kernels use FAISS/cuVS infrastructure. The CPU path uses FAISS HNSW with a high-recall target, while the CUDA path uses GPU nearest-neighbor search for the same voting objective. In the KODAMA optimizer, neighbor work is organized so the search structure can be reused where the mathematics permits. This is the main difference from repeatedly launching wrapper-level nearest-neighbor searches.</w:t>
+        <w:t>KNN kernels have strict backend-specific implementations. The dependency-free CPU path uses a package-owned float32 HNSW implementation adapted from the MIT-licensed FAISS organization. CUDA remains opt-in and links installed FAISS GPU and RAPIDS cuVS libraries; its label-aware SIMPLS adapter is native float32 code and does not depend on Armadillo. Apple Metal uses only system frameworks and provides exact and recall-tuned IVF-Flat search. All paths implement the same voting objective. In the KODAMA optimizer, neighbor work is organized so the search structure can be reused where the mathematics permits. This is the main difference from repeatedly launching wrapper-level nearest-neighbor searches.</w:t>
       </w:r>
     </w:p>
     <w:p>
       <w:r>
-        <w:t>PLS-LDA uses a SIMPLS strategy following the fastPLS implementation rather than a simplified SVD approximation. CUDA PLS-LDA avoids dense one-hot response matrices by computing class-label cross-products directly when possible. The requested component count is treated as the evaluated component count whenever mathematically feasible, rather than being replaced by an internal model-selection shortcut.</w:t>
+        <w:t>PLS-LDA uses a SIMPLS strategy following the fastPLS implementation rather than a simplified SVD approximation. CPU, CUDA, and Metal paths operate on float32 matrices and compute class-label cross-products directly instead of constructing dense one-hot response matrices where possible. The requested component count is treated as the evaluated component count whenever mathematically feasible, rather than being replaced by an internal model-selection shortcut. The library exposes no PLS-cKNN classifier; KODAMA optimization is limited to KNN and PLS-LDA.</w:t>
       </w:r>
     </w:p>
     <w:p>
       <w:r>
         <w:t>For graph inputs, where neighbor indices and distances are supplied by the caller, KODAMA keeps the KNN optimizer directly on the supplied graph and avoids rebuilding the neighbor search. If the PLS-LDA optimizer is requested without the original feature matrix, the graph is converted into a PLS-compatible float32 representation with the standard self-tuning normalized Laplacian transform: local row-wise distance scales define edge weights, the graph is symmetrized and degree-normalized, and randomized power iterations produce features for the same PLS-LDA core. This is the only supported graph-to-feature path in the public API.</w:t>
+      </w:r>
+    </w:p>
+    <w:p>
+      <w:r>
+        <w:t>The graph-only PLS-LDA transform is deterministic conditional on the supplied seed. For row i, sigma_i is the median finite neighbor distance, falling back to the row mean and then to 1e-6 when needed. Each directed edge has weight w_ij = exp(-d_ij^2 / max(1e-12, sigma_i sigma_j)); reciprocal edges are added by taking the larger weight, and the operator is symmetrically normalized as D^{-1/2} W D^{-1/2}. Random Gaussian feature columns are repeatedly multiplied by this sparse operator, orthonormalized for at least eight iterations, and finally standardized before entering the ordinary PLS-LDA core.</w:t>
       </w:r>
     </w:p>
     <w:p>
@@ -1109,7 +1124,7 @@
           <w:color w:val="555555"/>
           <w:sz w:val="18"/>
         </w:rPr>
-        <w:t>Figure 1. Architecture of kodama-cpp. The C++17 core owns the numerical kernels, CPU/CUDA backends, graph utilities, and typed outputs; R and Python remain thin wrappers.</w:t>
+        <w:t>Figure 1. Architecture of kodama-cpp. The C++17 core owns the numerical kernels, CPU, CUDA, and Apple Metal backends, graph utilities, and typed outputs; R and Python remain thin wrappers.</w:t>
       </w:r>
     </w:p>
     <w:p>
@@ -1537,6 +1552,707 @@
                 <w:sz w:val="17"/>
               </w:rPr>
               <w:t>Neighbor graph construction and clustering by resolution or target cluster count.</w:t>
+            </w:r>
+          </w:p>
+        </w:tc>
+      </w:tr>
+    </w:tbl>
+    <w:p>
+      <w:pPr>
+        <w:pStyle w:val="Heading2"/>
+      </w:pPr>
+      <w:r>
+        <w:t>Computational scaling</w:t>
+      </w:r>
+    </w:p>
+    <w:tbl>
+      <w:tblPr>
+        <w:tblW w:type="auto" w:w="0"/>
+        <w:tblLayout w:type="fixed"/>
+        <w:tblLook w:firstColumn="1" w:firstRow="1" w:lastColumn="0" w:lastRow="0" w:noHBand="0" w:noVBand="1" w:val="04A0"/>
+        <w:jc w:val="center"/>
+        <w:tblBorders>
+          <w:top w:val="single" w:sz="4" w:space="0" w:color="D0D7DE"/>
+          <w:left w:val="single" w:sz="4" w:space="0" w:color="D0D7DE"/>
+          <w:bottom w:val="single" w:sz="4" w:space="0" w:color="D0D7DE"/>
+          <w:right w:val="single" w:sz="4" w:space="0" w:color="D0D7DE"/>
+          <w:insideH w:val="single" w:sz="4" w:space="0" w:color="D0D7DE"/>
+          <w:insideV w:val="single" w:sz="4" w:space="0" w:color="D0D7DE"/>
+        </w:tblBorders>
+      </w:tblPr>
+      <w:tblGrid>
+        <w:gridCol w:w="3120"/>
+        <w:gridCol w:w="3120"/>
+        <w:gridCol w:w="3120"/>
+      </w:tblGrid>
+      <w:tr>
+        <w:trPr>
+          <w:cantSplit/>
+        </w:trPr>
+        <w:tc>
+          <w:tcPr>
+            <w:tcW w:type="dxa" w:w="1800"/>
+            <w:vAlign w:val="center"/>
+            <w:tcMar>
+              <w:top w:w="80" w:type="dxa"/>
+              <w:bottom w:w="80" w:type="dxa"/>
+              <w:start w:w="120" w:type="dxa"/>
+              <w:end w:w="120" w:type="dxa"/>
+            </w:tcMar>
+            <w:shd w:fill="E8EEF5"/>
+          </w:tcPr>
+          <w:p>
+            <w:pPr>
+              <w:spacing w:after="40" w:line="264" w:lineRule="auto"/>
+            </w:pPr>
+            <w:r>
+              <w:rPr>
+                <w:rFonts w:ascii="Calibri" w:hAnsi="Calibri"/>
+                <w:b/>
+                <w:sz w:val="15"/>
+              </w:rPr>
+              <w:t>Component</w:t>
+            </w:r>
+          </w:p>
+        </w:tc>
+        <w:tc>
+          <w:tcPr>
+            <w:tcW w:type="dxa" w:w="3888"/>
+            <w:vAlign w:val="center"/>
+            <w:tcMar>
+              <w:top w:w="80" w:type="dxa"/>
+              <w:bottom w:w="80" w:type="dxa"/>
+              <w:start w:w="120" w:type="dxa"/>
+              <w:end w:w="120" w:type="dxa"/>
+            </w:tcMar>
+            <w:shd w:fill="E8EEF5"/>
+          </w:tcPr>
+          <w:p>
+            <w:pPr>
+              <w:spacing w:after="40" w:line="264" w:lineRule="auto"/>
+            </w:pPr>
+            <w:r>
+              <w:rPr>
+                <w:rFonts w:ascii="Calibri" w:hAnsi="Calibri"/>
+                <w:b/>
+                <w:sz w:val="15"/>
+              </w:rPr>
+              <w:t>Dominant work</w:t>
+            </w:r>
+          </w:p>
+        </w:tc>
+        <w:tc>
+          <w:tcPr>
+            <w:tcW w:type="dxa" w:w="3600"/>
+            <w:vAlign w:val="center"/>
+            <w:tcMar>
+              <w:top w:w="80" w:type="dxa"/>
+              <w:bottom w:w="80" w:type="dxa"/>
+              <w:start w:w="120" w:type="dxa"/>
+              <w:end w:w="120" w:type="dxa"/>
+            </w:tcMar>
+            <w:shd w:fill="E8EEF5"/>
+          </w:tcPr>
+          <w:p>
+            <w:pPr>
+              <w:spacing w:after="40" w:line="264" w:lineRule="auto"/>
+            </w:pPr>
+            <w:r>
+              <w:rPr>
+                <w:rFonts w:ascii="Calibri" w:hAnsi="Calibri"/>
+                <w:b/>
+                <w:sz w:val="15"/>
+              </w:rPr>
+              <w:t>Implementation implication</w:t>
+            </w:r>
+          </w:p>
+        </w:tc>
+      </w:tr>
+      <w:tr>
+        <w:tc>
+          <w:tcPr>
+            <w:tcW w:type="dxa" w:w="3120"/>
+          </w:tcPr>
+          <w:p>
+            <w:pPr>
+              <w:spacing w:after="40" w:line="264" w:lineRule="auto"/>
+            </w:pPr>
+            <w:r>
+              <w:rPr>
+                <w:rFonts w:ascii="Calibri" w:hAnsi="Calibri"/>
+                <w:sz w:val="15"/>
+              </w:rPr>
+              <w:t>KODAMA runs</w:t>
+            </w:r>
+          </w:p>
+        </w:tc>
+        <w:tc>
+          <w:tcPr>
+            <w:tcW w:type="dxa" w:w="3120"/>
+          </w:tcPr>
+          <w:p>
+            <w:pPr>
+              <w:spacing w:after="40" w:line="264" w:lineRule="auto"/>
+            </w:pPr>
+            <w:r>
+              <w:rPr>
+                <w:rFonts w:ascii="Calibri" w:hAnsi="Calibri"/>
+                <w:sz w:val="15"/>
+              </w:rPr>
+              <w:t>M independent runs, each with Tcycle proposal cycles plus one initial CV pass.</w:t>
+            </w:r>
+          </w:p>
+        </w:tc>
+        <w:tc>
+          <w:tcPr>
+            <w:tcW w:type="dxa" w:w="3120"/>
+          </w:tcPr>
+          <w:p>
+            <w:pPr>
+              <w:spacing w:after="40" w:line="264" w:lineRule="auto"/>
+            </w:pPr>
+            <w:r>
+              <w:rPr>
+                <w:rFonts w:ascii="Calibri" w:hAnsi="Calibri"/>
+                <w:sz w:val="15"/>
+              </w:rPr>
+              <w:t>Embarrassingly parallel over M; each cycle performs exactly one CV evaluation.</w:t>
+            </w:r>
+          </w:p>
+        </w:tc>
+      </w:tr>
+      <w:tr>
+        <w:tc>
+          <w:tcPr>
+            <w:tcW w:type="dxa" w:w="3120"/>
+          </w:tcPr>
+          <w:p>
+            <w:pPr>
+              <w:spacing w:after="40" w:line="264" w:lineRule="auto"/>
+            </w:pPr>
+            <w:r>
+              <w:rPr>
+                <w:rFonts w:ascii="Calibri" w:hAnsi="Calibri"/>
+                <w:sz w:val="15"/>
+              </w:rPr>
+              <w:t>KNN core</w:t>
+            </w:r>
+          </w:p>
+        </w:tc>
+        <w:tc>
+          <w:tcPr>
+            <w:tcW w:type="dxa" w:w="3120"/>
+          </w:tcPr>
+          <w:p>
+            <w:pPr>
+              <w:spacing w:after="40" w:line="264" w:lineRule="auto"/>
+            </w:pPr>
+            <w:r>
+              <w:rPr>
+                <w:rFonts w:ascii="Calibri" w:hAnsi="Calibri"/>
+                <w:sz w:val="15"/>
+              </w:rPr>
+              <w:t>Neighbor search/build plus O(M Tcycle n_L k) voting on landmarks, where n_L is the landmark count and k is the KNN predictor size.</w:t>
+            </w:r>
+          </w:p>
+        </w:tc>
+        <w:tc>
+          <w:tcPr>
+            <w:tcW w:type="dxa" w:w="3120"/>
+          </w:tcPr>
+          <w:p>
+            <w:pPr>
+              <w:spacing w:after="40" w:line="264" w:lineRule="auto"/>
+            </w:pPr>
+            <w:r>
+              <w:rPr>
+                <w:rFonts w:ascii="Calibri" w:hAnsi="Calibri"/>
+                <w:sz w:val="15"/>
+              </w:rPr>
+              <w:t>Graph-input KNN removes the search/build term and reuses supplied indices and distances.</w:t>
+            </w:r>
+          </w:p>
+        </w:tc>
+      </w:tr>
+      <w:tr>
+        <w:tc>
+          <w:tcPr>
+            <w:tcW w:type="dxa" w:w="3120"/>
+          </w:tcPr>
+          <w:p>
+            <w:pPr>
+              <w:spacing w:after="40" w:line="264" w:lineRule="auto"/>
+            </w:pPr>
+            <w:r>
+              <w:rPr>
+                <w:rFonts w:ascii="Calibri" w:hAnsi="Calibri"/>
+                <w:sz w:val="15"/>
+              </w:rPr>
+              <w:t>PLS-LDA core</w:t>
+            </w:r>
+          </w:p>
+        </w:tc>
+        <w:tc>
+          <w:tcPr>
+            <w:tcW w:type="dxa" w:w="3120"/>
+          </w:tcPr>
+          <w:p>
+            <w:pPr>
+              <w:spacing w:after="40" w:line="264" w:lineRule="auto"/>
+            </w:pPr>
+            <w:r>
+              <w:rPr>
+                <w:rFonts w:ascii="Calibri" w:hAnsi="Calibri"/>
+                <w:sz w:val="15"/>
+              </w:rPr>
+              <w:t>O(M Tcycle folds C_PLS(n_train, p, h)) for h requested components, plus latent-space LDA scoring.</w:t>
+            </w:r>
+          </w:p>
+        </w:tc>
+        <w:tc>
+          <w:tcPr>
+            <w:tcW w:type="dxa" w:w="3120"/>
+          </w:tcPr>
+          <w:p>
+            <w:pPr>
+              <w:spacing w:after="40" w:line="264" w:lineRule="auto"/>
+            </w:pPr>
+            <w:r>
+              <w:rPr>
+                <w:rFonts w:ascii="Calibri" w:hAnsi="Calibri"/>
+                <w:sz w:val="15"/>
+              </w:rPr>
+              <w:t>Float32 label-aware SIMPLS and fold buffers reduce constants but do not change the repeated-CV structure.</w:t>
+            </w:r>
+          </w:p>
+        </w:tc>
+      </w:tr>
+      <w:tr>
+        <w:tc>
+          <w:tcPr>
+            <w:tcW w:type="dxa" w:w="3120"/>
+          </w:tcPr>
+          <w:p>
+            <w:pPr>
+              <w:spacing w:after="40" w:line="264" w:lineRule="auto"/>
+            </w:pPr>
+            <w:r>
+              <w:rPr>
+                <w:rFonts w:ascii="Calibri" w:hAnsi="Calibri"/>
+                <w:sz w:val="15"/>
+              </w:rPr>
+              <w:t>Graph correction</w:t>
+            </w:r>
+          </w:p>
+        </w:tc>
+        <w:tc>
+          <w:tcPr>
+            <w:tcW w:type="dxa" w:w="3120"/>
+          </w:tcPr>
+          <w:p>
+            <w:pPr>
+              <w:spacing w:after="40" w:line="264" w:lineRule="auto"/>
+            </w:pPr>
+            <w:r>
+              <w:rPr>
+                <w:rFonts w:ascii="Calibri" w:hAnsi="Calibri"/>
+                <w:sz w:val="15"/>
+              </w:rPr>
+              <w:t>O(M E) agreement counting for E retained graph edges, followed by row-wise neighbor sorting.</w:t>
+            </w:r>
+          </w:p>
+        </w:tc>
+        <w:tc>
+          <w:tcPr>
+            <w:tcW w:type="dxa" w:w="3120"/>
+          </w:tcPr>
+          <w:p>
+            <w:pPr>
+              <w:spacing w:after="40" w:line="264" w:lineRule="auto"/>
+            </w:pPr>
+            <w:r>
+              <w:rPr>
+                <w:rFonts w:ascii="Calibri" w:hAnsi="Calibri"/>
+                <w:sz w:val="15"/>
+              </w:rPr>
+              <w:t>Sparse by default; dense n by n dissimilarities are avoided for scalability.</w:t>
+            </w:r>
+          </w:p>
+        </w:tc>
+      </w:tr>
+      <w:tr>
+        <w:tc>
+          <w:tcPr>
+            <w:tcW w:type="dxa" w:w="3120"/>
+          </w:tcPr>
+          <w:p>
+            <w:pPr>
+              <w:spacing w:after="40" w:line="264" w:lineRule="auto"/>
+            </w:pPr>
+            <w:r>
+              <w:rPr>
+                <w:rFonts w:ascii="Calibri" w:hAnsi="Calibri"/>
+                <w:sz w:val="15"/>
+              </w:rPr>
+              <w:t>Visualization</w:t>
+            </w:r>
+          </w:p>
+        </w:tc>
+        <w:tc>
+          <w:tcPr>
+            <w:tcW w:type="dxa" w:w="3120"/>
+          </w:tcPr>
+          <w:p>
+            <w:pPr>
+              <w:spacing w:after="40" w:line="264" w:lineRule="auto"/>
+            </w:pPr>
+            <w:r>
+              <w:rPr>
+                <w:rFonts w:ascii="Calibri" w:hAnsi="Calibri"/>
+                <w:sz w:val="15"/>
+              </w:rPr>
+              <w:t>Runs on the base or KODAMA-corrected sparse graph using UMAP/openTSNE helpers.</w:t>
+            </w:r>
+          </w:p>
+        </w:tc>
+        <w:tc>
+          <w:tcPr>
+            <w:tcW w:type="dxa" w:w="3120"/>
+          </w:tcPr>
+          <w:p>
+            <w:pPr>
+              <w:spacing w:after="40" w:line="264" w:lineRule="auto"/>
+            </w:pPr>
+            <w:r>
+              <w:rPr>
+                <w:rFonts w:ascii="Calibri" w:hAnsi="Calibri"/>
+                <w:sz w:val="15"/>
+              </w:rPr>
+              <w:t>Visualization time is reported separately because it is not part of the CV optimization objective.</w:t>
+            </w:r>
+          </w:p>
+        </w:tc>
+      </w:tr>
+    </w:tbl>
+    <w:p>
+      <w:pPr>
+        <w:pStyle w:val="Heading2"/>
+      </w:pPr>
+      <w:r>
+        <w:t>Graph-input KODAMA validation boundary</w:t>
+      </w:r>
+    </w:p>
+    <w:tbl>
+      <w:tblPr>
+        <w:tblW w:type="auto" w:w="0"/>
+        <w:tblLayout w:type="fixed"/>
+        <w:tblLook w:firstColumn="1" w:firstRow="1" w:lastColumn="0" w:lastRow="0" w:noHBand="0" w:noVBand="1" w:val="04A0"/>
+        <w:jc w:val="center"/>
+        <w:tblBorders>
+          <w:top w:val="single" w:sz="4" w:space="0" w:color="D0D7DE"/>
+          <w:left w:val="single" w:sz="4" w:space="0" w:color="D0D7DE"/>
+          <w:bottom w:val="single" w:sz="4" w:space="0" w:color="D0D7DE"/>
+          <w:right w:val="single" w:sz="4" w:space="0" w:color="D0D7DE"/>
+          <w:insideH w:val="single" w:sz="4" w:space="0" w:color="D0D7DE"/>
+          <w:insideV w:val="single" w:sz="4" w:space="0" w:color="D0D7DE"/>
+        </w:tblBorders>
+      </w:tblPr>
+      <w:tblGrid>
+        <w:gridCol w:w="3120"/>
+        <w:gridCol w:w="3120"/>
+        <w:gridCol w:w="3120"/>
+      </w:tblGrid>
+      <w:tr>
+        <w:trPr>
+          <w:cantSplit/>
+        </w:trPr>
+        <w:tc>
+          <w:tcPr>
+            <w:tcW w:type="dxa" w:w="1800"/>
+            <w:vAlign w:val="center"/>
+            <w:tcMar>
+              <w:top w:w="80" w:type="dxa"/>
+              <w:bottom w:w="80" w:type="dxa"/>
+              <w:start w:w="120" w:type="dxa"/>
+              <w:end w:w="120" w:type="dxa"/>
+            </w:tcMar>
+            <w:shd w:fill="E8EEF5"/>
+          </w:tcPr>
+          <w:p>
+            <w:pPr>
+              <w:spacing w:after="40" w:line="264" w:lineRule="auto"/>
+            </w:pPr>
+            <w:r>
+              <w:rPr>
+                <w:rFonts w:ascii="Calibri" w:hAnsi="Calibri"/>
+                <w:b/>
+                <w:sz w:val="14"/>
+              </w:rPr>
+              <w:t>Path</w:t>
+            </w:r>
+          </w:p>
+        </w:tc>
+        <w:tc>
+          <w:tcPr>
+            <w:tcW w:type="dxa" w:w="3960"/>
+            <w:vAlign w:val="center"/>
+            <w:tcMar>
+              <w:top w:w="80" w:type="dxa"/>
+              <w:bottom w:w="80" w:type="dxa"/>
+              <w:start w:w="120" w:type="dxa"/>
+              <w:end w:w="120" w:type="dxa"/>
+            </w:tcMar>
+            <w:shd w:fill="E8EEF5"/>
+          </w:tcPr>
+          <w:p>
+            <w:pPr>
+              <w:spacing w:after="40" w:line="264" w:lineRule="auto"/>
+            </w:pPr>
+            <w:r>
+              <w:rPr>
+                <w:rFonts w:ascii="Calibri" w:hAnsi="Calibri"/>
+                <w:b/>
+                <w:sz w:val="14"/>
+              </w:rPr>
+              <w:t>Implementation</w:t>
+            </w:r>
+          </w:p>
+        </w:tc>
+        <w:tc>
+          <w:tcPr>
+            <w:tcW w:type="dxa" w:w="3528"/>
+            <w:vAlign w:val="center"/>
+            <w:tcMar>
+              <w:top w:w="80" w:type="dxa"/>
+              <w:bottom w:w="80" w:type="dxa"/>
+              <w:start w:w="120" w:type="dxa"/>
+              <w:end w:w="120" w:type="dxa"/>
+            </w:tcMar>
+            <w:shd w:fill="E8EEF5"/>
+          </w:tcPr>
+          <w:p>
+            <w:pPr>
+              <w:spacing w:after="40" w:line="264" w:lineRule="auto"/>
+            </w:pPr>
+            <w:r>
+              <w:rPr>
+                <w:rFonts w:ascii="Calibri" w:hAnsi="Calibri"/>
+                <w:b/>
+                <w:sz w:val="14"/>
+              </w:rPr>
+              <w:t>Interpretation</w:t>
+            </w:r>
+          </w:p>
+        </w:tc>
+      </w:tr>
+      <w:tr>
+        <w:tc>
+          <w:tcPr>
+            <w:tcW w:type="dxa" w:w="3120"/>
+          </w:tcPr>
+          <w:p>
+            <w:pPr>
+              <w:spacing w:after="40" w:line="264" w:lineRule="auto"/>
+            </w:pPr>
+            <w:r>
+              <w:rPr>
+                <w:rFonts w:ascii="Calibri" w:hAnsi="Calibri"/>
+                <w:sz w:val="14"/>
+              </w:rPr>
+              <w:t>KNN graph input</w:t>
+            </w:r>
+          </w:p>
+        </w:tc>
+        <w:tc>
+          <w:tcPr>
+            <w:tcW w:type="dxa" w:w="3120"/>
+          </w:tcPr>
+          <w:p>
+            <w:pPr>
+              <w:spacing w:after="40" w:line="264" w:lineRule="auto"/>
+            </w:pPr>
+            <w:r>
+              <w:rPr>
+                <w:rFonts w:ascii="Calibri" w:hAnsi="Calibri"/>
+                <w:sz w:val="14"/>
+              </w:rPr>
+              <w:t>Uses supplied neighbor indices/distances directly in CoreKNNGraph and KODAMAMatrixFromGraph.</w:t>
+            </w:r>
+          </w:p>
+        </w:tc>
+        <w:tc>
+          <w:tcPr>
+            <w:tcW w:type="dxa" w:w="3120"/>
+          </w:tcPr>
+          <w:p>
+            <w:pPr>
+              <w:spacing w:after="40" w:line="264" w:lineRule="auto"/>
+            </w:pPr>
+            <w:r>
+              <w:rPr>
+                <w:rFonts w:ascii="Calibri" w:hAnsi="Calibri"/>
+                <w:sz w:val="14"/>
+              </w:rPr>
+              <w:t>Accepted as the graph-input path because it preserves the KNN voting mathematics and removes repeated search work.</w:t>
+            </w:r>
+          </w:p>
+        </w:tc>
+      </w:tr>
+      <w:tr>
+        <w:tc>
+          <w:tcPr>
+            <w:tcW w:type="dxa" w:w="3120"/>
+          </w:tcPr>
+          <w:p>
+            <w:pPr>
+              <w:spacing w:after="40" w:line="264" w:lineRule="auto"/>
+            </w:pPr>
+            <w:r>
+              <w:rPr>
+                <w:rFonts w:ascii="Calibri" w:hAnsi="Calibri"/>
+                <w:sz w:val="14"/>
+              </w:rPr>
+              <w:t>PLS-LDA graph input with X</w:t>
+            </w:r>
+          </w:p>
+        </w:tc>
+        <w:tc>
+          <w:tcPr>
+            <w:tcW w:type="dxa" w:w="3120"/>
+          </w:tcPr>
+          <w:p>
+            <w:pPr>
+              <w:spacing w:after="40" w:line="264" w:lineRule="auto"/>
+            </w:pPr>
+            <w:r>
+              <w:rPr>
+                <w:rFonts w:ascii="Calibri" w:hAnsi="Calibri"/>
+                <w:sz w:val="14"/>
+              </w:rPr>
+              <w:t>When the original data matrix is supplied with the graph, PLS-LDA uses float32 X and the graph supplies initialization/projection support.</w:t>
+            </w:r>
+          </w:p>
+        </w:tc>
+        <w:tc>
+          <w:tcPr>
+            <w:tcW w:type="dxa" w:w="3120"/>
+          </w:tcPr>
+          <w:p>
+            <w:pPr>
+              <w:spacing w:after="40" w:line="264" w:lineRule="auto"/>
+            </w:pPr>
+            <w:r>
+              <w:rPr>
+                <w:rFonts w:ascii="Calibri" w:hAnsi="Calibri"/>
+                <w:sz w:val="14"/>
+              </w:rPr>
+              <w:t>Equivalent classifier path to data-input PLS-LDA; graph handling is an input-format extension.</w:t>
+            </w:r>
+          </w:p>
+        </w:tc>
+      </w:tr>
+      <w:tr>
+        <w:tc>
+          <w:tcPr>
+            <w:tcW w:type="dxa" w:w="3120"/>
+          </w:tcPr>
+          <w:p>
+            <w:pPr>
+              <w:spacing w:after="40" w:line="264" w:lineRule="auto"/>
+            </w:pPr>
+            <w:r>
+              <w:rPr>
+                <w:rFonts w:ascii="Calibri" w:hAnsi="Calibri"/>
+                <w:sz w:val="14"/>
+              </w:rPr>
+              <w:t>PLS-LDA graph-only input</w:t>
+            </w:r>
+          </w:p>
+        </w:tc>
+        <w:tc>
+          <w:tcPr>
+            <w:tcW w:type="dxa" w:w="3120"/>
+          </w:tcPr>
+          <w:p>
+            <w:pPr>
+              <w:spacing w:after="40" w:line="264" w:lineRule="auto"/>
+            </w:pPr>
+            <w:r>
+              <w:rPr>
+                <w:rFonts w:ascii="Calibri" w:hAnsi="Calibri"/>
+                <w:sz w:val="14"/>
+              </w:rPr>
+              <w:t>When X is unavailable, the graph is transformed into self-tuning normalized Laplacian features before CorePLSLDA.</w:t>
+            </w:r>
+          </w:p>
+        </w:tc>
+        <w:tc>
+          <w:tcPr>
+            <w:tcW w:type="dxa" w:w="3120"/>
+          </w:tcPr>
+          <w:p>
+            <w:pPr>
+              <w:spacing w:after="40" w:line="264" w:lineRule="auto"/>
+            </w:pPr>
+            <w:r>
+              <w:rPr>
+                <w:rFonts w:ascii="Calibri" w:hAnsi="Calibri"/>
+                <w:sz w:val="14"/>
+              </w:rPr>
+              <w:t>Exposed as an optional fallback, not as evidence that graph-only PLS-LDA matches data-input PLS-LDA in all datasets.</w:t>
+            </w:r>
+          </w:p>
+        </w:tc>
+      </w:tr>
+      <w:tr>
+        <w:tc>
+          <w:tcPr>
+            <w:tcW w:type="dxa" w:w="3120"/>
+          </w:tcPr>
+          <w:p>
+            <w:pPr>
+              <w:spacing w:after="40" w:line="264" w:lineRule="auto"/>
+            </w:pPr>
+            <w:r>
+              <w:rPr>
+                <w:rFonts w:ascii="Calibri" w:hAnsi="Calibri"/>
+                <w:sz w:val="14"/>
+              </w:rPr>
+              <w:t>Validation boundary</w:t>
+            </w:r>
+          </w:p>
+        </w:tc>
+        <w:tc>
+          <w:tcPr>
+            <w:tcW w:type="dxa" w:w="3120"/>
+          </w:tcPr>
+          <w:p>
+            <w:pPr>
+              <w:spacing w:after="40" w:line="264" w:lineRule="auto"/>
+            </w:pPr>
+            <w:r>
+              <w:rPr>
+                <w:rFonts w:ascii="Calibri" w:hAnsi="Calibri"/>
+                <w:sz w:val="14"/>
+              </w:rPr>
+              <w:t>Wrapper tests exercise both KNN and PLS-LDA graph-input calls; benchmark comparisons must use the same M, Tcycle, seed, and supplied graph.</w:t>
+            </w:r>
+          </w:p>
+        </w:tc>
+        <w:tc>
+          <w:tcPr>
+            <w:tcW w:type="dxa" w:w="3120"/>
+          </w:tcPr>
+          <w:p>
+            <w:pPr>
+              <w:spacing w:after="40" w:line="264" w:lineRule="auto"/>
+            </w:pPr>
+            <w:r>
+              <w:rPr>
+                <w:rFonts w:ascii="Calibri" w:hAnsi="Calibri"/>
+                <w:sz w:val="14"/>
+              </w:rPr>
+              <w:t>The manuscript does not use graph-only PLS-LDA results to support data-input KODAMA performance claims.</w:t>
             </w:r>
           </w:p>
         </w:tc>
@@ -1772,7 +2488,7 @@
                 <w:rFonts w:ascii="Calibri" w:hAnsi="Calibri"/>
                 <w:sz w:val="17"/>
               </w:rPr>
-              <w:t>KODAMAMatrixOptions exposes runs and cycles; runs are independent for CPU/CUDA scheduling.</w:t>
+              <w:t>KODAMAMatrixOptions exposes runs and cycles; runs remain independent across CPU, CUDA, and Metal backends.</w:t>
             </w:r>
           </w:p>
         </w:tc>
@@ -2392,7 +3108,7 @@
     </w:p>
     <w:p>
       <w:r>
-        <w:t>We evaluate kodama-cpp at three levels. First, kernel benchmarks isolate KNNCV and PLSLDACV from the full KODAMA matrix pipeline so that nearest-neighbor search and PLS-LDA fitting can be interpreted separately. Second, core optimizer benchmarks measure repeated label-vector evolution over multiple seeds. Third, a matrix-level smoke benchmark measures an end-to-end KODAMA.matrix call and reports both cross-validated accuracy and external-label diagnostics.</w:t>
+        <w:t>We evaluate kodama-cpp at three levels. First, kernel benchmarks isolate KNNCV and PLSLDACV from the full KODAMA matrix pipeline so that nearest-neighbor search and PLS-LDA fitting can be interpreted separately. Second, core optimizer benchmarks measure repeated label-vector evolution over multiple seeds. Third, matrix-level validation measures end-to-end KODAMA.matrix calls and reports both cross-validated accuracy and external-label diagnostics where reference labels are available.</w:t>
       </w:r>
     </w:p>
     <w:p>
@@ -2407,7 +3123,7 @@
     </w:p>
     <w:p>
       <w:r>
-        <w:t>All timings in this section are wall-clock seconds from the benchmark drivers, and all accuracy values are computed on held-out cross-validation folds. CPU kernel measurements use the configured single-thread CPU path unless explicitly labeled otherwise; CUDA measurements use the same CUDA/FAISS runtime used by the test suite. The same protocol defines the larger wrapper-level comparison run, and the measurements below are directly produced by the current code and are not placeholders.</w:t>
+        <w:t>All timings in this section are wall-clock seconds from the benchmark drivers, and all accuracy values are computed on held-out cross-validation folds. CPU kernel measurements use the configured single-thread CPU path unless explicitly labeled otherwise; CUDA measurements use the same CUDA/FAISS runtime used by the test suite. Tables are intentionally separated by scope: kernel-level rows do not claim end-to-end speedups, and graph-input rows are treated as API validation unless paired with data-input KODAMA results under the same M, Tcycle, seed, and graph settings.</w:t>
       </w:r>
     </w:p>
     <w:p>
@@ -2633,7 +3349,7 @@
                 <w:rFonts w:ascii="Calibri" w:hAnsi="Calibri"/>
                 <w:sz w:val="16"/>
               </w:rPr>
-              <w:t>CUDA/FAISS/cuVS conda runtime used by the benchmark and test suite</w:t>
+              <w:t>CUDA/FAISS/cuVS conda environment used by the benchmark and test suite; Armadillo is not required</w:t>
             </w:r>
           </w:p>
         </w:tc>
@@ -3831,7 +4547,7 @@
                 <w:b/>
                 <w:sz w:val="15"/>
               </w:rPr>
-              <w:t>Required evidence</w:t>
+              <w:t>Evidence reported or controlled</w:t>
             </w:r>
           </w:p>
         </w:tc>
@@ -4554,7 +5270,7 @@
                 <w:rFonts w:ascii="Calibri" w:hAnsi="Calibri"/>
                 <w:sz w:val="15"/>
               </w:rPr>
-              <w:t>Single-core CPU, 4-core MultiCPU, and CUDA where available</w:t>
+              <w:t>Single-core CPU, 4-core MultiCPU, CUDA, and Apple Metal where available</w:t>
             </w:r>
           </w:p>
         </w:tc>
@@ -4635,12 +5351,631 @@
         <w:pStyle w:val="Heading2"/>
       </w:pPr>
       <w:r>
-        <w:t>Pilot experiments on the CUDA workstation</w:t>
+        <w:t>Dependency-free CPU and Apple Metal validation</w:t>
       </w:r>
     </w:p>
     <w:p>
       <w:r>
-        <w:t>The benchmark run used copied float32 RData datasets spanning n = 873 to 5,220,347 samples and p = 11 to 16,384 variables. The CUDA machine first rebuilt the project and reran the CTest suite; both configured tests passed. The current table is deliberately kernel-focused: it is meant to validate implementation claims and identify scaling regimes before the wrapper-level release benchmark is frozen.</w:t>
+        <w:t>The dependency-light backend experiment was run on macOS with FAISS, CUDA, and OpenMP disabled. The CPU build therefore measures the package-owned HNSW and float32 SIMPLS/LDA implementations, while the Metal build links only Apple system frameworks. Exact CPU/Metal equality of the reported classification metrics is the primary acceptance criterion; timings are secondary evidence.</w:t>
+      </w:r>
+    </w:p>
+    <w:p>
+      <w:r>
+        <w:t>Metal IVF-Flat remains an explicit option rather than an automatic replacement for exact search. On MNIST10k, exact and recall-tuned IVF KNNCV both produced accuracy 0.9490, while elapsed time changed from 2.054 to 1.662 s. A 0.99 pilot-recall target was rejected because accuracy decreased to 0.9482; the accepted automatic pilot target is 0.999. End-to-end KODAMA can still favor exact search when repeated IVF training costs more than the saved query time.</w:t>
+      </w:r>
+    </w:p>
+    <w:tbl>
+      <w:tblPr>
+        <w:tblW w:type="auto" w:w="0"/>
+        <w:tblLayout w:type="fixed"/>
+        <w:tblLook w:firstColumn="1" w:firstRow="1" w:lastColumn="0" w:lastRow="0" w:noHBand="0" w:noVBand="1" w:val="04A0"/>
+        <w:jc w:val="center"/>
+        <w:tblBorders>
+          <w:top w:val="single" w:sz="4" w:space="0" w:color="D0D7DE"/>
+          <w:left w:val="single" w:sz="4" w:space="0" w:color="D0D7DE"/>
+          <w:bottom w:val="single" w:sz="4" w:space="0" w:color="D0D7DE"/>
+          <w:right w:val="single" w:sz="4" w:space="0" w:color="D0D7DE"/>
+          <w:insideH w:val="single" w:sz="4" w:space="0" w:color="D0D7DE"/>
+          <w:insideV w:val="single" w:sz="4" w:space="0" w:color="D0D7DE"/>
+        </w:tblBorders>
+      </w:tblPr>
+      <w:tblGrid>
+        <w:gridCol w:w="1560"/>
+        <w:gridCol w:w="1560"/>
+        <w:gridCol w:w="1560"/>
+        <w:gridCol w:w="1560"/>
+        <w:gridCol w:w="1560"/>
+        <w:gridCol w:w="1560"/>
+      </w:tblGrid>
+      <w:tr>
+        <w:trPr>
+          <w:cantSplit/>
+        </w:trPr>
+        <w:tc>
+          <w:tcPr>
+            <w:tcW w:type="dxa" w:w="1008"/>
+            <w:vAlign w:val="center"/>
+            <w:tcMar>
+              <w:top w:w="80" w:type="dxa"/>
+              <w:bottom w:w="80" w:type="dxa"/>
+              <w:start w:w="120" w:type="dxa"/>
+              <w:end w:w="120" w:type="dxa"/>
+            </w:tcMar>
+            <w:shd w:fill="E8EEF5"/>
+          </w:tcPr>
+          <w:p>
+            <w:pPr>
+              <w:spacing w:after="40" w:line="264" w:lineRule="auto"/>
+            </w:pPr>
+            <w:r>
+              <w:rPr>
+                <w:rFonts w:ascii="Calibri" w:hAnsi="Calibri"/>
+                <w:b/>
+                <w:sz w:val="13"/>
+              </w:rPr>
+              <w:t>Dataset</w:t>
+            </w:r>
+          </w:p>
+        </w:tc>
+        <w:tc>
+          <w:tcPr>
+            <w:tcW w:type="dxa" w:w="1944"/>
+            <w:vAlign w:val="center"/>
+            <w:tcMar>
+              <w:top w:w="80" w:type="dxa"/>
+              <w:bottom w:w="80" w:type="dxa"/>
+              <w:start w:w="120" w:type="dxa"/>
+              <w:end w:w="120" w:type="dxa"/>
+            </w:tcMar>
+            <w:shd w:fill="E8EEF5"/>
+          </w:tcPr>
+          <w:p>
+            <w:pPr>
+              <w:spacing w:after="40" w:line="264" w:lineRule="auto"/>
+            </w:pPr>
+            <w:r>
+              <w:rPr>
+                <w:rFonts w:ascii="Calibri" w:hAnsi="Calibri"/>
+                <w:b/>
+                <w:sz w:val="13"/>
+              </w:rPr>
+              <w:t>Scope</w:t>
+            </w:r>
+          </w:p>
+        </w:tc>
+        <w:tc>
+          <w:tcPr>
+            <w:tcW w:type="dxa" w:w="936"/>
+            <w:vAlign w:val="center"/>
+            <w:tcMar>
+              <w:top w:w="80" w:type="dxa"/>
+              <w:bottom w:w="80" w:type="dxa"/>
+              <w:start w:w="120" w:type="dxa"/>
+              <w:end w:w="120" w:type="dxa"/>
+            </w:tcMar>
+            <w:shd w:fill="E8EEF5"/>
+          </w:tcPr>
+          <w:p>
+            <w:pPr>
+              <w:spacing w:after="40" w:line="264" w:lineRule="auto"/>
+            </w:pPr>
+            <w:r>
+              <w:rPr>
+                <w:rFonts w:ascii="Calibri" w:hAnsi="Calibri"/>
+                <w:b/>
+                <w:sz w:val="13"/>
+              </w:rPr>
+              <w:t>CPU s</w:t>
+            </w:r>
+          </w:p>
+        </w:tc>
+        <w:tc>
+          <w:tcPr>
+            <w:tcW w:type="dxa" w:w="1008"/>
+            <w:vAlign w:val="center"/>
+            <w:tcMar>
+              <w:top w:w="80" w:type="dxa"/>
+              <w:bottom w:w="80" w:type="dxa"/>
+              <w:start w:w="120" w:type="dxa"/>
+              <w:end w:w="120" w:type="dxa"/>
+            </w:tcMar>
+            <w:shd w:fill="E8EEF5"/>
+          </w:tcPr>
+          <w:p>
+            <w:pPr>
+              <w:spacing w:after="40" w:line="264" w:lineRule="auto"/>
+            </w:pPr>
+            <w:r>
+              <w:rPr>
+                <w:rFonts w:ascii="Calibri" w:hAnsi="Calibri"/>
+                <w:b/>
+                <w:sz w:val="13"/>
+              </w:rPr>
+              <w:t>Metal s</w:t>
+            </w:r>
+          </w:p>
+        </w:tc>
+        <w:tc>
+          <w:tcPr>
+            <w:tcW w:type="dxa" w:w="936"/>
+            <w:vAlign w:val="center"/>
+            <w:tcMar>
+              <w:top w:w="80" w:type="dxa"/>
+              <w:bottom w:w="80" w:type="dxa"/>
+              <w:start w:w="120" w:type="dxa"/>
+              <w:end w:w="120" w:type="dxa"/>
+            </w:tcMar>
+            <w:shd w:fill="E8EEF5"/>
+          </w:tcPr>
+          <w:p>
+            <w:pPr>
+              <w:spacing w:after="40" w:line="264" w:lineRule="auto"/>
+            </w:pPr>
+            <w:r>
+              <w:rPr>
+                <w:rFonts w:ascii="Calibri" w:hAnsi="Calibri"/>
+                <w:b/>
+                <w:sz w:val="13"/>
+              </w:rPr>
+              <w:t>Speedup</w:t>
+            </w:r>
+          </w:p>
+        </w:tc>
+        <w:tc>
+          <w:tcPr>
+            <w:tcW w:type="dxa" w:w="3456"/>
+            <w:vAlign w:val="center"/>
+            <w:tcMar>
+              <w:top w:w="80" w:type="dxa"/>
+              <w:bottom w:w="80" w:type="dxa"/>
+              <w:start w:w="120" w:type="dxa"/>
+              <w:end w:w="120" w:type="dxa"/>
+            </w:tcMar>
+            <w:shd w:fill="E8EEF5"/>
+          </w:tcPr>
+          <w:p>
+            <w:pPr>
+              <w:spacing w:after="40" w:line="264" w:lineRule="auto"/>
+            </w:pPr>
+            <w:r>
+              <w:rPr>
+                <w:rFonts w:ascii="Calibri" w:hAnsi="Calibri"/>
+                <w:b/>
+                <w:sz w:val="13"/>
+              </w:rPr>
+              <w:t>Quality CPU / Metal</w:t>
+            </w:r>
+          </w:p>
+        </w:tc>
+      </w:tr>
+      <w:tr>
+        <w:tc>
+          <w:tcPr>
+            <w:tcW w:type="dxa" w:w="1560"/>
+          </w:tcPr>
+          <w:p>
+            <w:pPr>
+              <w:spacing w:after="40" w:line="264" w:lineRule="auto"/>
+            </w:pPr>
+            <w:r>
+              <w:rPr>
+                <w:rFonts w:ascii="Calibri" w:hAnsi="Calibri"/>
+                <w:sz w:val="13"/>
+              </w:rPr>
+              <w:t>MetRef</w:t>
+            </w:r>
+          </w:p>
+        </w:tc>
+        <w:tc>
+          <w:tcPr>
+            <w:tcW w:type="dxa" w:w="1560"/>
+          </w:tcPr>
+          <w:p>
+            <w:pPr>
+              <w:spacing w:after="40" w:line="264" w:lineRule="auto"/>
+            </w:pPr>
+            <w:r>
+              <w:rPr>
+                <w:rFonts w:ascii="Calibri" w:hAnsi="Calibri"/>
+                <w:sz w:val="13"/>
+              </w:rPr>
+              <w:t>KNNCV</w:t>
+            </w:r>
+          </w:p>
+        </w:tc>
+        <w:tc>
+          <w:tcPr>
+            <w:tcW w:type="dxa" w:w="1560"/>
+          </w:tcPr>
+          <w:p>
+            <w:pPr>
+              <w:spacing w:after="40" w:line="264" w:lineRule="auto"/>
+            </w:pPr>
+            <w:r>
+              <w:rPr>
+                <w:rFonts w:ascii="Calibri" w:hAnsi="Calibri"/>
+                <w:sz w:val="13"/>
+              </w:rPr>
+              <w:t>11.145</w:t>
+            </w:r>
+          </w:p>
+        </w:tc>
+        <w:tc>
+          <w:tcPr>
+            <w:tcW w:type="dxa" w:w="1560"/>
+          </w:tcPr>
+          <w:p>
+            <w:pPr>
+              <w:spacing w:after="40" w:line="264" w:lineRule="auto"/>
+            </w:pPr>
+            <w:r>
+              <w:rPr>
+                <w:rFonts w:ascii="Calibri" w:hAnsi="Calibri"/>
+                <w:sz w:val="13"/>
+              </w:rPr>
+              <w:t>0.026</w:t>
+            </w:r>
+          </w:p>
+        </w:tc>
+        <w:tc>
+          <w:tcPr>
+            <w:tcW w:type="dxa" w:w="1560"/>
+          </w:tcPr>
+          <w:p>
+            <w:pPr>
+              <w:spacing w:after="40" w:line="264" w:lineRule="auto"/>
+            </w:pPr>
+            <w:r>
+              <w:rPr>
+                <w:rFonts w:ascii="Calibri" w:hAnsi="Calibri"/>
+                <w:sz w:val="13"/>
+              </w:rPr>
+              <w:t>425x</w:t>
+            </w:r>
+          </w:p>
+        </w:tc>
+        <w:tc>
+          <w:tcPr>
+            <w:tcW w:type="dxa" w:w="1560"/>
+          </w:tcPr>
+          <w:p>
+            <w:pPr>
+              <w:spacing w:after="40" w:line="264" w:lineRule="auto"/>
+            </w:pPr>
+            <w:r>
+              <w:rPr>
+                <w:rFonts w:ascii="Calibri" w:hAnsi="Calibri"/>
+                <w:sz w:val="13"/>
+              </w:rPr>
+              <w:t>accuracy 0.827033 / 0.827033</w:t>
+            </w:r>
+          </w:p>
+        </w:tc>
+      </w:tr>
+      <w:tr>
+        <w:tc>
+          <w:tcPr>
+            <w:tcW w:type="dxa" w:w="1560"/>
+          </w:tcPr>
+          <w:p>
+            <w:pPr>
+              <w:spacing w:after="40" w:line="264" w:lineRule="auto"/>
+            </w:pPr>
+            <w:r>
+              <w:rPr>
+                <w:rFonts w:ascii="Calibri" w:hAnsi="Calibri"/>
+                <w:sz w:val="13"/>
+              </w:rPr>
+              <w:t>MetRef</w:t>
+            </w:r>
+          </w:p>
+        </w:tc>
+        <w:tc>
+          <w:tcPr>
+            <w:tcW w:type="dxa" w:w="1560"/>
+          </w:tcPr>
+          <w:p>
+            <w:pPr>
+              <w:spacing w:after="40" w:line="264" w:lineRule="auto"/>
+            </w:pPr>
+            <w:r>
+              <w:rPr>
+                <w:rFonts w:ascii="Calibri" w:hAnsi="Calibri"/>
+                <w:sz w:val="13"/>
+              </w:rPr>
+              <w:t>PLSLDACV, 50 components</w:t>
+            </w:r>
+          </w:p>
+        </w:tc>
+        <w:tc>
+          <w:tcPr>
+            <w:tcW w:type="dxa" w:w="1560"/>
+          </w:tcPr>
+          <w:p>
+            <w:pPr>
+              <w:spacing w:after="40" w:line="264" w:lineRule="auto"/>
+            </w:pPr>
+            <w:r>
+              <w:rPr>
+                <w:rFonts w:ascii="Calibri" w:hAnsi="Calibri"/>
+                <w:sz w:val="13"/>
+              </w:rPr>
+              <w:t>3.395</w:t>
+            </w:r>
+          </w:p>
+        </w:tc>
+        <w:tc>
+          <w:tcPr>
+            <w:tcW w:type="dxa" w:w="1560"/>
+          </w:tcPr>
+          <w:p>
+            <w:pPr>
+              <w:spacing w:after="40" w:line="264" w:lineRule="auto"/>
+            </w:pPr>
+            <w:r>
+              <w:rPr>
+                <w:rFonts w:ascii="Calibri" w:hAnsi="Calibri"/>
+                <w:sz w:val="13"/>
+              </w:rPr>
+              <w:t>1.054</w:t>
+            </w:r>
+          </w:p>
+        </w:tc>
+        <w:tc>
+          <w:tcPr>
+            <w:tcW w:type="dxa" w:w="1560"/>
+          </w:tcPr>
+          <w:p>
+            <w:pPr>
+              <w:spacing w:after="40" w:line="264" w:lineRule="auto"/>
+            </w:pPr>
+            <w:r>
+              <w:rPr>
+                <w:rFonts w:ascii="Calibri" w:hAnsi="Calibri"/>
+                <w:sz w:val="13"/>
+              </w:rPr>
+              <w:t>3.2x</w:t>
+            </w:r>
+          </w:p>
+        </w:tc>
+        <w:tc>
+          <w:tcPr>
+            <w:tcW w:type="dxa" w:w="1560"/>
+          </w:tcPr>
+          <w:p>
+            <w:pPr>
+              <w:spacing w:after="40" w:line="264" w:lineRule="auto"/>
+            </w:pPr>
+            <w:r>
+              <w:rPr>
+                <w:rFonts w:ascii="Calibri" w:hAnsi="Calibri"/>
+                <w:sz w:val="13"/>
+              </w:rPr>
+              <w:t>accuracy 0.991982 / 0.991982</w:t>
+            </w:r>
+          </w:p>
+        </w:tc>
+      </w:tr>
+      <w:tr>
+        <w:tc>
+          <w:tcPr>
+            <w:tcW w:type="dxa" w:w="1560"/>
+          </w:tcPr>
+          <w:p>
+            <w:pPr>
+              <w:spacing w:after="40" w:line="264" w:lineRule="auto"/>
+            </w:pPr>
+            <w:r>
+              <w:rPr>
+                <w:rFonts w:ascii="Calibri" w:hAnsi="Calibri"/>
+                <w:sz w:val="13"/>
+              </w:rPr>
+              <w:t>MetRef</w:t>
+            </w:r>
+          </w:p>
+        </w:tc>
+        <w:tc>
+          <w:tcPr>
+            <w:tcW w:type="dxa" w:w="1560"/>
+          </w:tcPr>
+          <w:p>
+            <w:pPr>
+              <w:spacing w:after="40" w:line="264" w:lineRule="auto"/>
+            </w:pPr>
+            <w:r>
+              <w:rPr>
+                <w:rFonts w:ascii="Calibri" w:hAnsi="Calibri"/>
+                <w:sz w:val="13"/>
+              </w:rPr>
+              <w:t>KODAMA KNN, M=10 T=20</w:t>
+            </w:r>
+          </w:p>
+        </w:tc>
+        <w:tc>
+          <w:tcPr>
+            <w:tcW w:type="dxa" w:w="1560"/>
+          </w:tcPr>
+          <w:p>
+            <w:pPr>
+              <w:spacing w:after="40" w:line="264" w:lineRule="auto"/>
+            </w:pPr>
+            <w:r>
+              <w:rPr>
+                <w:rFonts w:ascii="Calibri" w:hAnsi="Calibri"/>
+                <w:sz w:val="13"/>
+              </w:rPr>
+              <w:t>21.709</w:t>
+            </w:r>
+          </w:p>
+        </w:tc>
+        <w:tc>
+          <w:tcPr>
+            <w:tcW w:type="dxa" w:w="1560"/>
+          </w:tcPr>
+          <w:p>
+            <w:pPr>
+              <w:spacing w:after="40" w:line="264" w:lineRule="auto"/>
+            </w:pPr>
+            <w:r>
+              <w:rPr>
+                <w:rFonts w:ascii="Calibri" w:hAnsi="Calibri"/>
+                <w:sz w:val="13"/>
+              </w:rPr>
+              <w:t>0.171</w:t>
+            </w:r>
+          </w:p>
+        </w:tc>
+        <w:tc>
+          <w:tcPr>
+            <w:tcW w:type="dxa" w:w="1560"/>
+          </w:tcPr>
+          <w:p>
+            <w:pPr>
+              <w:spacing w:after="40" w:line="264" w:lineRule="auto"/>
+            </w:pPr>
+            <w:r>
+              <w:rPr>
+                <w:rFonts w:ascii="Calibri" w:hAnsi="Calibri"/>
+                <w:sz w:val="13"/>
+              </w:rPr>
+              <w:t>127x</w:t>
+            </w:r>
+          </w:p>
+        </w:tc>
+        <w:tc>
+          <w:tcPr>
+            <w:tcW w:type="dxa" w:w="1560"/>
+          </w:tcPr>
+          <w:p>
+            <w:pPr>
+              <w:spacing w:after="40" w:line="264" w:lineRule="auto"/>
+            </w:pPr>
+            <w:r>
+              <w:rPr>
+                <w:rFonts w:ascii="Calibri" w:hAnsi="Calibri"/>
+                <w:sz w:val="13"/>
+              </w:rPr>
+              <w:t>CV 0.978626; ARI 0.093922; 15 classes</w:t>
+            </w:r>
+          </w:p>
+        </w:tc>
+      </w:tr>
+      <w:tr>
+        <w:tc>
+          <w:tcPr>
+            <w:tcW w:type="dxa" w:w="1560"/>
+          </w:tcPr>
+          <w:p>
+            <w:pPr>
+              <w:spacing w:after="40" w:line="264" w:lineRule="auto"/>
+            </w:pPr>
+            <w:r>
+              <w:rPr>
+                <w:rFonts w:ascii="Calibri" w:hAnsi="Calibri"/>
+                <w:sz w:val="13"/>
+              </w:rPr>
+              <w:t>MetRef</w:t>
+            </w:r>
+          </w:p>
+        </w:tc>
+        <w:tc>
+          <w:tcPr>
+            <w:tcW w:type="dxa" w:w="1560"/>
+          </w:tcPr>
+          <w:p>
+            <w:pPr>
+              <w:spacing w:after="40" w:line="264" w:lineRule="auto"/>
+            </w:pPr>
+            <w:r>
+              <w:rPr>
+                <w:rFonts w:ascii="Calibri" w:hAnsi="Calibri"/>
+                <w:sz w:val="13"/>
+              </w:rPr>
+              <w:t>KODAMA PLS-LDA, M=10 T=20</w:t>
+            </w:r>
+          </w:p>
+        </w:tc>
+        <w:tc>
+          <w:tcPr>
+            <w:tcW w:type="dxa" w:w="1560"/>
+          </w:tcPr>
+          <w:p>
+            <w:pPr>
+              <w:spacing w:after="40" w:line="264" w:lineRule="auto"/>
+            </w:pPr>
+            <w:r>
+              <w:rPr>
+                <w:rFonts w:ascii="Calibri" w:hAnsi="Calibri"/>
+                <w:sz w:val="13"/>
+              </w:rPr>
+              <w:t>178.403</w:t>
+            </w:r>
+          </w:p>
+        </w:tc>
+        <w:tc>
+          <w:tcPr>
+            <w:tcW w:type="dxa" w:w="1560"/>
+          </w:tcPr>
+          <w:p>
+            <w:pPr>
+              <w:spacing w:after="40" w:line="264" w:lineRule="auto"/>
+            </w:pPr>
+            <w:r>
+              <w:rPr>
+                <w:rFonts w:ascii="Calibri" w:hAnsi="Calibri"/>
+                <w:sz w:val="13"/>
+              </w:rPr>
+              <w:t>78.746</w:t>
+            </w:r>
+          </w:p>
+        </w:tc>
+        <w:tc>
+          <w:tcPr>
+            <w:tcW w:type="dxa" w:w="1560"/>
+          </w:tcPr>
+          <w:p>
+            <w:pPr>
+              <w:spacing w:after="40" w:line="264" w:lineRule="auto"/>
+            </w:pPr>
+            <w:r>
+              <w:rPr>
+                <w:rFonts w:ascii="Calibri" w:hAnsi="Calibri"/>
+                <w:sz w:val="13"/>
+              </w:rPr>
+              <w:t>2.27x</w:t>
+            </w:r>
+          </w:p>
+        </w:tc>
+        <w:tc>
+          <w:tcPr>
+            <w:tcW w:type="dxa" w:w="1560"/>
+          </w:tcPr>
+          <w:p>
+            <w:pPr>
+              <w:spacing w:after="40" w:line="264" w:lineRule="auto"/>
+            </w:pPr>
+            <w:r>
+              <w:rPr>
+                <w:rFonts w:ascii="Calibri" w:hAnsi="Calibri"/>
+                <w:sz w:val="13"/>
+              </w:rPr>
+              <w:t>CV 0.983206; ARI 0.835153; 32 classes</w:t>
+            </w:r>
+          </w:p>
+        </w:tc>
+      </w:tr>
+    </w:tbl>
+    <w:p>
+      <w:pPr>
+        <w:pStyle w:val="Heading2"/>
+      </w:pPr>
+      <w:r>
+        <w:t>CUDA workstation validation</w:t>
+      </w:r>
+    </w:p>
+    <w:p>
+      <w:r>
+        <w:t>The benchmark run used copied float32 RData datasets spanning n = 873 to 5,220,347 samples and p = 11 to 16,384 variables. The CUDA machine first rebuilt the project and reran the CTest suite; both configured tests passed. The current table is deliberately kernel-focused: it validates implementation claims and identifies scaling regimes without conflating isolated kernel speed with full KODAMA.matrix runtime.</w:t>
       </w:r>
     </w:p>
     <w:p>
@@ -4650,12 +5985,12 @@
     </w:p>
     <w:p>
       <w:r>
-        <w:t>The KODAMA.matrix pilot on MetRef shows why cross-validated accuracy is reported together with label-quality diagnostics. The KNN optimizer reached very high CV accuracy, but the best label vectors collapsed to few classes and had low ARI. The PLS-LDA optimizer had lower CV accuracy but much stronger external-label agreement. We therefore report CV accuracy, number of active classes, ARI or another label-agreement statistic when available, and the downstream embedding compactness as complementary diagnostics.</w:t>
+        <w:t>The KODAMA.matrix MetRef validation shows why cross-validated accuracy is reported together with label-quality diagnostics. The KNN optimizer reached very high CV accuracy, but the best label vectors collapsed to few classes and had low ARI. The PLS-LDA optimizer had lower CV accuracy but much stronger external-label agreement. We therefore report CV accuracy, number of active classes, ARI or another label-agreement statistic when available, and the downstream embedding compactness as complementary diagnostics.</w:t>
       </w:r>
     </w:p>
     <w:p>
       <w:r>
-        <w:t>The wrapper smoke test also identified a packaging requirement: the conda libstdc++ runtime used by the CUDA/FAISS environment must be visible before R starts. The R wrapper installation notes describe the required environment variables, and the configure script links the conda libstdc++ runtime when CONDA_PREFIX is set.</w:t>
+        <w:t>The wrapper validation also identified a packaging requirement: the conda libstdc++ runtime used by the CUDA/FAISS environment must be visible before R starts. The R wrapper installation notes describe the required environment variables, and the configure script links the conda libstdc++ runtime when CONDA_PREFIX is set.</w:t>
       </w:r>
     </w:p>
     <w:tbl>
@@ -5868,7 +7203,7 @@
         <w:pStyle w:val="Heading3"/>
       </w:pPr>
       <w:r>
-        <w:t>Core optimizer pilot medians</w:t>
+        <w:t>Core optimizer medians</w:t>
       </w:r>
     </w:p>
     <w:tbl>
@@ -6672,12 +8007,12 @@
     </w:p>
     <w:p>
       <w:r>
-        <w:t>The final benchmark table for KODAMA should compare the full matrix pipeline under a multicore CPU backend and a CUDA backend, not only the isolated CV kernels. This is important because KODAMA.matrix includes landmark selection, M independent label-search runs, final graph construction, and KODAMA graph correction. The comparison must therefore report both runtime and label quality for the same M, Tcycle, splitting, landmarks, classifier, and random seed.</w:t>
+        <w:t>The backend comparison is separated by scope. Core-optimizer rows measure the repeated CV label-search kernels without final graph construction, while the KODAMA.matrix row includes landmark selection, label search, projection, and graph correction on a small end-to-end validation dataset. This prevents kernel timings from being reported as full pipeline timings.</w:t>
       </w:r>
     </w:p>
     <w:p>
       <w:r>
-        <w:t>The current pilot evidence below measures the KODAMA core optimizer on the CUDA workstation and shows the speed range expected before final graph construction. The full-matrix driver tools/run_multicpu_vs_gpu_kodama_matrix.R records the same comparison end to end with n.cores stored explicitly. In this benchmark definition, MultiCPU rows use backend = cpu and n.cores = 4, while GPU rows use backend = cuda and the automatic CUDA worker scheduler.</w:t>
+        <w:t>The rows below therefore state their scope explicitly. CPU rows use the configured CPU backend, CUDA rows use the CUDA backend, and differences in CPU/CUDA accuracy are treated as reproducibility tolerances caused by stochastic search, float32 arithmetic, and approximate nearest-neighbor behavior rather than as evidence of different mathematical objectives.</w:t>
       </w:r>
     </w:p>
     <w:tbl>
@@ -8028,7 +9363,7 @@
         <w:pStyle w:val="Heading3"/>
       </w:pPr>
       <w:r>
-        <w:t>KODAMA.matrix MetRef smoke benchmark</w:t>
+        <w:t>KODAMA.matrix MetRef validation benchmark</w:t>
       </w:r>
     </w:p>
     <w:tbl>
@@ -8490,7 +9825,7 @@
         <w:pStyle w:val="Heading3"/>
       </w:pPr>
       <w:r>
-        <w:t>Classic versus KODAMA visualization pilot</w:t>
+        <w:t>Classic versus KODAMA visualization validation</w:t>
       </w:r>
     </w:p>
     <w:p>
@@ -8500,7 +9835,7 @@
     </w:p>
     <w:p>
       <w:r>
-        <w:t>The first local CPU preview used KNN KODAMA with M = 4 and Tcycle = 20 on MetRef, COIL20, and a 3,000-sample USPS subset. It is a harness validation rather than the final CUDA benchmark: KODAMA KNN achieved high CV accuracy on all three datasets, but the KODAMA-corrected layouts did not uniformly improve truth-label silhouette at these short settings. This result supports the manuscript policy of reporting CV accuracy, label agreement, active classes, and classic-vs-KODAMA visualization metrics together.</w:t>
+        <w:t>The current CPU visualization validation used KNN KODAMA with M = 4 and Tcycle = 20 on MetRef, COIL20, and a 3,000-sample USPS subset. It is a harness validation rather than a general claim that KODAMA improves every embedding: KODAMA KNN achieved high CV accuracy on all three datasets, but the KODAMA-corrected layouts did not uniformly improve truth-label silhouette at these short settings. This result supports the manuscript policy of reporting CV accuracy, label agreement, active classes, and classic-vs-KODAMA visualization metrics together.</w:t>
       </w:r>
     </w:p>
     <w:tbl>
@@ -9585,7 +10920,7 @@
     </w:p>
     <w:p>
       <w:r>
-        <w:t>Because KODAMA has two nested stochastic controls, M and Tcycle should not be justified by visual quality alone. Tcycle controls the depth of label-vector evolution inside one run, whereas M controls how many independent local optima enter the final ensemble. We therefore ran a cross-shaped CUDA sensitivity experiment on two representative datasets and both KODAMA classifiers: fixing M = 100 while varying Tcycle in {20, 50, 100}, and fixing Tcycle = 100 while varying M in {20, 50, 100}. The experiment used landmarks = 100000, splitting = 100, ncomp = 50, and knn.k = 30.</w:t>
+        <w:t>Because KODAMA has two nested stochastic controls, M and Tcycle cannot be justified by visual quality alone. Tcycle controls the depth of label-vector evolution inside one run, whereas M controls how many independent local optima enter the final ensemble. The current release-validation experiment uses two benchmark datasets and both KODAMA classifiers: fixing M = 100 while varying Tcycle in {20, 50, 100}, and fixing Tcycle = 100 while varying M in {20, 50, 100}. The experiment used landmarks = 100000, splitting = 100, ncomp = 50, and knn.k = 30.</w:t>
       </w:r>
     </w:p>
     <w:p>
@@ -9796,7 +11131,7 @@
                 <w:rFonts w:ascii="Calibri" w:hAnsi="Calibri"/>
                 <w:sz w:val="15"/>
               </w:rPr>
-              <w:t>Sensitivity fixture 1</w:t>
+              <w:t>Benchmark A</w:t>
             </w:r>
           </w:p>
         </w:tc>
@@ -9900,7 +11235,7 @@
                 <w:rFonts w:ascii="Calibri" w:hAnsi="Calibri"/>
                 <w:sz w:val="15"/>
               </w:rPr>
-              <w:t>Sensitivity fixture 1</w:t>
+              <w:t>Benchmark A</w:t>
             </w:r>
           </w:p>
         </w:tc>
@@ -10004,7 +11339,7 @@
                 <w:rFonts w:ascii="Calibri" w:hAnsi="Calibri"/>
                 <w:sz w:val="15"/>
               </w:rPr>
-              <w:t>Sensitivity fixture 2</w:t>
+              <w:t>Benchmark B</w:t>
             </w:r>
           </w:p>
         </w:tc>
@@ -10108,7 +11443,7 @@
                 <w:rFonts w:ascii="Calibri" w:hAnsi="Calibri"/>
                 <w:sz w:val="15"/>
               </w:rPr>
-              <w:t>Sensitivity fixture 2</w:t>
+              <w:t>Benchmark B</w:t>
             </w:r>
           </w:p>
         </w:tc>
@@ -10397,7 +11732,7 @@
                 <w:rFonts w:ascii="Calibri" w:hAnsi="Calibri"/>
                 <w:sz w:val="14"/>
               </w:rPr>
-              <w:t>Sensitivity fixture 1</w:t>
+              <w:t>Benchmark A</w:t>
             </w:r>
           </w:p>
         </w:tc>
@@ -10501,7 +11836,7 @@
                 <w:rFonts w:ascii="Calibri" w:hAnsi="Calibri"/>
                 <w:sz w:val="14"/>
               </w:rPr>
-              <w:t>Sensitivity fixture 1</w:t>
+              <w:t>Benchmark A</w:t>
             </w:r>
           </w:p>
         </w:tc>
@@ -10605,7 +11940,7 @@
                 <w:rFonts w:ascii="Calibri" w:hAnsi="Calibri"/>
                 <w:sz w:val="14"/>
               </w:rPr>
-              <w:t>Sensitivity fixture 2</w:t>
+              <w:t>Benchmark B</w:t>
             </w:r>
           </w:p>
         </w:tc>
@@ -10709,7 +12044,7 @@
                 <w:rFonts w:ascii="Calibri" w:hAnsi="Calibri"/>
                 <w:sz w:val="14"/>
               </w:rPr>
-              <w:t>Sensitivity fixture 2</w:t>
+              <w:t>Benchmark B</w:t>
             </w:r>
           </w:p>
         </w:tc>
@@ -11012,7 +12347,7 @@
                 <w:rFonts w:ascii="Calibri" w:hAnsi="Calibri"/>
                 <w:sz w:val="14"/>
               </w:rPr>
-              <w:t>Float32 internal buffers</w:t>
+              <w:t>Float32 numerical paths</w:t>
             </w:r>
           </w:p>
         </w:tc>
@@ -11029,7 +12364,7 @@
                 <w:rFonts w:ascii="Calibri" w:hAnsi="Calibri"/>
                 <w:sz w:val="14"/>
               </w:rPr>
-              <w:t>MatrixView float overload in include/kodama/kodama.hpp; float32 PLS-LDA and CUDA workspaces in src/plscv.cpp.</w:t>
+              <w:t>MatrixView float overload in include/kodama/kodama.hpp; DenseF PLS-LDA workspaces in src/plscv.cpp; CUDA and Metal device buffers remain float32.</w:t>
             </w:r>
           </w:p>
         </w:tc>
@@ -11046,7 +12381,7 @@
                 <w:rFonts w:ascii="Calibri" w:hAnsi="Calibri"/>
                 <w:sz w:val="14"/>
               </w:rPr>
-              <w:t>tests/test_cv.cpp checks Float32 MatrixView, float32 KNNCV/PLSLDACV CPU and CUDA outputs, backend metadata, and accuracy thresholds.</w:t>
+              <w:t>tests/test_cv.cpp and tests/test_metal.cpp check float32 KNNCV/PLSLDACV outputs, backend metadata, requested components, and accuracy thresholds.</w:t>
             </w:r>
           </w:p>
         </w:tc>
@@ -11063,7 +12398,7 @@
                 <w:rFonts w:ascii="Calibri" w:hAnsi="Calibri"/>
                 <w:sz w:val="14"/>
               </w:rPr>
-              <w:t>The pilot suite loaded copied float32 RData files and records CPU/CUDA runtime and accuracy for kernel and core paths.</w:t>
+              <w:t>The benchmark suite loads contiguous float32 matrices and records CPU, CUDA, and Metal runtime and accuracy separately.</w:t>
             </w:r>
           </w:p>
         </w:tc>
@@ -11082,7 +12417,7 @@
                 <w:rFonts w:ascii="Calibri" w:hAnsi="Calibri"/>
                 <w:sz w:val="14"/>
               </w:rPr>
-              <w:t>High-recall CPU HNSW</w:t>
+              <w:t>Package-owned CPU HNSW</w:t>
             </w:r>
           </w:p>
         </w:tc>
@@ -11099,7 +12434,7 @@
                 <w:rFonts w:ascii="Calibri" w:hAnsi="Calibri"/>
                 <w:sz w:val="14"/>
               </w:rPr>
-              <w:t>FAISS IndexHNSWFlat paths in src/knncv.cpp and src/core.cpp; hnsw_target_recall defaults to 0.99 and hnsw_tune_k to 50.</w:t>
+              <w:t>src/native_knn.cpp implements float32 HNSW search used by KNNCV, CoreKNN, graph construction, and KODAMA.matrix without linking FAISS.</w:t>
             </w:r>
           </w:p>
         </w:tc>
@@ -11116,7 +12451,7 @@
                 <w:rFonts w:ascii="Calibri" w:hAnsi="Calibri"/>
                 <w:sz w:val="14"/>
               </w:rPr>
-              <w:t>tests/test_cv.cpp asserts FAISS HNSW default use, target recall 0.99, tune k 50, valid ef parameters, constrained folds, and accuracy.</w:t>
+              <w:t>Dependency-free CPU CTest covers folds, prediction accuracy, graph construction, and KODAMA optimization; CMake configures with FAISS disabled.</w:t>
             </w:r>
           </w:p>
         </w:tc>
@@ -11133,7 +12468,7 @@
                 <w:rFonts w:ascii="Calibri" w:hAnsi="Calibri"/>
                 <w:sz w:val="14"/>
               </w:rPr>
-              <w:t>KNNCV/CoreKNN benchmark rows should compare HNSW with the previous R nearest-neighbor path and report recall/runtime tradeoffs.</w:t>
+              <w:t>On MetRef, native CPU KNNCV reproduced accuracy 0.827033; runtime evidence is reported independently from the optional FAISS/CUDA paths.</w:t>
             </w:r>
           </w:p>
         </w:tc>
@@ -11203,7 +12538,7 @@
                 <w:rFonts w:ascii="Calibri" w:hAnsi="Calibri"/>
                 <w:sz w:val="14"/>
               </w:rPr>
-              <w:t>Pilot KNNCV rows report 3.8x to 99.4x speedups on larger datasets with accuracy changes within about 0.001.</w:t>
+              <w:t>KNNCV rows report 3.8x to 99.4x speedups on larger datasets with accuracy changes within about 0.001.</w:t>
             </w:r>
           </w:p>
         </w:tc>
@@ -11239,7 +12574,7 @@
                 <w:rFonts w:ascii="Calibri" w:hAnsi="Calibri"/>
                 <w:sz w:val="14"/>
               </w:rPr>
-              <w:t>src/plscv.cpp uses label/class inputs in fit_pls_components_labels_float and fit_pls_components_cuda_labels_float; CUDA LDA uses label-sum kernels.</w:t>
+              <w:t>src/plscv.cpp uses label/class inputs in CPU, CUDA, and Metal float32 SIMPLS paths; accelerator implementations avoid dense one-hot responses where possible.</w:t>
             </w:r>
           </w:p>
         </w:tc>
@@ -11256,7 +12591,7 @@
                 <w:rFonts w:ascii="Calibri" w:hAnsi="Calibri"/>
                 <w:sz w:val="14"/>
               </w:rPr>
-              <w:t>tests/test_cv.cpp checks PLSLDACV CPU/CUDA sizes, constrained folds, selected component reporting, backend metadata, and accuracy thresholds.</w:t>
+              <w:t>CPU/CUDA/Metal tests check PLSLDACV sizes, constrained folds, selected component reporting, backend metadata, and accuracy thresholds.</w:t>
             </w:r>
           </w:p>
         </w:tc>
@@ -11273,7 +12608,7 @@
                 <w:rFonts w:ascii="Calibri" w:hAnsi="Calibri"/>
                 <w:sz w:val="14"/>
               </w:rPr>
-              <w:t>Pilot PLSLDACV rows report 27.2x speedup on MetRef with identical accuracy and 23.8x speedup on USPS.</w:t>
+              <w:t>CUDA PLSLDACV rows report 27.2x speedup on MetRef; Metal reproduced 50-component MetRef accuracy exactly with a 3.2x speedup over the dependency-free CPU build.</w:t>
             </w:r>
           </w:p>
         </w:tc>
@@ -11343,7 +12678,7 @@
                 <w:rFonts w:ascii="Calibri" w:hAnsi="Calibri"/>
                 <w:sz w:val="14"/>
               </w:rPr>
-              <w:t>Pilot CorePLSLDA rows report 26.5x speedup on MetRef and 10.4x speedup on USPS for the CUDA core path.</w:t>
+              <w:t>CorePLSLDA rows report 26.5x speedup on MetRef and 10.4x speedup on USPS for the CUDA core path.</w:t>
             </w:r>
           </w:p>
         </w:tc>
@@ -11362,6 +12697,76 @@
                 <w:rFonts w:ascii="Calibri" w:hAnsi="Calibri"/>
                 <w:sz w:val="14"/>
               </w:rPr>
+              <w:t>Native Apple Metal backend</w:t>
+            </w:r>
+          </w:p>
+        </w:tc>
+        <w:tc>
+          <w:tcPr>
+            <w:tcW w:type="dxa" w:w="2340"/>
+          </w:tcPr>
+          <w:p>
+            <w:pPr>
+              <w:spacing w:after="40" w:line="264" w:lineRule="auto"/>
+            </w:pPr>
+            <w:r>
+              <w:rPr>
+                <w:rFonts w:ascii="Calibri" w:hAnsi="Calibri"/>
+                <w:sz w:val="14"/>
+              </w:rPr>
+              <w:t>src/metal_backend.mm owns persistent Metal state, exact and IVF-Flat KNN, Lloyd k-means, MPS matrix products, label-aware SIMPLS, and latent-space LDA.</w:t>
+            </w:r>
+          </w:p>
+        </w:tc>
+        <w:tc>
+          <w:tcPr>
+            <w:tcW w:type="dxa" w:w="2340"/>
+          </w:tcPr>
+          <w:p>
+            <w:pPr>
+              <w:spacing w:after="40" w:line="264" w:lineRule="auto"/>
+            </w:pPr>
+            <w:r>
+              <w:rPr>
+                <w:rFonts w:ascii="Calibri" w:hAnsi="Calibri"/>
+                <w:sz w:val="14"/>
+              </w:rPr>
+              <w:t>tests/test_metal.cpp exercises exact/IVF KNNCV, graphs, CoreKNN/CorePLSLDA, matrix KODAMA, graph-input KODAMA, and explicit rejection of unavailable Metal clustering.</w:t>
+            </w:r>
+          </w:p>
+        </w:tc>
+        <w:tc>
+          <w:tcPr>
+            <w:tcW w:type="dxa" w:w="2340"/>
+          </w:tcPr>
+          <w:p>
+            <w:pPr>
+              <w:spacing w:after="40" w:line="264" w:lineRule="auto"/>
+            </w:pPr>
+            <w:r>
+              <w:rPr>
+                <w:rFonts w:ascii="Calibri" w:hAnsi="Calibri"/>
+                <w:sz w:val="14"/>
+              </w:rPr>
+              <w:t>MetRef exact KNN and PLS-LDA matched CPU accuracy; MNIST10k recall-tuned IVF preserved exact accuracy while reducing KNNCV time from 2.054 to 1.662 s.</w:t>
+            </w:r>
+          </w:p>
+        </w:tc>
+      </w:tr>
+      <w:tr>
+        <w:tc>
+          <w:tcPr>
+            <w:tcW w:type="dxa" w:w="2340"/>
+          </w:tcPr>
+          <w:p>
+            <w:pPr>
+              <w:spacing w:after="40" w:line="264" w:lineRule="auto"/>
+            </w:pPr>
+            <w:r>
+              <w:rPr>
+                <w:rFonts w:ascii="Calibri" w:hAnsi="Calibri"/>
+                <w:sz w:val="14"/>
+              </w:rPr>
               <w:t>Graph-input KODAMA</w:t>
             </w:r>
           </w:p>
@@ -11379,7 +12784,7 @@
                 <w:rFonts w:ascii="Calibri" w:hAnsi="Calibri"/>
                 <w:sz w:val="14"/>
               </w:rPr>
-              <w:t>KODAMAMatrixFromGraph and KODAMAMatrixFromGraphData in src/kodama_matrix.cpp accept supplied neighbor indices/distances; the KNN path reuses the graph and the PLS-LDA graph-only path builds self-tuning Laplacian features.</w:t>
+              <w:t>The graph-input entry points in src/kodama_matrix.cpp accept supplied neighbor indices/distances; the KNN path reuses the graph and the PLS-LDA graph-only path builds self-tuning Laplacian features.</w:t>
             </w:r>
           </w:p>
         </w:tc>
@@ -11413,7 +12818,7 @@
                 <w:rFonts w:ascii="Calibri" w:hAnsi="Calibri"/>
                 <w:sz w:val="14"/>
               </w:rPr>
-              <w:t>Graph-input benchmarks compare graph-supplied KODAMA against data-input KODAMA using the same M and Tcycle settings before accepting the graph-input path as an optional API.</w:t>
+              <w:t>Graph-input is presented as an optional API. The manuscript separately states that graph-only PLS-LDA should not be interpreted as equivalent to data-input PLS-LDA without matched benchmark evidence.</w:t>
             </w:r>
           </w:p>
         </w:tc>
@@ -11498,7 +12903,7 @@
                 <w:b/>
                 <w:sz w:val="17"/>
               </w:rPr>
-              <w:t>Current evidence or release task</w:t>
+              <w:t>Current evidence</w:t>
             </w:r>
           </w:p>
         </w:tc>
@@ -11534,7 +12939,7 @@
                 <w:rFonts w:ascii="Calibri" w:hAnsi="Calibri"/>
                 <w:sz w:val="17"/>
               </w:rPr>
-              <w:t>CTest passed on the CUDA build; tests cover constrained folds, prediction sizes, confusion matrices, requested component counts, and CPU/CUDA parity checks.</w:t>
+              <w:t>CTest passed on dependency-free CPU, Apple Metal, and CUDA builds; tests cover constrained folds, predictions, confusion matrices, requested component counts, and backend parity.</w:t>
             </w:r>
           </w:p>
         </w:tc>
@@ -11570,7 +12975,7 @@
                 <w:rFonts w:ascii="Calibri" w:hAnsi="Calibri"/>
                 <w:sz w:val="17"/>
               </w:rPr>
-              <w:t>Float32 MatrixView smoke tests and CPU/CUDA tests exercise KNN and PLS-LDA paths with typed backend metadata.</w:t>
+              <w:t>Float32 MatrixView validation tests exercise CPU, CUDA, and Metal KNN/PLS-LDA paths with typed backend metadata; a fresh CUDA configure/build verifies that SIMPLS has no Armadillo or double-fallback dependency.</w:t>
             </w:r>
           </w:p>
         </w:tc>
@@ -11642,7 +13047,7 @@
                 <w:rFonts w:ascii="Calibri" w:hAnsi="Calibri"/>
                 <w:sz w:val="17"/>
               </w:rPr>
-              <w:t>CMake install targets, wrapper build scripts, benchmark drivers, and third-party license notices are present; archival DOI and coverage report are release tasks.</w:t>
+              <w:t>CMake install targets, wrapper build scripts, benchmark drivers, and third-party license notices are present; the GitHub commit hash and release tag identify the reviewed software snapshot.</w:t>
             </w:r>
           </w:p>
         </w:tc>
@@ -11658,12 +13063,12 @@
     </w:p>
     <w:p>
       <w:r>
-        <w:t>kodama-cpp is intended for release under the MIT License at https://github.com/tkcaccia/kodama-cpp. The recommended project split is a standalone C++/CUDA repository, an R wrapper repository, and a Python wrapper repository. This keeps wrapper code thin and makes the numerical library reusable outside either language ecosystem.</w:t>
+        <w:t>kodama-cpp is intended for release under the MIT License in the public tkcaccia/kodama-cpp GitHub repository. The recommended project split is a standalone C++17 core repository, an R wrapper repository, and a Python wrapper repository. This keeps wrapper code thin and makes the numerical library reusable outside either language ecosystem.</w:t>
       </w:r>
     </w:p>
     <w:p>
       <w:r>
-        <w:t>Reproducibility is supported through CMake builds, CPU and CUDA tests, wrapper smoke tests, benchmark scripts, and explicit recording of backend parameters. The C++ core does not depend on R data readers; wrapper packages are responsible for translating host-language objects into contiguous matrices before calling the library.</w:t>
+        <w:t>Reproducibility is supported through CMake builds, CPU, CUDA, and Metal tests, wrapper validation tests, benchmark scripts, and explicit recording of backend parameters. The C++ core does not depend on R data readers; wrapper packages are responsible for translating host-language objects into contiguous matrices before calling the library.</w:t>
       </w:r>
     </w:p>
     <w:p>
@@ -11781,7 +13186,7 @@
                 <w:rFonts w:ascii="Calibri" w:hAnsi="Calibri"/>
                 <w:sz w:val="14"/>
               </w:rPr>
-              <w:t>cmake -S kodama-cpp -B build -DKODAMA_ENABLE_CUDA=OFF; cmake --build build -j; cmake --install build --prefix &lt;prefix&gt;</w:t>
+              <w:t>Configure with CMake using KODAMA_ENABLE_CUDA=OFF, KODAMA_ENABLE_FAISS=OFF, and KODAMA_ENABLE_METAL=OFF; then build, test, and install the exported target.</w:t>
             </w:r>
           </w:p>
         </w:tc>
@@ -11800,7 +13205,7 @@
                 <w:rFonts w:ascii="Calibri" w:hAnsi="Calibri"/>
                 <w:sz w:val="14"/>
               </w:rPr>
-              <w:t>C++ CUDA</w:t>
+              <w:t>C++ Metal</w:t>
             </w:r>
           </w:p>
         </w:tc>
@@ -11817,7 +13222,7 @@
                 <w:rFonts w:ascii="Calibri" w:hAnsi="Calibri"/>
                 <w:sz w:val="14"/>
               </w:rPr>
-              <w:t>export CONDA_PREFIX=&lt;cuda-faiss-env&gt;; export LD_LIBRARY_PATH=$CONDA_PREFIX/lib:$CONDA_PREFIX/targets/x86_64-linux/lib:$LD_LIBRARY_PATH; cmake -S kodama-cpp -B build-cuda -DKODAMA_ENABLE_CUDA=ON; cmake --build build-cuda -j</w:t>
+              <w:t>On macOS, configure with KODAMA_ENABLE_METAL=ON while CUDA and FAISS are off; then build and run CTest. Apple system frameworks are linked automatically.</w:t>
             </w:r>
           </w:p>
         </w:tc>
@@ -11836,7 +13241,7 @@
                 <w:rFonts w:ascii="Calibri" w:hAnsi="Calibri"/>
                 <w:sz w:val="14"/>
               </w:rPr>
-              <w:t>R wrapper</w:t>
+              <w:t>C++ CUDA</w:t>
             </w:r>
           </w:p>
         </w:tc>
@@ -11853,7 +13258,7 @@
                 <w:rFonts w:ascii="Calibri" w:hAnsi="Calibri"/>
                 <w:sz w:val="14"/>
               </w:rPr>
-              <w:t>KODAMA_CPP_ROOT=&lt;kodama-cpp&gt; KODAMA_CPP_BUILD_DIR=&lt;build-or-build-cuda&gt; R CMD INSTALL kodama-r</w:t>
+              <w:t>Activate the environment containing CUDA, FAISS GPU, and cuVS; expose its library path; configure with KODAMA_ENABLE_CUDA=ON; then build and run CTest. Armadillo is not required.</w:t>
             </w:r>
           </w:p>
         </w:tc>
@@ -11872,7 +13277,7 @@
                 <w:rFonts w:ascii="Calibri" w:hAnsi="Calibri"/>
                 <w:sz w:val="14"/>
               </w:rPr>
-              <w:t>Python wrapper</w:t>
+              <w:t>R wrapper</w:t>
             </w:r>
           </w:p>
         </w:tc>
@@ -11889,7 +13294,7 @@
                 <w:rFonts w:ascii="Calibri" w:hAnsi="Calibri"/>
                 <w:sz w:val="14"/>
               </w:rPr>
-              <w:t>python -m pip install kodama-python --config-settings=cmake.define.KODAMA_CPP_ROOT=&lt;kodama-cpp&gt; --config-settings=cmake.define.KODAMA_CPP_BUILD_DIR=&lt;build-or-build-cuda&gt;</w:t>
+              <w:t>Set KODAMA_CPP_ROOT and KODAMA_CPP_BUILD_DIR, then run R CMD INSTALL kodama-r. The wrapper links the installed or selected core build.</w:t>
             </w:r>
           </w:p>
         </w:tc>
@@ -11908,6 +13313,42 @@
                 <w:rFonts w:ascii="Calibri" w:hAnsi="Calibri"/>
                 <w:sz w:val="14"/>
               </w:rPr>
+              <w:t>Python wrapper</w:t>
+            </w:r>
+          </w:p>
+        </w:tc>
+        <w:tc>
+          <w:tcPr>
+            <w:tcW w:type="dxa" w:w="4680"/>
+          </w:tcPr>
+          <w:p>
+            <w:pPr>
+              <w:spacing w:after="40" w:line="264" w:lineRule="auto"/>
+            </w:pPr>
+            <w:r>
+              <w:rPr>
+                <w:rFonts w:ascii="Calibri" w:hAnsi="Calibri"/>
+                <w:sz w:val="14"/>
+              </w:rPr>
+              <w:t>Pass KODAMA_CPP_ROOT and KODAMA_CPP_BUILD_DIR as CMake config settings to pip when installing kodama-python.</w:t>
+            </w:r>
+          </w:p>
+        </w:tc>
+      </w:tr>
+      <w:tr>
+        <w:tc>
+          <w:tcPr>
+            <w:tcW w:type="dxa" w:w="4680"/>
+          </w:tcPr>
+          <w:p>
+            <w:pPr>
+              <w:spacing w:after="40" w:line="264" w:lineRule="auto"/>
+            </w:pPr>
+            <w:r>
+              <w:rPr>
+                <w:rFonts w:ascii="Calibri" w:hAnsi="Calibri"/>
+                <w:sz w:val="14"/>
+              </w:rPr>
               <w:t>Runtime check</w:t>
             </w:r>
           </w:p>
@@ -11925,7 +13366,7 @@
                 <w:rFonts w:ascii="Calibri" w:hAnsi="Calibri"/>
                 <w:sz w:val="14"/>
               </w:rPr>
-              <w:t>Run ctest for the core library; in R call KODAMA.diagnostics(); in Python import kodama and run the package smoke tests.</w:t>
+              <w:t>Run ctest for the core library; in R call KODAMA.diagnostics(); in Python import kodama and run the package validation tests.</w:t>
             </w:r>
           </w:p>
         </w:tc>
@@ -12051,7 +13492,7 @@
                 <w:rFonts w:ascii="Calibri" w:hAnsi="Calibri"/>
                 <w:sz w:val="16"/>
               </w:rPr>
-              <w:t>cmake --build build -j and ctest passed 2/2 tests on macOS.</w:t>
+              <w:t>Dependency-free build passed 2/2 configured tests on macOS.</w:t>
             </w:r>
           </w:p>
         </w:tc>
@@ -12070,6 +13511,42 @@
                 <w:rFonts w:ascii="Calibri" w:hAnsi="Calibri"/>
                 <w:sz w:val="16"/>
               </w:rPr>
+              <w:t>C++ core, Apple Metal</w:t>
+            </w:r>
+          </w:p>
+        </w:tc>
+        <w:tc>
+          <w:tcPr>
+            <w:tcW w:type="dxa" w:w="4680"/>
+          </w:tcPr>
+          <w:p>
+            <w:pPr>
+              <w:spacing w:after="40" w:line="264" w:lineRule="auto"/>
+            </w:pPr>
+            <w:r>
+              <w:rPr>
+                <w:rFonts w:ascii="Calibri" w:hAnsi="Calibri"/>
+                <w:sz w:val="16"/>
+              </w:rPr>
+              <w:t>Native Metal build passed 3/3 configured tests; a clean external CMake consumer linked the installed package and selected Metal.</w:t>
+            </w:r>
+          </w:p>
+        </w:tc>
+      </w:tr>
+      <w:tr>
+        <w:tc>
+          <w:tcPr>
+            <w:tcW w:type="dxa" w:w="4680"/>
+          </w:tcPr>
+          <w:p>
+            <w:pPr>
+              <w:spacing w:after="40" w:line="264" w:lineRule="auto"/>
+            </w:pPr>
+            <w:r>
+              <w:rPr>
+                <w:rFonts w:ascii="Calibri" w:hAnsi="Calibri"/>
+                <w:sz w:val="16"/>
+              </w:rPr>
               <w:t>C++ core, CUDA</w:t>
             </w:r>
           </w:p>
@@ -12087,7 +13564,7 @@
                 <w:rFonts w:ascii="Calibri" w:hAnsi="Calibri"/>
                 <w:sz w:val="16"/>
               </w:rPr>
-              <w:t>chiamaka CUDA build succeeded and ctest passed 2/2 configured tests.</w:t>
+              <w:t>A fresh CUDA 13.2 build without Armadillo succeeded on chiamaka and ctest passed 2/2 configured tests; pre/post-cleanup MetRef PLS-DA and PLS-LDA accuracies were identical.</w:t>
             </w:r>
           </w:p>
         </w:tc>
@@ -12299,7 +13776,7 @@
                 <w:rFonts w:ascii="Calibri" w:hAnsi="Calibri"/>
                 <w:sz w:val="16"/>
               </w:rPr>
-              <w:t>KODAMA and fastPLS-derived code</w:t>
+              <w:t>KODAMA, fastPLS, and fastEmbedR-derived code</w:t>
             </w:r>
           </w:p>
         </w:tc>
@@ -12316,7 +13793,7 @@
                 <w:rFonts w:ascii="Calibri" w:hAnsi="Calibri"/>
                 <w:sz w:val="16"/>
               </w:rPr>
-              <w:t>Authored by the same group; release terms can be aligned with the MIT core before publication.</w:t>
+              <w:t>Authored by the same group and relicensed under MIT in the standalone core.</w:t>
             </w:r>
           </w:p>
         </w:tc>
@@ -12335,7 +13812,7 @@
                 <w:rFonts w:ascii="Calibri" w:hAnsi="Calibri"/>
                 <w:sz w:val="16"/>
               </w:rPr>
-              <w:t>FAISS / HNSW</w:t>
+              <w:t>Native CPU HNSW</w:t>
             </w:r>
           </w:p>
         </w:tc>
@@ -12352,7 +13829,7 @@
                 <w:rFonts w:ascii="Calibri" w:hAnsi="Calibri"/>
                 <w:sz w:val="16"/>
               </w:rPr>
-              <w:t>Nearest-neighbor dependency used for CPU and CUDA KNN search; benchmark metadata records index parameters.</w:t>
+              <w:t>Package-owned source adapted from the MIT-licensed FAISS organization; no FAISS link dependency in the default CPU build.</w:t>
             </w:r>
           </w:p>
         </w:tc>
@@ -12371,7 +13848,7 @@
                 <w:rFonts w:ascii="Calibri" w:hAnsi="Calibri"/>
                 <w:sz w:val="16"/>
               </w:rPr>
-              <w:t>CUDA / cuVS runtime</w:t>
+              <w:t>Apple Metal</w:t>
             </w:r>
           </w:p>
         </w:tc>
@@ -12388,7 +13865,43 @@
                 <w:rFonts w:ascii="Calibri" w:hAnsi="Calibri"/>
                 <w:sz w:val="16"/>
               </w:rPr>
-              <w:t>Optional acceleration backend; CPU builds remain available without CUDA.</w:t>
+              <w:t>Uses only Foundation, Metal, and MetalPerformanceShaders system frameworks; FAISS and Faiss-mlx source acknowledgements are retained.</w:t>
+            </w:r>
+          </w:p>
+        </w:tc>
+      </w:tr>
+      <w:tr>
+        <w:tc>
+          <w:tcPr>
+            <w:tcW w:type="dxa" w:w="4680"/>
+          </w:tcPr>
+          <w:p>
+            <w:pPr>
+              <w:spacing w:after="40" w:line="264" w:lineRule="auto"/>
+            </w:pPr>
+            <w:r>
+              <w:rPr>
+                <w:rFonts w:ascii="Calibri" w:hAnsi="Calibri"/>
+                <w:sz w:val="16"/>
+              </w:rPr>
+              <w:t>CUDA / FAISS / cuVS runtime</w:t>
+            </w:r>
+          </w:p>
+        </w:tc>
+        <w:tc>
+          <w:tcPr>
+            <w:tcW w:type="dxa" w:w="4680"/>
+          </w:tcPr>
+          <w:p>
+            <w:pPr>
+              <w:spacing w:after="40" w:line="264" w:lineRule="auto"/>
+            </w:pPr>
+            <w:r>
+              <w:rPr>
+                <w:rFonts w:ascii="Calibri" w:hAnsi="Calibri"/>
+                <w:sz w:val="16"/>
+              </w:rPr>
+              <w:t>Optional acceleration build dependencies; CPU and Metal builds do not require these libraries, and CUDA SIMPLS has no Armadillo dependency.</w:t>
             </w:r>
           </w:p>
         </w:tc>
@@ -12435,17 +13948,17 @@
         <w:pStyle w:val="Heading1"/>
       </w:pPr>
       <w:r>
-        <w:t>7. Limitations and future work</w:t>
+        <w:t>7. Limitations</w:t>
       </w:r>
     </w:p>
     <w:p>
       <w:r>
-        <w:t>The current implementation prioritizes KNN and PLS-LDA because they are central to the KODAMA optimization principle and can be implemented cleanly on both CPU and CUDA. Additional classifiers should be added only when they preserve the cross-validated accuracy objective and can be tested without changing the method for a specific benchmark.</w:t>
+        <w:t>The current implementation prioritizes KNN and PLS-LDA because they are central to the KODAMA optimization principle and can be implemented cleanly on CPU, CUDA, and Apple Metal. Additional classifiers are outside this release unless they preserve the cross-validated accuracy objective and can be tested without changing the method for a specific benchmark.</w:t>
       </w:r>
     </w:p>
     <w:p>
       <w:r>
-        <w:t>The main engineering limitation is that KODAMA performs many cross-validation fits. This makes memory locality, buffer reuse, label compaction, and GPU scheduling as important as asymptotic complexity. Future work will focus on persistent GPU-resident fold workspaces, better batching of independent M cycles, and broader continuous-integration coverage across Linux and macOS.</w:t>
+        <w:t>The main engineering limitation is that KODAMA performs many cross-validation fits. This makes memory locality, buffer reuse, label compaction, and GPU scheduling as important as asymptotic complexity. The present release includes float32 buffers, fold reuse, label compaction, CUDA kernels, and native Metal KNN and PLS-LDA kernels, but full accelerator-resident batching of independent M runs remains an engineering extension rather than a claim of the current manuscript.</w:t>
       </w:r>
     </w:p>
     <w:p>
@@ -13790,7 +15303,7 @@
           <w:rFonts w:ascii="Courier New" w:hAnsi="Courier New"/>
           <w:sz w:val="14"/>
         </w:rPr>
-        <w:t xml:space="preserve">  pred0 &lt;- CrossValidate(F, X32[L], y0, folds)</w:t>
+        <w:t xml:space="preserve">  y_best, pred_best, acc_best &lt;- OneIndependentRun(</w:t>
       </w:r>
     </w:p>
     <w:p>
@@ -13805,607 +15318,7 @@
           <w:rFonts w:ascii="Courier New" w:hAnsi="Courier New"/>
           <w:sz w:val="14"/>
         </w:rPr>
-        <w:t xml:space="preserve">  acc0 &lt;- Accuracy(y0, pred0)</w:t>
-      </w:r>
-    </w:p>
-    <w:p>
-      <w:pPr>
-        <w:keepLines w:val="0"/>
-        <w:spacing w:before="0" w:after="0" w:line="211" w:lineRule="auto"/>
-        <w:ind w:left="230" w:right="230"/>
-        <w:shd w:fill="F7F9FC"/>
-      </w:pPr>
-      <w:r>
-        <w:rPr>
-          <w:rFonts w:ascii="Courier New" w:hAnsi="Courier New"/>
-          <w:sz w:val="14"/>
-        </w:rPr>
-        <w:t xml:space="preserve">  score0 &lt;- ObjectiveScore(y0, acc0)</w:t>
-      </w:r>
-    </w:p>
-    <w:p>
-      <w:pPr>
-        <w:keepLines w:val="0"/>
-        <w:spacing w:before="0" w:after="0" w:line="211" w:lineRule="auto"/>
-        <w:ind w:left="230" w:right="230"/>
-        <w:shd w:fill="F7F9FC"/>
-      </w:pPr>
-      <w:r>
-        <w:rPr>
-          <w:rFonts w:ascii="Courier New" w:hAnsi="Courier New"/>
-          <w:sz w:val="14"/>
-        </w:rPr>
-        <w:t xml:space="preserve">  y_best &lt;- y0; pred_best &lt;- pred0; acc_best &lt;- acc0; score_best &lt;- score0</w:t>
-      </w:r>
-    </w:p>
-    <w:p>
-      <w:pPr>
-        <w:keepLines w:val="0"/>
-        <w:spacing w:before="0" w:after="0" w:line="211" w:lineRule="auto"/>
-        <w:ind w:left="230" w:right="230"/>
-        <w:shd w:fill="F7F9FC"/>
-      </w:pPr>
-      <w:r>
-        <w:rPr>
-          <w:rFonts w:ascii="Courier New" w:hAnsi="Courier New"/>
-          <w:sz w:val="14"/>
-        </w:rPr>
-        <w:t xml:space="preserve">  y_current &lt;- y0; pred_current &lt;- pred0; acc_current &lt;- acc0; score_current &lt;- score0</w:t>
-      </w:r>
-    </w:p>
-    <w:p>
-      <w:pPr>
-        <w:keepLines w:val="0"/>
-        <w:spacing w:before="0" w:after="0" w:line="211" w:lineRule="auto"/>
-        <w:ind w:left="230" w:right="230"/>
-        <w:shd w:fill="F7F9FC"/>
-      </w:pPr>
-      <w:r>
-        <w:rPr>
-          <w:rFonts w:ascii="Courier New" w:hAnsi="Courier New"/>
-          <w:sz w:val="14"/>
-        </w:rPr>
-        <w:t xml:space="preserve"> </w:t>
-      </w:r>
-    </w:p>
-    <w:p>
-      <w:pPr>
-        <w:keepLines w:val="0"/>
-        <w:spacing w:before="0" w:after="0" w:line="211" w:lineRule="auto"/>
-        <w:ind w:left="230" w:right="230"/>
-        <w:shd w:fill="F7F9FC"/>
-      </w:pPr>
-      <w:r>
-        <w:rPr>
-          <w:rFonts w:ascii="Courier New" w:hAnsi="Courier New"/>
-          <w:sz w:val="14"/>
-        </w:rPr>
-        <w:t xml:space="preserve">  for t = 1,...,Tcycle do</w:t>
-      </w:r>
-    </w:p>
-    <w:p>
-      <w:pPr>
-        <w:keepLines w:val="0"/>
-        <w:spacing w:before="0" w:after="0" w:line="211" w:lineRule="auto"/>
-        <w:ind w:left="230" w:right="230"/>
-        <w:shd w:fill="F7F9FC"/>
-      </w:pPr>
-      <w:r>
-        <w:rPr>
-          <w:rFonts w:ascii="Courier New" w:hAnsi="Courier New"/>
-          <w:sz w:val="14"/>
-        </w:rPr>
-        <w:t xml:space="preserve">    if evolutionary_search then</w:t>
-      </w:r>
-    </w:p>
-    <w:p>
-      <w:pPr>
-        <w:keepLines w:val="0"/>
-        <w:spacing w:before="0" w:after="0" w:line="211" w:lineRule="auto"/>
-        <w:ind w:left="230" w:right="230"/>
-        <w:shd w:fill="F7F9FC"/>
-      </w:pPr>
-      <w:r>
-        <w:rPr>
-          <w:rFonts w:ascii="Courier New" w:hAnsi="Courier New"/>
-          <w:sz w:val="14"/>
-        </w:rPr>
-        <w:t xml:space="preserve">      y_base &lt;- y_current; pred_base &lt;- pred_current</w:t>
-      </w:r>
-    </w:p>
-    <w:p>
-      <w:pPr>
-        <w:keepLines w:val="0"/>
-        <w:spacing w:before="0" w:after="0" w:line="211" w:lineRule="auto"/>
-        <w:ind w:left="230" w:right="230"/>
-        <w:shd w:fill="F7F9FC"/>
-      </w:pPr>
-      <w:r>
-        <w:rPr>
-          <w:rFonts w:ascii="Courier New" w:hAnsi="Courier New"/>
-          <w:sz w:val="14"/>
-        </w:rPr>
-        <w:t xml:space="preserve">    else</w:t>
-      </w:r>
-    </w:p>
-    <w:p>
-      <w:pPr>
-        <w:keepLines w:val="0"/>
-        <w:spacing w:before="0" w:after="0" w:line="211" w:lineRule="auto"/>
-        <w:ind w:left="230" w:right="230"/>
-        <w:shd w:fill="F7F9FC"/>
-      </w:pPr>
-      <w:r>
-        <w:rPr>
-          <w:rFonts w:ascii="Courier New" w:hAnsi="Courier New"/>
-          <w:sz w:val="14"/>
-        </w:rPr>
-        <w:t xml:space="preserve">      y_base &lt;- y_best; pred_base &lt;- pred_best</w:t>
-      </w:r>
-    </w:p>
-    <w:p>
-      <w:pPr>
-        <w:keepLines w:val="0"/>
-        <w:spacing w:before="0" w:after="0" w:line="211" w:lineRule="auto"/>
-        <w:ind w:left="230" w:right="230"/>
-        <w:shd w:fill="F7F9FC"/>
-      </w:pPr>
-      <w:r>
-        <w:rPr>
-          <w:rFonts w:ascii="Courier New" w:hAnsi="Courier New"/>
-          <w:sz w:val="14"/>
-        </w:rPr>
-        <w:t xml:space="preserve">    end if</w:t>
-      </w:r>
-    </w:p>
-    <w:p>
-      <w:pPr>
-        <w:keepLines w:val="0"/>
-        <w:spacing w:before="0" w:after="0" w:line="211" w:lineRule="auto"/>
-        <w:ind w:left="230" w:right="230"/>
-        <w:shd w:fill="F7F9FC"/>
-      </w:pPr>
-      <w:r>
-        <w:rPr>
-          <w:rFonts w:ascii="Courier New" w:hAnsi="Courier New"/>
-          <w:sz w:val="14"/>
-        </w:rPr>
-        <w:t xml:space="preserve"> </w:t>
-      </w:r>
-    </w:p>
-    <w:p>
-      <w:pPr>
-        <w:keepLines w:val="0"/>
-        <w:spacing w:before="0" w:after="0" w:line="211" w:lineRule="auto"/>
-        <w:ind w:left="230" w:right="230"/>
-        <w:shd w:fill="F7F9FC"/>
-      </w:pPr>
-      <w:r>
-        <w:rPr>
-          <w:rFonts w:ascii="Courier New" w:hAnsi="Courier New"/>
-          <w:sz w:val="14"/>
-        </w:rPr>
-        <w:t xml:space="preserve">    y_prop &lt;- y_base</w:t>
-      </w:r>
-    </w:p>
-    <w:p>
-      <w:pPr>
-        <w:keepLines w:val="0"/>
-        <w:spacing w:before="0" w:after="0" w:line="211" w:lineRule="auto"/>
-        <w:ind w:left="230" w:right="230"/>
-        <w:shd w:fill="F7F9FC"/>
-      </w:pPr>
-      <w:r>
-        <w:rPr>
-          <w:rFonts w:ascii="Courier New" w:hAnsi="Courier New"/>
-          <w:sz w:val="14"/>
-        </w:rPr>
-        <w:t xml:space="preserve">    qmax &lt;- ProposalBudget(t, Tcycle, number_of_groups)</w:t>
-      </w:r>
-    </w:p>
-    <w:p>
-      <w:pPr>
-        <w:keepLines w:val="0"/>
-        <w:spacing w:before="0" w:after="0" w:line="211" w:lineRule="auto"/>
-        <w:ind w:left="230" w:right="230"/>
-        <w:shd w:fill="F7F9FC"/>
-      </w:pPr>
-      <w:r>
-        <w:rPr>
-          <w:rFonts w:ascii="Courier New" w:hAnsi="Courier New"/>
-          <w:sz w:val="14"/>
-        </w:rPr>
-        <w:t xml:space="preserve">    q &lt;- UniformInteger(1, qmax)</w:t>
-      </w:r>
-    </w:p>
-    <w:p>
-      <w:pPr>
-        <w:keepLines w:val="0"/>
-        <w:spacing w:before="0" w:after="0" w:line="211" w:lineRule="auto"/>
-        <w:ind w:left="230" w:right="230"/>
-        <w:shd w:fill="F7F9FC"/>
-      </w:pPr>
-      <w:r>
-        <w:rPr>
-          <w:rFonts w:ascii="Courier New" w:hAnsi="Courier New"/>
-          <w:sz w:val="14"/>
-        </w:rPr>
-        <w:t xml:space="preserve">    for each group g in SampleWithoutReplacement(groups, q) do</w:t>
-      </w:r>
-    </w:p>
-    <w:p>
-      <w:pPr>
-        <w:keepLines w:val="0"/>
-        <w:spacing w:before="0" w:after="0" w:line="211" w:lineRule="auto"/>
-        <w:ind w:left="230" w:right="230"/>
-        <w:shd w:fill="F7F9FC"/>
-      </w:pPr>
-      <w:r>
-        <w:rPr>
-          <w:rFonts w:ascii="Courier New" w:hAnsi="Courier New"/>
-          <w:sz w:val="14"/>
-        </w:rPr>
-        <w:t xml:space="preserve">      E &lt;- {i in members(g): fixed[i] != 1}</w:t>
-      </w:r>
-    </w:p>
-    <w:p>
-      <w:pPr>
-        <w:keepLines w:val="0"/>
-        <w:spacing w:before="0" w:after="0" w:line="211" w:lineRule="auto"/>
-        <w:ind w:left="230" w:right="230"/>
-        <w:shd w:fill="F7F9FC"/>
-      </w:pPr>
-      <w:r>
-        <w:rPr>
-          <w:rFonts w:ascii="Courier New" w:hAnsi="Courier New"/>
-          <w:sz w:val="14"/>
-        </w:rPr>
-        <w:t xml:space="preserve">      if E is not empty then</w:t>
-      </w:r>
-    </w:p>
-    <w:p>
-      <w:pPr>
-        <w:keepLines w:val="0"/>
-        <w:spacing w:before="0" w:after="0" w:line="211" w:lineRule="auto"/>
-        <w:ind w:left="230" w:right="230"/>
-        <w:shd w:fill="F7F9FC"/>
-      </w:pPr>
-      <w:r>
-        <w:rPr>
-          <w:rFonts w:ascii="Courier New" w:hAnsi="Courier New"/>
-          <w:sz w:val="14"/>
-        </w:rPr>
-        <w:t xml:space="preserve">        label &lt;- SampleEmpirical(pred_base[E])</w:t>
-      </w:r>
-    </w:p>
-    <w:p>
-      <w:pPr>
-        <w:keepLines w:val="0"/>
-        <w:spacing w:before="0" w:after="0" w:line="211" w:lineRule="auto"/>
-        <w:ind w:left="230" w:right="230"/>
-        <w:shd w:fill="F7F9FC"/>
-      </w:pPr>
-      <w:r>
-        <w:rPr>
-          <w:rFonts w:ascii="Courier New" w:hAnsi="Courier New"/>
-          <w:sz w:val="14"/>
-        </w:rPr>
-        <w:t xml:space="preserve">        y_prop[E] &lt;- label</w:t>
-      </w:r>
-    </w:p>
-    <w:p>
-      <w:pPr>
-        <w:keepLines w:val="0"/>
-        <w:spacing w:before="0" w:after="0" w:line="211" w:lineRule="auto"/>
-        <w:ind w:left="230" w:right="230"/>
-        <w:shd w:fill="F7F9FC"/>
-      </w:pPr>
-      <w:r>
-        <w:rPr>
-          <w:rFonts w:ascii="Courier New" w:hAnsi="Courier New"/>
-          <w:sz w:val="14"/>
-        </w:rPr>
-        <w:t xml:space="preserve">      end if</w:t>
-      </w:r>
-    </w:p>
-    <w:p>
-      <w:pPr>
-        <w:keepLines w:val="0"/>
-        <w:spacing w:before="0" w:after="0" w:line="211" w:lineRule="auto"/>
-        <w:ind w:left="230" w:right="230"/>
-        <w:shd w:fill="F7F9FC"/>
-      </w:pPr>
-      <w:r>
-        <w:rPr>
-          <w:rFonts w:ascii="Courier New" w:hAnsi="Courier New"/>
-          <w:sz w:val="14"/>
-        </w:rPr>
-        <w:t xml:space="preserve">    end for</w:t>
-      </w:r>
-    </w:p>
-    <w:p>
-      <w:pPr>
-        <w:keepLines w:val="0"/>
-        <w:spacing w:before="0" w:after="0" w:line="211" w:lineRule="auto"/>
-        <w:ind w:left="230" w:right="230"/>
-        <w:shd w:fill="F7F9FC"/>
-      </w:pPr>
-      <w:r>
-        <w:rPr>
-          <w:rFonts w:ascii="Courier New" w:hAnsi="Courier New"/>
-          <w:sz w:val="14"/>
-        </w:rPr>
-        <w:t xml:space="preserve"> </w:t>
-      </w:r>
-    </w:p>
-    <w:p>
-      <w:pPr>
-        <w:keepLines w:val="0"/>
-        <w:spacing w:before="0" w:after="0" w:line="211" w:lineRule="auto"/>
-        <w:ind w:left="230" w:right="230"/>
-        <w:shd w:fill="F7F9FC"/>
-      </w:pPr>
-      <w:r>
-        <w:rPr>
-          <w:rFonts w:ascii="Courier New" w:hAnsi="Courier New"/>
-          <w:sz w:val="14"/>
-        </w:rPr>
-        <w:t xml:space="preserve">    y_prop &lt;- ClassTransitionProposals(y_prop, pred_base, fixed)</w:t>
-      </w:r>
-    </w:p>
-    <w:p>
-      <w:pPr>
-        <w:keepLines w:val="0"/>
-        <w:spacing w:before="0" w:after="0" w:line="211" w:lineRule="auto"/>
-        <w:ind w:left="230" w:right="230"/>
-        <w:shd w:fill="F7F9FC"/>
-      </w:pPr>
-      <w:r>
-        <w:rPr>
-          <w:rFonts w:ascii="Courier New" w:hAnsi="Courier New"/>
-          <w:sz w:val="14"/>
-        </w:rPr>
-        <w:t xml:space="preserve">    pred_prop &lt;- CrossValidate(F, X32[L], y_prop, folds)  # one CV pass</w:t>
-      </w:r>
-    </w:p>
-    <w:p>
-      <w:pPr>
-        <w:keepLines w:val="0"/>
-        <w:spacing w:before="0" w:after="0" w:line="211" w:lineRule="auto"/>
-        <w:ind w:left="230" w:right="230"/>
-        <w:shd w:fill="F7F9FC"/>
-      </w:pPr>
-      <w:r>
-        <w:rPr>
-          <w:rFonts w:ascii="Courier New" w:hAnsi="Courier New"/>
-          <w:sz w:val="14"/>
-        </w:rPr>
-        <w:t xml:space="preserve">    acc_prop &lt;- Accuracy(y_prop, pred_prop)</w:t>
-      </w:r>
-    </w:p>
-    <w:p>
-      <w:pPr>
-        <w:keepLines w:val="0"/>
-        <w:spacing w:before="0" w:after="0" w:line="211" w:lineRule="auto"/>
-        <w:ind w:left="230" w:right="230"/>
-        <w:shd w:fill="F7F9FC"/>
-      </w:pPr>
-      <w:r>
-        <w:rPr>
-          <w:rFonts w:ascii="Courier New" w:hAnsi="Courier New"/>
-          <w:sz w:val="14"/>
-        </w:rPr>
-        <w:t xml:space="preserve">    score_prop &lt;- ObjectiveScore(y_prop, acc_prop)</w:t>
-      </w:r>
-    </w:p>
-    <w:p>
-      <w:pPr>
-        <w:keepLines w:val="0"/>
-        <w:spacing w:before="0" w:after="0" w:line="211" w:lineRule="auto"/>
-        <w:ind w:left="230" w:right="230"/>
-        <w:shd w:fill="F7F9FC"/>
-      </w:pPr>
-      <w:r>
-        <w:rPr>
-          <w:rFonts w:ascii="Courier New" w:hAnsi="Courier New"/>
-          <w:sz w:val="14"/>
-        </w:rPr>
-        <w:t xml:space="preserve"> </w:t>
-      </w:r>
-    </w:p>
-    <w:p>
-      <w:pPr>
-        <w:keepLines w:val="0"/>
-        <w:spacing w:before="0" w:after="0" w:line="211" w:lineRule="auto"/>
-        <w:ind w:left="230" w:right="230"/>
-        <w:shd w:fill="F7F9FC"/>
-      </w:pPr>
-      <w:r>
-        <w:rPr>
-          <w:rFonts w:ascii="Courier New" w:hAnsi="Courier New"/>
-          <w:sz w:val="14"/>
-        </w:rPr>
-        <w:t xml:space="preserve">    if score_prop &gt; score_best then</w:t>
-      </w:r>
-    </w:p>
-    <w:p>
-      <w:pPr>
-        <w:keepLines w:val="0"/>
-        <w:spacing w:before="0" w:after="0" w:line="211" w:lineRule="auto"/>
-        <w:ind w:left="230" w:right="230"/>
-        <w:shd w:fill="F7F9FC"/>
-      </w:pPr>
-      <w:r>
-        <w:rPr>
-          <w:rFonts w:ascii="Courier New" w:hAnsi="Courier New"/>
-          <w:sz w:val="14"/>
-        </w:rPr>
-        <w:t xml:space="preserve">      y_best &lt;- y_prop; pred_best &lt;- pred_prop</w:t>
-      </w:r>
-    </w:p>
-    <w:p>
-      <w:pPr>
-        <w:keepLines w:val="0"/>
-        <w:spacing w:before="0" w:after="0" w:line="211" w:lineRule="auto"/>
-        <w:ind w:left="230" w:right="230"/>
-        <w:shd w:fill="F7F9FC"/>
-      </w:pPr>
-      <w:r>
-        <w:rPr>
-          <w:rFonts w:ascii="Courier New" w:hAnsi="Courier New"/>
-          <w:sz w:val="14"/>
-        </w:rPr>
-        <w:t xml:space="preserve">      acc_best &lt;- acc_prop; score_best &lt;- score_prop</w:t>
-      </w:r>
-    </w:p>
-    <w:p>
-      <w:pPr>
-        <w:keepLines w:val="0"/>
-        <w:spacing w:before="0" w:after="0" w:line="211" w:lineRule="auto"/>
-        <w:ind w:left="230" w:right="230"/>
-        <w:shd w:fill="F7F9FC"/>
-      </w:pPr>
-      <w:r>
-        <w:rPr>
-          <w:rFonts w:ascii="Courier New" w:hAnsi="Courier New"/>
-          <w:sz w:val="14"/>
-        </w:rPr>
-        <w:t xml:space="preserve">    end if</w:t>
-      </w:r>
-    </w:p>
-    <w:p>
-      <w:pPr>
-        <w:keepLines w:val="0"/>
-        <w:spacing w:before="0" w:after="0" w:line="211" w:lineRule="auto"/>
-        <w:ind w:left="230" w:right="230"/>
-        <w:shd w:fill="F7F9FC"/>
-      </w:pPr>
-      <w:r>
-        <w:rPr>
-          <w:rFonts w:ascii="Courier New" w:hAnsi="Courier New"/>
-          <w:sz w:val="14"/>
-        </w:rPr>
-        <w:t xml:space="preserve"> </w:t>
-      </w:r>
-    </w:p>
-    <w:p>
-      <w:pPr>
-        <w:keepLines w:val="0"/>
-        <w:spacing w:before="0" w:after="0" w:line="211" w:lineRule="auto"/>
-        <w:ind w:left="230" w:right="230"/>
-        <w:shd w:fill="F7F9FC"/>
-      </w:pPr>
-      <w:r>
-        <w:rPr>
-          <w:rFonts w:ascii="Courier New" w:hAnsi="Courier New"/>
-          <w:sz w:val="14"/>
-        </w:rPr>
-        <w:t xml:space="preserve">    if evolutionary_search and</w:t>
-      </w:r>
-    </w:p>
-    <w:p>
-      <w:pPr>
-        <w:keepLines w:val="0"/>
-        <w:spacing w:before="0" w:after="0" w:line="211" w:lineRule="auto"/>
-        <w:ind w:left="230" w:right="230"/>
-        <w:shd w:fill="F7F9FC"/>
-      </w:pPr>
-      <w:r>
-        <w:rPr>
-          <w:rFonts w:ascii="Courier New" w:hAnsi="Courier New"/>
-          <w:sz w:val="14"/>
-        </w:rPr>
-        <w:t xml:space="preserve">       Accept(score_prop, score_current, acc_current, t, Tcycle, rng) then</w:t>
-      </w:r>
-    </w:p>
-    <w:p>
-      <w:pPr>
-        <w:keepLines w:val="0"/>
-        <w:spacing w:before="0" w:after="0" w:line="211" w:lineRule="auto"/>
-        <w:ind w:left="230" w:right="230"/>
-        <w:shd w:fill="F7F9FC"/>
-      </w:pPr>
-      <w:r>
-        <w:rPr>
-          <w:rFonts w:ascii="Courier New" w:hAnsi="Courier New"/>
-          <w:sz w:val="14"/>
-        </w:rPr>
-        <w:t xml:space="preserve">      y_current &lt;- y_prop; pred_current &lt;- pred_prop</w:t>
-      </w:r>
-    </w:p>
-    <w:p>
-      <w:pPr>
-        <w:keepLines w:val="0"/>
-        <w:spacing w:before="0" w:after="0" w:line="211" w:lineRule="auto"/>
-        <w:ind w:left="230" w:right="230"/>
-        <w:shd w:fill="F7F9FC"/>
-      </w:pPr>
-      <w:r>
-        <w:rPr>
-          <w:rFonts w:ascii="Courier New" w:hAnsi="Courier New"/>
-          <w:sz w:val="14"/>
-        </w:rPr>
-        <w:t xml:space="preserve">      acc_current &lt;- acc_prop; score_current &lt;- score_prop</w:t>
-      </w:r>
-    </w:p>
-    <w:p>
-      <w:pPr>
-        <w:keepLines w:val="0"/>
-        <w:spacing w:before="0" w:after="0" w:line="211" w:lineRule="auto"/>
-        <w:ind w:left="230" w:right="230"/>
-        <w:shd w:fill="F7F9FC"/>
-      </w:pPr>
-      <w:r>
-        <w:rPr>
-          <w:rFonts w:ascii="Courier New" w:hAnsi="Courier New"/>
-          <w:sz w:val="14"/>
-        </w:rPr>
-        <w:t xml:space="preserve">    end if</w:t>
-      </w:r>
-    </w:p>
-    <w:p>
-      <w:pPr>
-        <w:keepLines w:val="0"/>
-        <w:spacing w:before="0" w:after="0" w:line="211" w:lineRule="auto"/>
-        <w:ind w:left="230" w:right="230"/>
-        <w:shd w:fill="F7F9FC"/>
-      </w:pPr>
-      <w:r>
-        <w:rPr>
-          <w:rFonts w:ascii="Courier New" w:hAnsi="Courier New"/>
-          <w:sz w:val="14"/>
-        </w:rPr>
-        <w:t xml:space="preserve"> </w:t>
-      </w:r>
-    </w:p>
-    <w:p>
-      <w:pPr>
-        <w:keepLines w:val="0"/>
-        <w:spacing w:before="0" w:after="0" w:line="211" w:lineRule="auto"/>
-        <w:ind w:left="230" w:right="230"/>
-        <w:shd w:fill="F7F9FC"/>
-      </w:pPr>
-      <w:r>
-        <w:rPr>
-          <w:rFonts w:ascii="Courier New" w:hAnsi="Courier New"/>
-          <w:sz w:val="14"/>
-        </w:rPr>
-        <w:t xml:space="preserve">    if acc_prop == 1 then break</w:t>
-      </w:r>
-    </w:p>
-    <w:p>
-      <w:pPr>
-        <w:keepLines w:val="0"/>
-        <w:spacing w:before="0" w:after="0" w:line="211" w:lineRule="auto"/>
-        <w:ind w:left="230" w:right="230"/>
-        <w:shd w:fill="F7F9FC"/>
-      </w:pPr>
-      <w:r>
-        <w:rPr>
-          <w:rFonts w:ascii="Courier New" w:hAnsi="Courier New"/>
-          <w:sz w:val="14"/>
-        </w:rPr>
-        <w:t xml:space="preserve">  end for</w:t>
+        <w:t xml:space="preserve">      X32[L], y0, groups, fixed[L], folds, F, Tcycle, rng)</w:t>
       </w:r>
     </w:p>
     <w:p>

</xml_diff>

<commit_message>
Replace FAISS and cuVS with native CUDA backends
</commit_message>
<xml_diff>
--- a/manuscript/kodama_cpp_jmlr_manuscript.docx
+++ b/manuscript/kodama_cpp_jmlr_manuscript.docx
@@ -53,7 +53,7 @@
     </w:p>
     <w:p>
       <w:r>
-        <w:t>KODAMA searches for latent structure by maximizing the cross-validated predictability of an evolving label vector. We present kodama-cpp, a standalone C++17 library with CPU, CUDA, and Apple Metal backends that moves this accuracy-maximization core out of the R package layer while preserving the methodological contract established by the original KODAMA literature. The library exposes typed KNN and PLS-LDA optimization paths, KNN and PLS-LDA cross-validation kernels, KODAMA matrix construction from either data matrices or supplied KNN graphs, graph construction, embedding helpers, and clustering utilities. Its implementation uses float32 numerical matrices and workspaces, a package-owned CPU HNSW search, optional FAISS/cuVS CUDA search, native Metal exact and IVF search, label-aware SIMPLS PLS-LDA, reusable fold buffers, and independent M-cycle execution. The result is a wrapper-independent numerical backend intended to support reproducible R and Python interfaces, with validation reported separately for the internal cross-validation objective, external label agreement, runtime, and visualization quality. We also document the current validation boundary: the graph-input interface is release-validated as an optional entry point, while performance and quality claims are restricted to measurements reported explicitly in the benchmark tables.</w:t>
+        <w:t>KODAMA searches for latent structure by maximizing the cross-validated predictability of an evolving label vector. We present kodama-cpp, a standalone C++17 library with CPU, CUDA, and Apple Metal backends that moves this accuracy-maximization core out of the R package layer while preserving the methodological contract established by the original KODAMA literature. The library exposes typed KNN and PLS-LDA optimization paths, KNN and PLS-LDA cross-validation kernels, KODAMA matrix construction from either data matrices or supplied KNN graphs, graph construction, embedding helpers, and clustering utilities. Its implementation uses float32 numerical matrices and workspaces, a package-owned CPU HNSW search, package-owned CUDA exact/IVF search and k-means, native Metal exact and IVF search, label-aware SIMPLS PLS-LDA, reusable fold buffers, and independent M-cycle execution. The result is a wrapper-independent numerical backend intended to support reproducible R and Python interfaces, with validation reported separately for the internal cross-validation objective, external label agreement, runtime, and visualization quality. We also document the current validation boundary: the graph-input interface is release-validated as an optional entry point, while performance and quality claims are restricted to measurements reported explicitly in the benchmark tables.</w:t>
       </w:r>
     </w:p>
     <w:p>
@@ -1049,7 +1049,7 @@
     </w:p>
     <w:p>
       <w:r>
-        <w:t>KNN kernels have strict backend-specific implementations. The dependency-free CPU path uses a package-owned float32 HNSW implementation adapted from the MIT-licensed FAISS organization. CUDA remains opt-in and links installed FAISS GPU and RAPIDS cuVS libraries; its label-aware SIMPLS adapter is native float32 code and does not depend on Armadillo. Apple Metal uses only system frameworks and provides exact and recall-tuned IVF-Flat search. All paths implement the same voting objective. In the KODAMA optimizer, neighbor work is organized so the search structure can be reused where the mathematics permits. This is the main difference from repeatedly launching wrapper-level nearest-neighbor searches.</w:t>
+        <w:t>KNN kernels have strict backend-specific implementations. The dependency-free CPU path uses a package-owned float32 HNSW implementation adapted from the MIT-licensed FAISS organization. CUDA remains opt-in, but its exact search, recall-tuned IVF-Flat search, k-means, and label-aware SIMPLS/LDA are package-owned float32 code requiring only CUDA Toolkit libraries. Apple Metal uses only system frameworks and provides exact and recall-tuned IVF-Flat search. All paths implement the same voting objective. In the KODAMA optimizer, neighbor work is organized so the search structure can be reused where the mathematics permits. This is the main difference from repeatedly launching wrapper-level nearest-neighbor searches.</w:t>
       </w:r>
     </w:p>
     <w:p>
@@ -2273,7 +2273,7 @@
     </w:p>
     <w:p>
       <w:r>
-        <w:t>The main differences are architectural and computational. The R package owns a complete R workflow and uses R-package dependencies for data handling, nearest neighbors, and visualization. kodama-cpp owns the numerical kernels and exposes them through C++ types so that R and Python wrappers can share one backend. This makes the comparison with the previous version a compatibility question: the objective and output contract should match, while implementation details such as float32 storage, FAISS/cuVS search, CUDA kernels, and wrapper-independent graph objects are new.</w:t>
+        <w:t>The main differences are architectural and computational. The R package owns a complete R workflow and uses R-package dependencies for data handling, nearest neighbors, and visualization. kodama-cpp owns the numerical kernels and exposes them through C++ types so that R and Python wrappers can share one backend. This makes the comparison with the previous version a compatibility question: the objective and output contract should match, while implementation details such as float32 storage, package-owned CPU/CUDA/Metal search, CUDA kernels, and wrapper-independent graph objects are new.</w:t>
       </w:r>
     </w:p>
     <w:p>
@@ -3123,7 +3123,7 @@
     </w:p>
     <w:p>
       <w:r>
-        <w:t>All timings in this section are wall-clock seconds from the benchmark drivers, and all accuracy values are computed on held-out cross-validation folds. CPU kernel measurements use the configured single-thread CPU path unless explicitly labeled otherwise; CUDA measurements use the same CUDA/FAISS runtime used by the test suite. Tables are intentionally separated by scope: kernel-level rows do not claim end-to-end speedups, and graph-input rows are treated as API validation unless paired with data-input KODAMA results under the same M, Tcycle, seed, and graph settings.</w:t>
+        <w:t>All timings in this section are wall-clock seconds from the benchmark drivers, and all accuracy values are computed on held-out cross-validation folds. CPU kernel measurements use the configured single-thread CPU path unless explicitly labeled otherwise; CUDA measurements use the same CUDA Toolkit runtime used by the test suite. Tables are intentionally separated by scope: kernel-level rows do not claim end-to-end speedups, and graph-input rows are treated as API validation unless paired with data-input KODAMA results under the same M, Tcycle, seed, and graph settings.</w:t>
       </w:r>
     </w:p>
     <w:p>
@@ -3241,7 +3241,7 @@
                 <w:rFonts w:ascii="Calibri" w:hAnsi="Calibri"/>
                 <w:sz w:val="16"/>
               </w:rPr>
-              <w:t>2026-07-06 UTC</w:t>
+              <w:t>2026-07-14 UTC for native-CUDA validation; earlier broad benchmark snapshot dated 2026-07-06 UTC</w:t>
             </w:r>
           </w:p>
         </w:tc>
@@ -3313,7 +3313,7 @@
                 <w:rFonts w:ascii="Calibri" w:hAnsi="Calibri"/>
                 <w:sz w:val="16"/>
               </w:rPr>
-              <w:t>CUDA build succeeded; CTest passed 2/2 configured tests in 1.95 s</w:t>
+              <w:t>Fresh CUDA 13.2 build succeeded; CTest passed 2/2 configured tests in 1.77 s</w:t>
             </w:r>
           </w:p>
         </w:tc>
@@ -3349,7 +3349,7 @@
                 <w:rFonts w:ascii="Calibri" w:hAnsi="Calibri"/>
                 <w:sz w:val="16"/>
               </w:rPr>
-              <w:t>CUDA/FAISS/cuVS conda environment used by the benchmark and test suite; Armadillo is not required</w:t>
+              <w:t>CUDA Toolkit only for native search/PLS paths; no FAISS, cuVS, RAFT, RMM, or Armadillo link</w:t>
             </w:r>
           </w:p>
         </w:tc>
@@ -5356,7 +5356,7 @@
     </w:p>
     <w:p>
       <w:r>
-        <w:t>The dependency-light backend experiment was run on macOS with FAISS, CUDA, and OpenMP disabled. The CPU build therefore measures the package-owned HNSW and float32 SIMPLS/LDA implementations, while the Metal build links only Apple system frameworks. Exact CPU/Metal equality of the reported classification metrics is the primary acceptance criterion; timings are secondary evidence.</w:t>
+        <w:t>The dependency-light backend experiment was run on macOS with CUDA and OpenMP disabled. The CPU build therefore measures the package-owned HNSW and float32 SIMPLS/LDA implementations, while the Metal build links only Apple system frameworks. Exact CPU/Metal equality of the reported classification metrics is the primary acceptance criterion; timings are secondary evidence.</w:t>
       </w:r>
     </w:p>
     <w:p>
@@ -5975,12 +5975,12 @@
     </w:p>
     <w:p>
       <w:r>
-        <w:t>The benchmark run used copied float32 RData datasets spanning n = 873 to 5,220,347 samples and p = 11 to 16,384 variables. The CUDA machine first rebuilt the project and reran the CTest suite; both configured tests passed. The current table is deliberately kernel-focused: it validates implementation claims and identifies scaling regimes without conflating isolated kernel speed with full KODAMA.matrix runtime.</w:t>
+        <w:t>The benchmark run used copied float32 RData datasets spanning n = 873 to 5,220,347 samples and p = 11 to 16,384 variables. The CUDA machine first rebuilt the project and reran the CTest suite; both configured tests passed. The broad kernel and core tables retain the earlier release-validation snapshot for continuity, whereas the native-CUDA table reports the dependency-distilled search implementation introduced afterward.</w:t>
       </w:r>
     </w:p>
     <w:p>
       <w:r>
-        <w:t>The kernel-level experiment isolates KNNCV and PLSLDACV from the full KODAMA matrix pipeline. CUDA KNN matched CPU accuracy within about 0.001 on COIL20, MNIST, USPS, and mass41 while giving 3.8x to 99.4x speedups once the dataset was large enough to amortize GPU overhead. On the small MetRef KNN task, CPU remained faster because setup overhead dominated. CUDA PLSLDACV matched CPU exactly on MetRef and was 27.2x faster; on USPS it was 23.8x faster with a small positive accuracy difference.</w:t>
+        <w:t>The current package-owned CUDA IVF-Flat path was checked on MNIST70k and MetRef with five-fold cosine KNNCV and k = 10. On MNIST70k it produced accuracy 0.973857 in 4.233 s with nlist = 237 and maximum nprobe = 32, compared with 0.973029 in 4.753 s for the recorded former FAISS/cuVS row. On MetRef it produced 0.816724 in 0.195 s, compared with 0.814433 in 0.297 s. These are implementation spot checks rather than repeated-run performance estimates.</w:t>
       </w:r>
     </w:p>
     <w:p>
@@ -5990,7 +5990,469 @@
     </w:p>
     <w:p>
       <w:r>
-        <w:t>The wrapper validation also identified a packaging requirement: the conda libstdc++ runtime used by the CUDA/FAISS environment must be visible before R starts. The R wrapper installation notes describe the required environment variables, and the configure script links the conda libstdc++ runtime when CONDA_PREFIX is set.</w:t>
+        <w:t>The dependency-distilled CUDA build links CUDA Toolkit libraries but no FAISS, cuVS, RAFT, or RMM soname. Binary wrappers therefore need to locate the CUDA runtime selected at build time, but do not need to provision the removed search libraries.</w:t>
+      </w:r>
+    </w:p>
+    <w:tbl>
+      <w:tblPr>
+        <w:tblW w:type="auto" w:w="0"/>
+        <w:tblLayout w:type="fixed"/>
+        <w:tblLook w:firstColumn="1" w:firstRow="1" w:lastColumn="0" w:lastRow="0" w:noHBand="0" w:noVBand="1" w:val="04A0"/>
+        <w:jc w:val="center"/>
+        <w:tblBorders>
+          <w:top w:val="single" w:sz="4" w:space="0" w:color="D0D7DE"/>
+          <w:left w:val="single" w:sz="4" w:space="0" w:color="D0D7DE"/>
+          <w:bottom w:val="single" w:sz="4" w:space="0" w:color="D0D7DE"/>
+          <w:right w:val="single" w:sz="4" w:space="0" w:color="D0D7DE"/>
+          <w:insideH w:val="single" w:sz="4" w:space="0" w:color="D0D7DE"/>
+          <w:insideV w:val="single" w:sz="4" w:space="0" w:color="D0D7DE"/>
+        </w:tblBorders>
+      </w:tblPr>
+      <w:tblGrid>
+        <w:gridCol w:w="1337"/>
+        <w:gridCol w:w="1337"/>
+        <w:gridCol w:w="1337"/>
+        <w:gridCol w:w="1337"/>
+        <w:gridCol w:w="1337"/>
+        <w:gridCol w:w="1337"/>
+        <w:gridCol w:w="1337"/>
+      </w:tblGrid>
+      <w:tr>
+        <w:trPr>
+          <w:cantSplit/>
+        </w:trPr>
+        <w:tc>
+          <w:tcPr>
+            <w:tcW w:type="dxa" w:w="1440"/>
+            <w:vAlign w:val="center"/>
+            <w:tcMar>
+              <w:top w:w="80" w:type="dxa"/>
+              <w:bottom w:w="80" w:type="dxa"/>
+              <w:start w:w="120" w:type="dxa"/>
+              <w:end w:w="120" w:type="dxa"/>
+            </w:tcMar>
+            <w:shd w:fill="E8EEF5"/>
+          </w:tcPr>
+          <w:p>
+            <w:pPr>
+              <w:spacing w:after="40" w:line="264" w:lineRule="auto"/>
+            </w:pPr>
+            <w:r>
+              <w:rPr>
+                <w:rFonts w:ascii="Calibri" w:hAnsi="Calibri"/>
+                <w:b/>
+                <w:sz w:val="14"/>
+              </w:rPr>
+              <w:t>Dataset</w:t>
+            </w:r>
+          </w:p>
+        </w:tc>
+        <w:tc>
+          <w:tcPr>
+            <w:tcW w:type="dxa" w:w="1800"/>
+            <w:vAlign w:val="center"/>
+            <w:tcMar>
+              <w:top w:w="80" w:type="dxa"/>
+              <w:bottom w:w="80" w:type="dxa"/>
+              <w:start w:w="120" w:type="dxa"/>
+              <w:end w:w="120" w:type="dxa"/>
+            </w:tcMar>
+            <w:shd w:fill="E8EEF5"/>
+          </w:tcPr>
+          <w:p>
+            <w:pPr>
+              <w:spacing w:after="40" w:line="264" w:lineRule="auto"/>
+            </w:pPr>
+            <w:r>
+              <w:rPr>
+                <w:rFonts w:ascii="Calibri" w:hAnsi="Calibri"/>
+                <w:b/>
+                <w:sz w:val="14"/>
+              </w:rPr>
+              <w:t>Path</w:t>
+            </w:r>
+          </w:p>
+        </w:tc>
+        <w:tc>
+          <w:tcPr>
+            <w:tcW w:type="dxa" w:w="1224"/>
+            <w:vAlign w:val="center"/>
+            <w:tcMar>
+              <w:top w:w="80" w:type="dxa"/>
+              <w:bottom w:w="80" w:type="dxa"/>
+              <w:start w:w="120" w:type="dxa"/>
+              <w:end w:w="120" w:type="dxa"/>
+            </w:tcMar>
+            <w:shd w:fill="E8EEF5"/>
+          </w:tcPr>
+          <w:p>
+            <w:pPr>
+              <w:spacing w:after="40" w:line="264" w:lineRule="auto"/>
+            </w:pPr>
+            <w:r>
+              <w:rPr>
+                <w:rFonts w:ascii="Calibri" w:hAnsi="Calibri"/>
+                <w:b/>
+                <w:sz w:val="14"/>
+              </w:rPr>
+              <w:t>Accuracy</w:t>
+            </w:r>
+          </w:p>
+        </w:tc>
+        <w:tc>
+          <w:tcPr>
+            <w:tcW w:type="dxa" w:w="1152"/>
+            <w:vAlign w:val="center"/>
+            <w:tcMar>
+              <w:top w:w="80" w:type="dxa"/>
+              <w:bottom w:w="80" w:type="dxa"/>
+              <w:start w:w="120" w:type="dxa"/>
+              <w:end w:w="120" w:type="dxa"/>
+            </w:tcMar>
+            <w:shd w:fill="E8EEF5"/>
+          </w:tcPr>
+          <w:p>
+            <w:pPr>
+              <w:spacing w:after="40" w:line="264" w:lineRule="auto"/>
+            </w:pPr>
+            <w:r>
+              <w:rPr>
+                <w:rFonts w:ascii="Calibri" w:hAnsi="Calibri"/>
+                <w:b/>
+                <w:sz w:val="14"/>
+              </w:rPr>
+              <w:t>Seconds</w:t>
+            </w:r>
+          </w:p>
+        </w:tc>
+        <w:tc>
+          <w:tcPr>
+            <w:tcW w:type="dxa" w:w="1008"/>
+            <w:vAlign w:val="center"/>
+            <w:tcMar>
+              <w:top w:w="80" w:type="dxa"/>
+              <w:bottom w:w="80" w:type="dxa"/>
+              <w:start w:w="120" w:type="dxa"/>
+              <w:end w:w="120" w:type="dxa"/>
+            </w:tcMar>
+            <w:shd w:fill="E8EEF5"/>
+          </w:tcPr>
+          <w:p>
+            <w:pPr>
+              <w:spacing w:after="40" w:line="264" w:lineRule="auto"/>
+            </w:pPr>
+            <w:r>
+              <w:rPr>
+                <w:rFonts w:ascii="Calibri" w:hAnsi="Calibri"/>
+                <w:b/>
+                <w:sz w:val="14"/>
+              </w:rPr>
+              <w:t>nlist</w:t>
+            </w:r>
+          </w:p>
+        </w:tc>
+        <w:tc>
+          <w:tcPr>
+            <w:tcW w:type="dxa" w:w="1296"/>
+            <w:vAlign w:val="center"/>
+            <w:tcMar>
+              <w:top w:w="80" w:type="dxa"/>
+              <w:bottom w:w="80" w:type="dxa"/>
+              <w:start w:w="120" w:type="dxa"/>
+              <w:end w:w="120" w:type="dxa"/>
+            </w:tcMar>
+            <w:shd w:fill="E8EEF5"/>
+          </w:tcPr>
+          <w:p>
+            <w:pPr>
+              <w:spacing w:after="40" w:line="264" w:lineRule="auto"/>
+            </w:pPr>
+            <w:r>
+              <w:rPr>
+                <w:rFonts w:ascii="Calibri" w:hAnsi="Calibri"/>
+                <w:b/>
+                <w:sz w:val="14"/>
+              </w:rPr>
+              <w:t>max nprobe</w:t>
+            </w:r>
+          </w:p>
+        </w:tc>
+        <w:tc>
+          <w:tcPr>
+            <w:tcW w:type="dxa" w:w="1368"/>
+            <w:vAlign w:val="center"/>
+            <w:tcMar>
+              <w:top w:w="80" w:type="dxa"/>
+              <w:bottom w:w="80" w:type="dxa"/>
+              <w:start w:w="120" w:type="dxa"/>
+              <w:end w:w="120" w:type="dxa"/>
+            </w:tcMar>
+            <w:shd w:fill="E8EEF5"/>
+          </w:tcPr>
+          <w:p>
+            <w:pPr>
+              <w:spacing w:after="40" w:line="264" w:lineRule="auto"/>
+            </w:pPr>
+            <w:r>
+              <w:rPr>
+                <w:rFonts w:ascii="Calibri" w:hAnsi="Calibri"/>
+                <w:b/>
+                <w:sz w:val="14"/>
+              </w:rPr>
+              <w:t>pilot recall</w:t>
+            </w:r>
+          </w:p>
+        </w:tc>
+      </w:tr>
+      <w:tr>
+        <w:tc>
+          <w:tcPr>
+            <w:tcW w:type="dxa" w:w="1337"/>
+          </w:tcPr>
+          <w:p>
+            <w:pPr>
+              <w:spacing w:after="40" w:line="264" w:lineRule="auto"/>
+            </w:pPr>
+            <w:r>
+              <w:rPr>
+                <w:rFonts w:ascii="Calibri" w:hAnsi="Calibri"/>
+                <w:sz w:val="14"/>
+              </w:rPr>
+              <w:t>MNIST70k</w:t>
+            </w:r>
+          </w:p>
+        </w:tc>
+        <w:tc>
+          <w:tcPr>
+            <w:tcW w:type="dxa" w:w="1337"/>
+          </w:tcPr>
+          <w:p>
+            <w:pPr>
+              <w:spacing w:after="40" w:line="264" w:lineRule="auto"/>
+            </w:pPr>
+            <w:r>
+              <w:rPr>
+                <w:rFonts w:ascii="Calibri" w:hAnsi="Calibri"/>
+                <w:sz w:val="14"/>
+              </w:rPr>
+              <w:t>native IVF-Flat</w:t>
+            </w:r>
+          </w:p>
+        </w:tc>
+        <w:tc>
+          <w:tcPr>
+            <w:tcW w:type="dxa" w:w="1337"/>
+          </w:tcPr>
+          <w:p>
+            <w:pPr>
+              <w:spacing w:after="40" w:line="264" w:lineRule="auto"/>
+            </w:pPr>
+            <w:r>
+              <w:rPr>
+                <w:rFonts w:ascii="Calibri" w:hAnsi="Calibri"/>
+                <w:sz w:val="14"/>
+              </w:rPr>
+              <w:t>0.973857</w:t>
+            </w:r>
+          </w:p>
+        </w:tc>
+        <w:tc>
+          <w:tcPr>
+            <w:tcW w:type="dxa" w:w="1337"/>
+          </w:tcPr>
+          <w:p>
+            <w:pPr>
+              <w:spacing w:after="40" w:line="264" w:lineRule="auto"/>
+            </w:pPr>
+            <w:r>
+              <w:rPr>
+                <w:rFonts w:ascii="Calibri" w:hAnsi="Calibri"/>
+                <w:sz w:val="14"/>
+              </w:rPr>
+              <w:t>4.233</w:t>
+            </w:r>
+          </w:p>
+        </w:tc>
+        <w:tc>
+          <w:tcPr>
+            <w:tcW w:type="dxa" w:w="1337"/>
+          </w:tcPr>
+          <w:p>
+            <w:pPr>
+              <w:spacing w:after="40" w:line="264" w:lineRule="auto"/>
+            </w:pPr>
+            <w:r>
+              <w:rPr>
+                <w:rFonts w:ascii="Calibri" w:hAnsi="Calibri"/>
+                <w:sz w:val="14"/>
+              </w:rPr>
+              <w:t>237</w:t>
+            </w:r>
+          </w:p>
+        </w:tc>
+        <w:tc>
+          <w:tcPr>
+            <w:tcW w:type="dxa" w:w="1337"/>
+          </w:tcPr>
+          <w:p>
+            <w:pPr>
+              <w:spacing w:after="40" w:line="264" w:lineRule="auto"/>
+            </w:pPr>
+            <w:r>
+              <w:rPr>
+                <w:rFonts w:ascii="Calibri" w:hAnsi="Calibri"/>
+                <w:sz w:val="14"/>
+              </w:rPr>
+              <w:t>32</w:t>
+            </w:r>
+          </w:p>
+        </w:tc>
+        <w:tc>
+          <w:tcPr>
+            <w:tcW w:type="dxa" w:w="1337"/>
+          </w:tcPr>
+          <w:p>
+            <w:pPr>
+              <w:spacing w:after="40" w:line="264" w:lineRule="auto"/>
+            </w:pPr>
+            <w:r>
+              <w:rPr>
+                <w:rFonts w:ascii="Calibri" w:hAnsi="Calibri"/>
+                <w:sz w:val="14"/>
+              </w:rPr>
+              <w:t>0.994531</w:t>
+            </w:r>
+          </w:p>
+        </w:tc>
+      </w:tr>
+      <w:tr>
+        <w:tc>
+          <w:tcPr>
+            <w:tcW w:type="dxa" w:w="1337"/>
+          </w:tcPr>
+          <w:p>
+            <w:pPr>
+              <w:spacing w:after="40" w:line="264" w:lineRule="auto"/>
+            </w:pPr>
+            <w:r>
+              <w:rPr>
+                <w:rFonts w:ascii="Calibri" w:hAnsi="Calibri"/>
+                <w:sz w:val="14"/>
+              </w:rPr>
+              <w:t>MetRef</w:t>
+            </w:r>
+          </w:p>
+        </w:tc>
+        <w:tc>
+          <w:tcPr>
+            <w:tcW w:type="dxa" w:w="1337"/>
+          </w:tcPr>
+          <w:p>
+            <w:pPr>
+              <w:spacing w:after="40" w:line="264" w:lineRule="auto"/>
+            </w:pPr>
+            <w:r>
+              <w:rPr>
+                <w:rFonts w:ascii="Calibri" w:hAnsi="Calibri"/>
+                <w:sz w:val="14"/>
+              </w:rPr>
+              <w:t>native IVF-Flat</w:t>
+            </w:r>
+          </w:p>
+        </w:tc>
+        <w:tc>
+          <w:tcPr>
+            <w:tcW w:type="dxa" w:w="1337"/>
+          </w:tcPr>
+          <w:p>
+            <w:pPr>
+              <w:spacing w:after="40" w:line="264" w:lineRule="auto"/>
+            </w:pPr>
+            <w:r>
+              <w:rPr>
+                <w:rFonts w:ascii="Calibri" w:hAnsi="Calibri"/>
+                <w:sz w:val="14"/>
+              </w:rPr>
+              <w:t>0.816724</w:t>
+            </w:r>
+          </w:p>
+        </w:tc>
+        <w:tc>
+          <w:tcPr>
+            <w:tcW w:type="dxa" w:w="1337"/>
+          </w:tcPr>
+          <w:p>
+            <w:pPr>
+              <w:spacing w:after="40" w:line="264" w:lineRule="auto"/>
+            </w:pPr>
+            <w:r>
+              <w:rPr>
+                <w:rFonts w:ascii="Calibri" w:hAnsi="Calibri"/>
+                <w:sz w:val="14"/>
+              </w:rPr>
+              <w:t>0.195</w:t>
+            </w:r>
+          </w:p>
+        </w:tc>
+        <w:tc>
+          <w:tcPr>
+            <w:tcW w:type="dxa" w:w="1337"/>
+          </w:tcPr>
+          <w:p>
+            <w:pPr>
+              <w:spacing w:after="40" w:line="264" w:lineRule="auto"/>
+            </w:pPr>
+            <w:r>
+              <w:rPr>
+                <w:rFonts w:ascii="Calibri" w:hAnsi="Calibri"/>
+                <w:sz w:val="14"/>
+              </w:rPr>
+              <w:t>27</w:t>
+            </w:r>
+          </w:p>
+        </w:tc>
+        <w:tc>
+          <w:tcPr>
+            <w:tcW w:type="dxa" w:w="1337"/>
+          </w:tcPr>
+          <w:p>
+            <w:pPr>
+              <w:spacing w:after="40" w:line="264" w:lineRule="auto"/>
+            </w:pPr>
+            <w:r>
+              <w:rPr>
+                <w:rFonts w:ascii="Calibri" w:hAnsi="Calibri"/>
+                <w:sz w:val="14"/>
+              </w:rPr>
+              <w:t>20</w:t>
+            </w:r>
+          </w:p>
+        </w:tc>
+        <w:tc>
+          <w:tcPr>
+            <w:tcW w:type="dxa" w:w="1337"/>
+          </w:tcPr>
+          <w:p>
+            <w:pPr>
+              <w:spacing w:after="40" w:line="264" w:lineRule="auto"/>
+            </w:pPr>
+            <w:r>
+              <w:rPr>
+                <w:rFonts w:ascii="Calibri" w:hAnsi="Calibri"/>
+                <w:sz w:val="14"/>
+              </w:rPr>
+              <w:t>0.991406</w:t>
+            </w:r>
+          </w:p>
+        </w:tc>
+      </w:tr>
+    </w:tbl>
+    <w:p>
+      <w:pPr>
+        <w:pStyle w:val="Heading3"/>
+      </w:pPr>
+      <w:r>
+        <w:t>Earlier accelerator validation snapshot</w:t>
       </w:r>
     </w:p>
     <w:tbl>
@@ -12451,7 +12913,7 @@
                 <w:rFonts w:ascii="Calibri" w:hAnsi="Calibri"/>
                 <w:sz w:val="14"/>
               </w:rPr>
-              <w:t>Dependency-free CPU CTest covers folds, prediction accuracy, graph construction, and KODAMA optimization; CMake configures with FAISS disabled.</w:t>
+              <w:t>Dependency-free CPU CTest covers folds, prediction accuracy, graph construction, and KODAMA optimization; no FAISS build option remains.</w:t>
             </w:r>
           </w:p>
         </w:tc>
@@ -12468,7 +12930,7 @@
                 <w:rFonts w:ascii="Calibri" w:hAnsi="Calibri"/>
                 <w:sz w:val="14"/>
               </w:rPr>
-              <w:t>On MetRef, native CPU KNNCV reproduced accuracy 0.827033; runtime evidence is reported independently from the optional FAISS/CUDA paths.</w:t>
+              <w:t>On MetRef, native CPU KNNCV reproduced accuracy 0.827033; runtime evidence is reported independently from accelerator paths.</w:t>
             </w:r>
           </w:p>
         </w:tc>
@@ -12504,7 +12966,7 @@
                 <w:rFonts w:ascii="Calibri" w:hAnsi="Calibri"/>
                 <w:sz w:val="14"/>
               </w:rPr>
-              <w:t>KNNCV_CUDA in src/knncv.cpp and precompute_knn_cv_cuda in src/core.cpp use FAISS GPU IVF-Flat with recorded nlist/nprobe.</w:t>
+              <w:t>src/native_cuda_backend.cu implements package-owned float32 exact KNN, signed-hash IVF-Flat, GPU k-means, resident inverted lists, and exact-pilot recall tuning; KNNCV_CUDA and CoreKNN call it directly.</w:t>
             </w:r>
           </w:p>
         </w:tc>
@@ -12521,7 +12983,7 @@
                 <w:rFonts w:ascii="Calibri" w:hAnsi="Calibri"/>
                 <w:sz w:val="14"/>
               </w:rPr>
-              <w:t>CUDA tests assert backend=CUDA, prediction and fold sizes, constrained folds, float32 dispatch, and accuracy for KNNCV/CoreKNN.</w:t>
+              <w:t>CUDA tests explicitly exercise exact and IVF index types, tuning metadata, constrained folds, float32 CoreKNN, and end-to-end KODAMAMatrix_CUDA initialization. A clean build and ldd audit exclude FAISS/cuVS/RAFT/RMM.</w:t>
             </w:r>
           </w:p>
         </w:tc>
@@ -12538,7 +13000,7 @@
                 <w:rFonts w:ascii="Calibri" w:hAnsi="Calibri"/>
                 <w:sz w:val="14"/>
               </w:rPr>
-              <w:t>KNNCV rows report 3.8x to 99.4x speedups on larger datasets with accuracy changes within about 0.001.</w:t>
+              <w:t>Native IVF spot checks produced 0.973857 in 4.233 s on MNIST70k and 0.816724 in 0.195 s on MetRef, both above the recorded former FAISS/cuVS accuracy rows.</w:t>
             </w:r>
           </w:p>
         </w:tc>
@@ -13186,7 +13648,7 @@
                 <w:rFonts w:ascii="Calibri" w:hAnsi="Calibri"/>
                 <w:sz w:val="14"/>
               </w:rPr>
-              <w:t>Configure with CMake using KODAMA_ENABLE_CUDA=OFF, KODAMA_ENABLE_FAISS=OFF, and KODAMA_ENABLE_METAL=OFF; then build, test, and install the exported target.</w:t>
+              <w:t>Configure with CMake using KODAMA_ENABLE_CUDA=OFF and KODAMA_ENABLE_METAL=OFF; then build, test, and install the exported target.</w:t>
             </w:r>
           </w:p>
         </w:tc>
@@ -13222,7 +13684,7 @@
                 <w:rFonts w:ascii="Calibri" w:hAnsi="Calibri"/>
                 <w:sz w:val="14"/>
               </w:rPr>
-              <w:t>On macOS, configure with KODAMA_ENABLE_METAL=ON while CUDA and FAISS are off; then build and run CTest. Apple system frameworks are linked automatically.</w:t>
+              <w:t>On macOS, configure with KODAMA_ENABLE_METAL=ON while CUDA is off; then build and run CTest. Apple system frameworks are linked automatically.</w:t>
             </w:r>
           </w:p>
         </w:tc>
@@ -13258,7 +13720,7 @@
                 <w:rFonts w:ascii="Calibri" w:hAnsi="Calibri"/>
                 <w:sz w:val="14"/>
               </w:rPr>
-              <w:t>Activate the environment containing CUDA, FAISS GPU, and cuVS; expose its library path; configure with KODAMA_ENABLE_CUDA=ON; then build and run CTest. Armadillo is not required.</w:t>
+              <w:t>Activate an environment containing the CUDA toolkit; configure with KODAMA_ENABLE_CUDA=ON and KODAMA_ENABLE_CUGRAPH=OFF; then build and run CTest. FAISS, cuVS, RAFT, RMM, and Armadillo are not required.</w:t>
             </w:r>
           </w:p>
         </w:tc>
@@ -13564,7 +14026,7 @@
                 <w:rFonts w:ascii="Calibri" w:hAnsi="Calibri"/>
                 <w:sz w:val="16"/>
               </w:rPr>
-              <w:t>A fresh CUDA 13.2 build without Armadillo succeeded on chiamaka and ctest passed 2/2 configured tests; pre/post-cleanup MetRef PLS-DA and PLS-LDA accuracies were identical.</w:t>
+              <w:t>A fresh CUDA 13.2 build without FAISS, cuVS, RAFT, RMM, or Armadillo succeeded on chiamaka and CTest passed 2/2. The linked-soname audit found none of the removed dependencies, and the CMake cache contained no corresponding package option, target, header, or library entry; only the CUDA Toolkit environment directory retained a legacy faissgpu-cuvs label.</w:t>
             </w:r>
           </w:p>
         </w:tc>
@@ -13829,7 +14291,7 @@
                 <w:rFonts w:ascii="Calibri" w:hAnsi="Calibri"/>
                 <w:sz w:val="16"/>
               </w:rPr>
-              <w:t>Package-owned source adapted from the MIT-licensed FAISS organization; no FAISS link dependency in the default CPU build.</w:t>
+              <w:t>Package-owned source adapted from the MIT-licensed FAISS organization; no FAISS link dependency.</w:t>
             </w:r>
           </w:p>
         </w:tc>
@@ -13884,7 +14346,7 @@
                 <w:rFonts w:ascii="Calibri" w:hAnsi="Calibri"/>
                 <w:sz w:val="16"/>
               </w:rPr>
-              <w:t>CUDA / FAISS / cuVS runtime</w:t>
+              <w:t>Native CUDA</w:t>
             </w:r>
           </w:p>
         </w:tc>
@@ -13901,7 +14363,7 @@
                 <w:rFonts w:ascii="Calibri" w:hAnsi="Calibri"/>
                 <w:sz w:val="16"/>
               </w:rPr>
-              <w:t>Optional acceleration build dependencies; CPU and Metal builds do not require these libraries, and CUDA SIMPLS has no Armadillo dependency.</w:t>
+              <w:t>Package-owned exact/IVF KNN, k-means, and SIMPLS/LDA use CUDA Toolkit libraries without FAISS, cuVS, RAFT, RMM, or Armadillo links; cuGraph clustering remains an isolated optional adapter.</w:t>
             </w:r>
           </w:p>
         </w:tc>

</xml_diff>

<commit_message>
Remove Louvain Leiden and cuGraph
</commit_message>
<xml_diff>
--- a/manuscript/kodama_cpp_jmlr_manuscript.docx
+++ b/manuscript/kodama_cpp_jmlr_manuscript.docx
@@ -1534,7 +1534,7 @@
                 <w:rFonts w:ascii="Calibri" w:hAnsi="Calibri"/>
                 <w:sz w:val="17"/>
               </w:rPr>
-              <w:t>makeSNNGraph equivalent, Louvain, Leiden, random walk</w:t>
+              <w:t>makeSNNGraph equivalent and random-walk clustering</w:t>
             </w:r>
           </w:p>
         </w:tc>
@@ -1551,7 +1551,7 @@
                 <w:rFonts w:ascii="Calibri" w:hAnsi="Calibri"/>
                 <w:sz w:val="17"/>
               </w:rPr>
-              <w:t>Neighbor graph construction and clustering by resolution or target cluster count.</w:t>
+              <w:t>CPU, CUDA, or Metal neighbor-graph construction followed by an explicit CPU random-walk clustering kernel.</w:t>
             </w:r>
           </w:p>
         </w:tc>
@@ -13720,7 +13720,7 @@
                 <w:rFonts w:ascii="Calibri" w:hAnsi="Calibri"/>
                 <w:sz w:val="14"/>
               </w:rPr>
-              <w:t>Activate an environment containing the CUDA toolkit; configure with KODAMA_ENABLE_CUDA=ON and KODAMA_ENABLE_CUGRAPH=OFF; then build and run CTest. FAISS, cuVS, RAFT, RMM, and Armadillo are not required.</w:t>
+              <w:t>Activate an environment containing the CUDA toolkit; configure with KODAMA_ENABLE_CUDA=ON; then build and run CTest. FAISS, cuVS, RAFT, RMM, Armadillo, and external graph-clustering libraries are not required.</w:t>
             </w:r>
           </w:p>
         </w:tc>
@@ -14363,7 +14363,7 @@
                 <w:rFonts w:ascii="Calibri" w:hAnsi="Calibri"/>
                 <w:sz w:val="16"/>
               </w:rPr>
-              <w:t>Package-owned exact/IVF KNN, k-means, and SIMPLS/LDA use CUDA Toolkit libraries without FAISS, cuVS, RAFT, RMM, or Armadillo links; cuGraph clustering remains an isolated optional adapter.</w:t>
+              <w:t>Package-owned exact/IVF KNN, k-means, and SIMPLS/LDA use CUDA Toolkit libraries without FAISS, cuVS, RAFT, RMM, Armadillo, or external graph-clustering links.</w:t>
             </w:r>
           </w:p>
         </w:tc>
@@ -17112,32 +17112,6 @@
           <w:rFonts w:ascii="Calibri" w:hAnsi="Calibri"/>
           <w:sz w:val="18"/>
         </w:rPr>
-        <w:t>Blondel, V. D., Guillaume, J.-L., Lambiotte, R., and Lefebvre, E. Fast unfolding of communities in large networks. Journal of Statistical Mechanics: Theory and Experiment, 2008.</w:t>
-      </w:r>
-    </w:p>
-    <w:p>
-      <w:pPr>
-        <w:spacing w:after="40" w:line="240" w:lineRule="auto"/>
-        <w:ind w:left="360" w:hanging="360"/>
-      </w:pPr>
-      <w:r>
-        <w:rPr>
-          <w:rFonts w:ascii="Calibri" w:hAnsi="Calibri"/>
-          <w:sz w:val="18"/>
-        </w:rPr>
-        <w:t>Traag, V. A., Waltman, L., and van Eck, N. J. From Louvain to Leiden: guaranteeing well-connected communities. Scientific Reports, 9, 5233, 2019.</w:t>
-      </w:r>
-    </w:p>
-    <w:p>
-      <w:pPr>
-        <w:spacing w:after="40" w:line="240" w:lineRule="auto"/>
-        <w:ind w:left="360" w:hanging="360"/>
-      </w:pPr>
-      <w:r>
-        <w:rPr>
-          <w:rFonts w:ascii="Calibri" w:hAnsi="Calibri"/>
-          <w:sz w:val="18"/>
-        </w:rPr>
         <w:t>Sonnenburg, S., Braun, M. L., Ong, C. S., Bengio, S., Bottou, L., Holmes, G., LeCun, Y., Muller, K.-R., Pereira, F., Rasmussen, C. E., Ratsch, G., Scholkopf, B., Smola, A., Vincent, P., Weston, J., and Williamson, R. C. The need for open source software in machine learning. Journal of Machine Learning Research, 8, 2443-2466, 2007.</w:t>
       </w:r>
     </w:p>

</xml_diff>

<commit_message>
Revise JMLR submission with review-driven evidence
</commit_message>
<xml_diff>
--- a/manuscript/kodama_cpp_jmlr_manuscript.docx
+++ b/manuscript/kodama_cpp_jmlr_manuscript.docx
@@ -5582,7 +5582,7 @@
                 <w:rFonts w:ascii="Calibri" w:hAnsi="Calibri"/>
                 <w:sz w:val="16"/>
               </w:rPr>
-              <w:t>2026-07-18 UTC for release-candidate CUDA visualization validation; M/Tcycle validation dated 2026-07-16 UTC; earlier broad kernel snapshot dated 2026-07-06 UTC</w:t>
+              <w:t>2026-07-19 UTC for current-CRAN and CI/coverage validation; 2026-07-18 UTC for CUDA visualization validation; M/Tcycle validation dated 2026-07-16 UTC; earlier broad kernel snapshot dated 2026-07-06 UTC</w:t>
             </w:r>
           </w:p>
         </w:tc>
@@ -15476,6 +15476,658 @@
                 <w:sz w:val="13"/>
               </w:rPr>
               <w:t>3/8.5</w:t>
+            </w:r>
+          </w:p>
+        </w:tc>
+      </w:tr>
+    </w:tbl>
+    <w:p>
+      <w:pPr>
+        <w:pStyle w:val="Heading3"/>
+      </w:pPr>
+      <w:r>
+        <w:t>Current CRAN systems comparison</w:t>
+      </w:r>
+    </w:p>
+    <w:p>
+      <w:r>
+        <w:t>A separate short-run systems comparison addresses the current public release. MetRef was run with M = 20, Tcycle = 20, requested landmarks = 100000 (655 effective landmarks under the retained 75% rule), splitting = 100, graph k = 500, ncomp = 50, seed 1234, and four CPU workers. The CV-selected run is chosen by raw held-out accuracy; ARI and class count are computed only afterward. KODAMA 3.3 automatically selects its PLS route because its deprecated FUN argument is ignored, so this is not classifier- or trajectory-parity with kodama-cpp SIMPLS plus latent-space LDA.</w:t>
+      </w:r>
+    </w:p>
+    <w:p>
+      <w:r>
+        <w:t>Current CRAN KODAMA 3.3 completed in 344.914 seconds, compared with 822.989 seconds for kodama-cpp CPU4; thus KODAMA 3.3 was 2.39 times faster in this limited check. It also had higher selected raw CV accuracy and selected ARI. These unfavorable current results are retained and are not combined with the classifier-matched legacy KNN comparison. An exactly matched CUDA row is omitted because graph k = 500 exceeds the native CUDA builder limit of 256; neither landmarks nor graph k was changed silently to create an accelerator row.</w:t>
+      </w:r>
+    </w:p>
+    <w:tbl>
+      <w:tblPr>
+        <w:tblW w:type="auto" w:w="0"/>
+        <w:tblLayout w:type="fixed"/>
+        <w:tblLook w:firstColumn="1" w:firstRow="1" w:lastColumn="0" w:lastRow="0" w:noHBand="0" w:noVBand="1" w:val="04A0"/>
+        <w:jc w:val="center"/>
+        <w:tblBorders>
+          <w:top w:val="single" w:sz="4" w:space="0" w:color="D0D7DE"/>
+          <w:left w:val="single" w:sz="4" w:space="0" w:color="D0D7DE"/>
+          <w:bottom w:val="single" w:sz="4" w:space="0" w:color="D0D7DE"/>
+          <w:right w:val="single" w:sz="4" w:space="0" w:color="D0D7DE"/>
+          <w:insideH w:val="single" w:sz="4" w:space="0" w:color="D0D7DE"/>
+          <w:insideV w:val="single" w:sz="4" w:space="0" w:color="D0D7DE"/>
+        </w:tblBorders>
+      </w:tblPr>
+      <w:tblGrid>
+        <w:gridCol w:w="1170"/>
+        <w:gridCol w:w="1170"/>
+        <w:gridCol w:w="1170"/>
+        <w:gridCol w:w="1170"/>
+        <w:gridCol w:w="1170"/>
+        <w:gridCol w:w="1170"/>
+        <w:gridCol w:w="1170"/>
+        <w:gridCol w:w="1170"/>
+      </w:tblGrid>
+      <w:tr>
+        <w:trPr>
+          <w:cantSplit/>
+          <w:tblHeader w:val="true"/>
+        </w:trPr>
+        <w:tc>
+          <w:tcPr>
+            <w:tcW w:type="dxa" w:w="1584"/>
+            <w:vAlign w:val="center"/>
+            <w:tcMar>
+              <w:top w:w="80" w:type="dxa"/>
+              <w:bottom w:w="80" w:type="dxa"/>
+              <w:start w:w="120" w:type="dxa"/>
+              <w:end w:w="120" w:type="dxa"/>
+            </w:tcMar>
+            <w:shd w:fill="E8EEF5"/>
+          </w:tcPr>
+          <w:p>
+            <w:pPr>
+              <w:spacing w:after="40" w:line="264" w:lineRule="auto"/>
+            </w:pPr>
+            <w:r>
+              <w:rPr>
+                <w:rFonts w:ascii="Calibri" w:hAnsi="Calibri"/>
+                <w:b/>
+                <w:sz w:val="13"/>
+              </w:rPr>
+              <w:t>Implementation</w:t>
+            </w:r>
+          </w:p>
+        </w:tc>
+        <w:tc>
+          <w:tcPr>
+            <w:tcW w:type="dxa" w:w="1440"/>
+            <w:vAlign w:val="center"/>
+            <w:tcMar>
+              <w:top w:w="80" w:type="dxa"/>
+              <w:bottom w:w="80" w:type="dxa"/>
+              <w:start w:w="120" w:type="dxa"/>
+              <w:end w:w="120" w:type="dxa"/>
+            </w:tcMar>
+            <w:shd w:fill="E8EEF5"/>
+          </w:tcPr>
+          <w:p>
+            <w:pPr>
+              <w:spacing w:after="40" w:line="264" w:lineRule="auto"/>
+            </w:pPr>
+            <w:r>
+              <w:rPr>
+                <w:rFonts w:ascii="Calibri" w:hAnsi="Calibri"/>
+                <w:b/>
+                <w:sz w:val="13"/>
+              </w:rPr>
+              <w:t>Classifier route</w:t>
+            </w:r>
+          </w:p>
+        </w:tc>
+        <w:tc>
+          <w:tcPr>
+            <w:tcW w:type="dxa" w:w="864"/>
+            <w:vAlign w:val="center"/>
+            <w:tcMar>
+              <w:top w:w="80" w:type="dxa"/>
+              <w:bottom w:w="80" w:type="dxa"/>
+              <w:start w:w="120" w:type="dxa"/>
+              <w:end w:w="120" w:type="dxa"/>
+            </w:tcMar>
+            <w:shd w:fill="E8EEF5"/>
+          </w:tcPr>
+          <w:p>
+            <w:pPr>
+              <w:spacing w:after="40" w:line="264" w:lineRule="auto"/>
+            </w:pPr>
+            <w:r>
+              <w:rPr>
+                <w:rFonts w:ascii="Calibri" w:hAnsi="Calibri"/>
+                <w:b/>
+                <w:sz w:val="13"/>
+              </w:rPr>
+              <w:t>Backend</w:t>
+            </w:r>
+          </w:p>
+        </w:tc>
+        <w:tc>
+          <w:tcPr>
+            <w:tcW w:type="dxa" w:w="792"/>
+            <w:vAlign w:val="center"/>
+            <w:tcMar>
+              <w:top w:w="80" w:type="dxa"/>
+              <w:bottom w:w="80" w:type="dxa"/>
+              <w:start w:w="120" w:type="dxa"/>
+              <w:end w:w="120" w:type="dxa"/>
+            </w:tcMar>
+            <w:shd w:fill="E8EEF5"/>
+          </w:tcPr>
+          <w:p>
+            <w:pPr>
+              <w:spacing w:after="40" w:line="264" w:lineRule="auto"/>
+            </w:pPr>
+            <w:r>
+              <w:rPr>
+                <w:rFonts w:ascii="Calibri" w:hAnsi="Calibri"/>
+                <w:b/>
+                <w:sz w:val="13"/>
+              </w:rPr>
+              <w:t>Workers</w:t>
+            </w:r>
+          </w:p>
+        </w:tc>
+        <w:tc>
+          <w:tcPr>
+            <w:tcW w:type="dxa" w:w="1008"/>
+            <w:vAlign w:val="center"/>
+            <w:tcMar>
+              <w:top w:w="80" w:type="dxa"/>
+              <w:bottom w:w="80" w:type="dxa"/>
+              <w:start w:w="120" w:type="dxa"/>
+              <w:end w:w="120" w:type="dxa"/>
+            </w:tcMar>
+            <w:shd w:fill="E8EEF5"/>
+          </w:tcPr>
+          <w:p>
+            <w:pPr>
+              <w:spacing w:after="40" w:line="264" w:lineRule="auto"/>
+            </w:pPr>
+            <w:r>
+              <w:rPr>
+                <w:rFonts w:ascii="Calibri" w:hAnsi="Calibri"/>
+                <w:b/>
+                <w:sz w:val="13"/>
+              </w:rPr>
+              <w:t>Seconds</w:t>
+            </w:r>
+          </w:p>
+        </w:tc>
+        <w:tc>
+          <w:tcPr>
+            <w:tcW w:type="dxa" w:w="1512"/>
+            <w:vAlign w:val="center"/>
+            <w:tcMar>
+              <w:top w:w="80" w:type="dxa"/>
+              <w:bottom w:w="80" w:type="dxa"/>
+              <w:start w:w="120" w:type="dxa"/>
+              <w:end w:w="120" w:type="dxa"/>
+            </w:tcMar>
+            <w:shd w:fill="E8EEF5"/>
+          </w:tcPr>
+          <w:p>
+            <w:pPr>
+              <w:spacing w:after="40" w:line="264" w:lineRule="auto"/>
+            </w:pPr>
+            <w:r>
+              <w:rPr>
+                <w:rFonts w:ascii="Calibri" w:hAnsi="Calibri"/>
+                <w:b/>
+                <w:sz w:val="13"/>
+              </w:rPr>
+              <w:t>Selected/median CV</w:t>
+            </w:r>
+          </w:p>
+        </w:tc>
+        <w:tc>
+          <w:tcPr>
+            <w:tcW w:type="dxa" w:w="1512"/>
+            <w:vAlign w:val="center"/>
+            <w:tcMar>
+              <w:top w:w="80" w:type="dxa"/>
+              <w:bottom w:w="80" w:type="dxa"/>
+              <w:start w:w="120" w:type="dxa"/>
+              <w:end w:w="120" w:type="dxa"/>
+            </w:tcMar>
+            <w:shd w:fill="E8EEF5"/>
+          </w:tcPr>
+          <w:p>
+            <w:pPr>
+              <w:spacing w:after="40" w:line="264" w:lineRule="auto"/>
+            </w:pPr>
+            <w:r>
+              <w:rPr>
+                <w:rFonts w:ascii="Calibri" w:hAnsi="Calibri"/>
+                <w:b/>
+                <w:sz w:val="13"/>
+              </w:rPr>
+              <w:t>Selected/median ARI</w:t>
+            </w:r>
+          </w:p>
+        </w:tc>
+        <w:tc>
+          <w:tcPr>
+            <w:tcW w:type="dxa" w:w="1512"/>
+            <w:vAlign w:val="center"/>
+            <w:tcMar>
+              <w:top w:w="80" w:type="dxa"/>
+              <w:bottom w:w="80" w:type="dxa"/>
+              <w:start w:w="120" w:type="dxa"/>
+              <w:end w:w="120" w:type="dxa"/>
+            </w:tcMar>
+            <w:shd w:fill="E8EEF5"/>
+          </w:tcPr>
+          <w:p>
+            <w:pPr>
+              <w:spacing w:after="40" w:line="264" w:lineRule="auto"/>
+            </w:pPr>
+            <w:r>
+              <w:rPr>
+                <w:rFonts w:ascii="Calibri" w:hAnsi="Calibri"/>
+                <w:b/>
+                <w:sz w:val="13"/>
+              </w:rPr>
+              <w:t>Selected/median classes</w:t>
+            </w:r>
+          </w:p>
+        </w:tc>
+      </w:tr>
+      <w:tr>
+        <w:trPr>
+          <w:cantSplit/>
+        </w:trPr>
+        <w:tc>
+          <w:tcPr>
+            <w:tcW w:type="dxa" w:w="1584"/>
+            <w:vAlign w:val="center"/>
+            <w:tcMar>
+              <w:top w:w="80" w:type="dxa"/>
+              <w:bottom w:w="80" w:type="dxa"/>
+              <w:start w:w="120" w:type="dxa"/>
+              <w:end w:w="120" w:type="dxa"/>
+            </w:tcMar>
+          </w:tcPr>
+          <w:p>
+            <w:pPr>
+              <w:spacing w:after="40" w:line="264" w:lineRule="auto"/>
+            </w:pPr>
+            <w:r>
+              <w:rPr>
+                <w:rFonts w:ascii="Calibri" w:hAnsi="Calibri"/>
+                <w:sz w:val="13"/>
+              </w:rPr>
+              <w:t>KODAMA 3.3</w:t>
+            </w:r>
+          </w:p>
+        </w:tc>
+        <w:tc>
+          <w:tcPr>
+            <w:tcW w:type="dxa" w:w="1440"/>
+            <w:vAlign w:val="center"/>
+            <w:tcMar>
+              <w:top w:w="80" w:type="dxa"/>
+              <w:bottom w:w="80" w:type="dxa"/>
+              <w:start w:w="120" w:type="dxa"/>
+              <w:end w:w="120" w:type="dxa"/>
+            </w:tcMar>
+          </w:tcPr>
+          <w:p>
+            <w:pPr>
+              <w:spacing w:after="40" w:line="264" w:lineRule="auto"/>
+            </w:pPr>
+            <w:r>
+              <w:rPr>
+                <w:rFonts w:ascii="Calibri" w:hAnsi="Calibri"/>
+                <w:sz w:val="13"/>
+              </w:rPr>
+              <w:t>automatic PLS</w:t>
+            </w:r>
+          </w:p>
+        </w:tc>
+        <w:tc>
+          <w:tcPr>
+            <w:tcW w:type="dxa" w:w="864"/>
+            <w:vAlign w:val="center"/>
+            <w:tcMar>
+              <w:top w:w="80" w:type="dxa"/>
+              <w:bottom w:w="80" w:type="dxa"/>
+              <w:start w:w="120" w:type="dxa"/>
+              <w:end w:w="120" w:type="dxa"/>
+            </w:tcMar>
+          </w:tcPr>
+          <w:p>
+            <w:pPr>
+              <w:spacing w:after="40" w:line="264" w:lineRule="auto"/>
+            </w:pPr>
+            <w:r>
+              <w:rPr>
+                <w:rFonts w:ascii="Calibri" w:hAnsi="Calibri"/>
+                <w:sz w:val="13"/>
+              </w:rPr>
+              <w:t>CPU</w:t>
+            </w:r>
+          </w:p>
+        </w:tc>
+        <w:tc>
+          <w:tcPr>
+            <w:tcW w:type="dxa" w:w="792"/>
+            <w:vAlign w:val="center"/>
+            <w:tcMar>
+              <w:top w:w="80" w:type="dxa"/>
+              <w:bottom w:w="80" w:type="dxa"/>
+              <w:start w:w="120" w:type="dxa"/>
+              <w:end w:w="120" w:type="dxa"/>
+            </w:tcMar>
+          </w:tcPr>
+          <w:p>
+            <w:pPr>
+              <w:spacing w:after="40" w:line="264" w:lineRule="auto"/>
+            </w:pPr>
+            <w:r>
+              <w:rPr>
+                <w:rFonts w:ascii="Calibri" w:hAnsi="Calibri"/>
+                <w:sz w:val="13"/>
+              </w:rPr>
+              <w:t>4</w:t>
+            </w:r>
+          </w:p>
+        </w:tc>
+        <w:tc>
+          <w:tcPr>
+            <w:tcW w:type="dxa" w:w="1008"/>
+            <w:vAlign w:val="center"/>
+            <w:tcMar>
+              <w:top w:w="80" w:type="dxa"/>
+              <w:bottom w:w="80" w:type="dxa"/>
+              <w:start w:w="120" w:type="dxa"/>
+              <w:end w:w="120" w:type="dxa"/>
+            </w:tcMar>
+          </w:tcPr>
+          <w:p>
+            <w:pPr>
+              <w:spacing w:after="40" w:line="264" w:lineRule="auto"/>
+            </w:pPr>
+            <w:r>
+              <w:rPr>
+                <w:rFonts w:ascii="Calibri" w:hAnsi="Calibri"/>
+                <w:sz w:val="13"/>
+              </w:rPr>
+              <w:t>344.914</w:t>
+            </w:r>
+          </w:p>
+        </w:tc>
+        <w:tc>
+          <w:tcPr>
+            <w:tcW w:type="dxa" w:w="1512"/>
+            <w:vAlign w:val="center"/>
+            <w:tcMar>
+              <w:top w:w="80" w:type="dxa"/>
+              <w:bottom w:w="80" w:type="dxa"/>
+              <w:start w:w="120" w:type="dxa"/>
+              <w:end w:w="120" w:type="dxa"/>
+            </w:tcMar>
+          </w:tcPr>
+          <w:p>
+            <w:pPr>
+              <w:spacing w:after="40" w:line="264" w:lineRule="auto"/>
+            </w:pPr>
+            <w:r>
+              <w:rPr>
+                <w:rFonts w:ascii="Calibri" w:hAnsi="Calibri"/>
+                <w:sz w:val="13"/>
+              </w:rPr>
+              <w:t>0.9893 / 0.9740</w:t>
+            </w:r>
+          </w:p>
+        </w:tc>
+        <w:tc>
+          <w:tcPr>
+            <w:tcW w:type="dxa" w:w="1512"/>
+            <w:vAlign w:val="center"/>
+            <w:tcMar>
+              <w:top w:w="80" w:type="dxa"/>
+              <w:bottom w:w="80" w:type="dxa"/>
+              <w:start w:w="120" w:type="dxa"/>
+              <w:end w:w="120" w:type="dxa"/>
+            </w:tcMar>
+          </w:tcPr>
+          <w:p>
+            <w:pPr>
+              <w:spacing w:after="40" w:line="264" w:lineRule="auto"/>
+            </w:pPr>
+            <w:r>
+              <w:rPr>
+                <w:rFonts w:ascii="Calibri" w:hAnsi="Calibri"/>
+                <w:sz w:val="13"/>
+              </w:rPr>
+              <w:t>0.7004 / 0.6961</w:t>
+            </w:r>
+          </w:p>
+        </w:tc>
+        <w:tc>
+          <w:tcPr>
+            <w:tcW w:type="dxa" w:w="1512"/>
+            <w:vAlign w:val="center"/>
+            <w:tcMar>
+              <w:top w:w="80" w:type="dxa"/>
+              <w:bottom w:w="80" w:type="dxa"/>
+              <w:start w:w="120" w:type="dxa"/>
+              <w:end w:w="120" w:type="dxa"/>
+            </w:tcMar>
+          </w:tcPr>
+          <w:p>
+            <w:pPr>
+              <w:spacing w:after="40" w:line="264" w:lineRule="auto"/>
+            </w:pPr>
+            <w:r>
+              <w:rPr>
+                <w:rFonts w:ascii="Calibri" w:hAnsi="Calibri"/>
+                <w:sz w:val="13"/>
+              </w:rPr>
+              <w:t>20 / 20</w:t>
+            </w:r>
+          </w:p>
+        </w:tc>
+      </w:tr>
+      <w:tr>
+        <w:trPr>
+          <w:cantSplit/>
+        </w:trPr>
+        <w:tc>
+          <w:tcPr>
+            <w:tcW w:type="dxa" w:w="1584"/>
+            <w:vAlign w:val="center"/>
+            <w:tcMar>
+              <w:top w:w="80" w:type="dxa"/>
+              <w:bottom w:w="80" w:type="dxa"/>
+              <w:start w:w="120" w:type="dxa"/>
+              <w:end w:w="120" w:type="dxa"/>
+            </w:tcMar>
+          </w:tcPr>
+          <w:p>
+            <w:pPr>
+              <w:spacing w:after="40" w:line="264" w:lineRule="auto"/>
+            </w:pPr>
+            <w:r>
+              <w:rPr>
+                <w:rFonts w:ascii="Calibri" w:hAnsi="Calibri"/>
+                <w:sz w:val="13"/>
+              </w:rPr>
+              <w:t>kodama-cpp 0.1.0</w:t>
+            </w:r>
+          </w:p>
+        </w:tc>
+        <w:tc>
+          <w:tcPr>
+            <w:tcW w:type="dxa" w:w="1440"/>
+            <w:vAlign w:val="center"/>
+            <w:tcMar>
+              <w:top w:w="80" w:type="dxa"/>
+              <w:bottom w:w="80" w:type="dxa"/>
+              <w:start w:w="120" w:type="dxa"/>
+              <w:end w:w="120" w:type="dxa"/>
+            </w:tcMar>
+          </w:tcPr>
+          <w:p>
+            <w:pPr>
+              <w:spacing w:after="40" w:line="264" w:lineRule="auto"/>
+            </w:pPr>
+            <w:r>
+              <w:rPr>
+                <w:rFonts w:ascii="Calibri" w:hAnsi="Calibri"/>
+                <w:sz w:val="13"/>
+              </w:rPr>
+              <w:t>SIMPLS + LDA</w:t>
+            </w:r>
+          </w:p>
+        </w:tc>
+        <w:tc>
+          <w:tcPr>
+            <w:tcW w:type="dxa" w:w="864"/>
+            <w:vAlign w:val="center"/>
+            <w:tcMar>
+              <w:top w:w="80" w:type="dxa"/>
+              <w:bottom w:w="80" w:type="dxa"/>
+              <w:start w:w="120" w:type="dxa"/>
+              <w:end w:w="120" w:type="dxa"/>
+            </w:tcMar>
+          </w:tcPr>
+          <w:p>
+            <w:pPr>
+              <w:spacing w:after="40" w:line="264" w:lineRule="auto"/>
+            </w:pPr>
+            <w:r>
+              <w:rPr>
+                <w:rFonts w:ascii="Calibri" w:hAnsi="Calibri"/>
+                <w:sz w:val="13"/>
+              </w:rPr>
+              <w:t>CPU</w:t>
+            </w:r>
+          </w:p>
+        </w:tc>
+        <w:tc>
+          <w:tcPr>
+            <w:tcW w:type="dxa" w:w="792"/>
+            <w:vAlign w:val="center"/>
+            <w:tcMar>
+              <w:top w:w="80" w:type="dxa"/>
+              <w:bottom w:w="80" w:type="dxa"/>
+              <w:start w:w="120" w:type="dxa"/>
+              <w:end w:w="120" w:type="dxa"/>
+            </w:tcMar>
+          </w:tcPr>
+          <w:p>
+            <w:pPr>
+              <w:spacing w:after="40" w:line="264" w:lineRule="auto"/>
+            </w:pPr>
+            <w:r>
+              <w:rPr>
+                <w:rFonts w:ascii="Calibri" w:hAnsi="Calibri"/>
+                <w:sz w:val="13"/>
+              </w:rPr>
+              <w:t>4</w:t>
+            </w:r>
+          </w:p>
+        </w:tc>
+        <w:tc>
+          <w:tcPr>
+            <w:tcW w:type="dxa" w:w="1008"/>
+            <w:vAlign w:val="center"/>
+            <w:tcMar>
+              <w:top w:w="80" w:type="dxa"/>
+              <w:bottom w:w="80" w:type="dxa"/>
+              <w:start w:w="120" w:type="dxa"/>
+              <w:end w:w="120" w:type="dxa"/>
+            </w:tcMar>
+          </w:tcPr>
+          <w:p>
+            <w:pPr>
+              <w:spacing w:after="40" w:line="264" w:lineRule="auto"/>
+            </w:pPr>
+            <w:r>
+              <w:rPr>
+                <w:rFonts w:ascii="Calibri" w:hAnsi="Calibri"/>
+                <w:sz w:val="13"/>
+              </w:rPr>
+              <w:t>822.989</w:t>
+            </w:r>
+          </w:p>
+        </w:tc>
+        <w:tc>
+          <w:tcPr>
+            <w:tcW w:type="dxa" w:w="1512"/>
+            <w:vAlign w:val="center"/>
+            <w:tcMar>
+              <w:top w:w="80" w:type="dxa"/>
+              <w:bottom w:w="80" w:type="dxa"/>
+              <w:start w:w="120" w:type="dxa"/>
+              <w:end w:w="120" w:type="dxa"/>
+            </w:tcMar>
+          </w:tcPr>
+          <w:p>
+            <w:pPr>
+              <w:spacing w:after="40" w:line="264" w:lineRule="auto"/>
+            </w:pPr>
+            <w:r>
+              <w:rPr>
+                <w:rFonts w:ascii="Calibri" w:hAnsi="Calibri"/>
+                <w:sz w:val="13"/>
+              </w:rPr>
+              <w:t>0.9802 / 0.9550</w:t>
+            </w:r>
+          </w:p>
+        </w:tc>
+        <w:tc>
+          <w:tcPr>
+            <w:tcW w:type="dxa" w:w="1512"/>
+            <w:vAlign w:val="center"/>
+            <w:tcMar>
+              <w:top w:w="80" w:type="dxa"/>
+              <w:bottom w:w="80" w:type="dxa"/>
+              <w:start w:w="120" w:type="dxa"/>
+              <w:end w:w="120" w:type="dxa"/>
+            </w:tcMar>
+          </w:tcPr>
+          <w:p>
+            <w:pPr>
+              <w:spacing w:after="40" w:line="264" w:lineRule="auto"/>
+            </w:pPr>
+            <w:r>
+              <w:rPr>
+                <w:rFonts w:ascii="Calibri" w:hAnsi="Calibri"/>
+                <w:sz w:val="13"/>
+              </w:rPr>
+              <w:t>0.6430 / 0.6584</w:t>
+            </w:r>
+          </w:p>
+        </w:tc>
+        <w:tc>
+          <w:tcPr>
+            <w:tcW w:type="dxa" w:w="1512"/>
+            <w:vAlign w:val="center"/>
+            <w:tcMar>
+              <w:top w:w="80" w:type="dxa"/>
+              <w:bottom w:w="80" w:type="dxa"/>
+              <w:start w:w="120" w:type="dxa"/>
+              <w:end w:w="120" w:type="dxa"/>
+            </w:tcMar>
+          </w:tcPr>
+          <w:p>
+            <w:pPr>
+              <w:spacing w:after="40" w:line="264" w:lineRule="auto"/>
+            </w:pPr>
+            <w:r>
+              <w:rPr>
+                <w:rFonts w:ascii="Calibri" w:hAnsi="Calibri"/>
+                <w:sz w:val="13"/>
+              </w:rPr>
+              <w:t>30 / 35</w:t>
             </w:r>
           </w:p>
         </w:tc>
@@ -23773,6 +24425,112 @@
                 <w:rFonts w:ascii="Calibri" w:hAnsi="Calibri"/>
                 <w:sz w:val="17"/>
               </w:rPr>
+              <w:t>Continuous integration</w:t>
+            </w:r>
+          </w:p>
+        </w:tc>
+        <w:tc>
+          <w:tcPr>
+            <w:tcW w:type="dxa" w:w="7200"/>
+            <w:vAlign w:val="center"/>
+            <w:tcMar>
+              <w:top w:w="80" w:type="dxa"/>
+              <w:bottom w:w="80" w:type="dxa"/>
+              <w:start w:w="120" w:type="dxa"/>
+              <w:end w:w="120" w:type="dxa"/>
+            </w:tcMar>
+          </w:tcPr>
+          <w:p>
+            <w:pPr>
+              <w:spacing w:after="40" w:line="264" w:lineRule="auto"/>
+            </w:pPr>
+            <w:r>
+              <w:rPr>
+                <w:rFonts w:ascii="Calibri" w:hAnsi="Calibri"/>
+                <w:sz w:val="17"/>
+              </w:rPr>
+              <w:t>GitHub Actions commit 0e019c1 passed CPU core jobs on Linux and macOS, a native Metal job on macOS, R package build/check, and Python installation/pytest.</w:t>
+            </w:r>
+          </w:p>
+        </w:tc>
+      </w:tr>
+      <w:tr>
+        <w:trPr>
+          <w:cantSplit/>
+        </w:trPr>
+        <w:tc>
+          <w:tcPr>
+            <w:tcW w:type="dxa" w:w="2088"/>
+            <w:vAlign w:val="center"/>
+            <w:tcMar>
+              <w:top w:w="80" w:type="dxa"/>
+              <w:bottom w:w="80" w:type="dxa"/>
+              <w:start w:w="120" w:type="dxa"/>
+              <w:end w:w="120" w:type="dxa"/>
+            </w:tcMar>
+          </w:tcPr>
+          <w:p>
+            <w:pPr>
+              <w:spacing w:after="40" w:line="264" w:lineRule="auto"/>
+            </w:pPr>
+            <w:r>
+              <w:rPr>
+                <w:rFonts w:ascii="Calibri" w:hAnsi="Calibri"/>
+                <w:sz w:val="17"/>
+              </w:rPr>
+              <w:t>Coverage and documentation</w:t>
+            </w:r>
+          </w:p>
+        </w:tc>
+        <w:tc>
+          <w:tcPr>
+            <w:tcW w:type="dxa" w:w="7200"/>
+            <w:vAlign w:val="center"/>
+            <w:tcMar>
+              <w:top w:w="80" w:type="dxa"/>
+              <w:bottom w:w="80" w:type="dxa"/>
+              <w:start w:w="120" w:type="dxa"/>
+              <w:end w:w="120" w:type="dxa"/>
+            </w:tcMar>
+          </w:tcPr>
+          <w:p>
+            <w:pPr>
+              <w:spacing w:after="40" w:line="264" w:lineRule="auto"/>
+            </w:pPr>
+            <w:r>
+              <w:rPr>
+                <w:rFonts w:ascii="Calibri" w:hAnsi="Calibri"/>
+                <w:sz w:val="17"/>
+              </w:rPr>
+              <w:t>LLVM 22.1.1 CPU instrumentation measured 63.58% line, 57.03% branch, 66.04% function, and 67.61% region coverage. CUDA and Metal are excluded from that CPU number and retain hardware tests. Doxygen generation and GitHub Pages deployment passed, and the public API site is reachable at https://tkcaccia.github.io/kodama-cpp/.</w:t>
+            </w:r>
+          </w:p>
+        </w:tc>
+      </w:tr>
+      <w:tr>
+        <w:trPr>
+          <w:cantSplit/>
+        </w:trPr>
+        <w:tc>
+          <w:tcPr>
+            <w:tcW w:type="dxa" w:w="2088"/>
+            <w:vAlign w:val="center"/>
+            <w:tcMar>
+              <w:top w:w="80" w:type="dxa"/>
+              <w:bottom w:w="80" w:type="dxa"/>
+              <w:start w:w="120" w:type="dxa"/>
+              <w:end w:w="120" w:type="dxa"/>
+            </w:tcMar>
+          </w:tcPr>
+          <w:p>
+            <w:pPr>
+              <w:spacing w:after="40" w:line="264" w:lineRule="auto"/>
+            </w:pPr>
+            <w:r>
+              <w:rPr>
+                <w:rFonts w:ascii="Calibri" w:hAnsi="Calibri"/>
+                <w:sz w:val="17"/>
+              </w:rPr>
               <w:t>Release</w:t>
             </w:r>
           </w:p>
@@ -23818,7 +24576,7 @@
     </w:p>
     <w:p>
       <w:r>
-        <w:t>Reproducibility is supported through CMake builds, CPU, CUDA, and Metal tests, wrapper validation tests, benchmark scripts, and explicit recording of backend parameters. The C++ core does not depend on R data readers; wrapper packages are responsible for translating host-language objects into contiguous matrices before calling the library.</w:t>
+        <w:t>Reproducibility is supported through CMake builds, CPU, CUDA, and Metal tests, wrapper validation tests, benchmark scripts, and explicit recording of backend parameters. GitHub Actions builds and tests the CPU core on Linux and macOS, builds the native Metal core on macOS, and installs and tests both wrapper packages. A separate LLVM workflow measures CPU source coverage, while Doxygen publishes the typed API and a compact C++/R/Python walkthrough at https://tkcaccia.github.io/kodama-cpp/. The C++ core does not depend on R data readers; wrappers translate host-language objects into contiguous matrices before calling the library.</w:t>
       </w:r>
     </w:p>
     <w:p>
@@ -24580,6 +25338,59 @@
           </w:p>
         </w:tc>
       </w:tr>
+      <w:tr>
+        <w:trPr>
+          <w:cantSplit/>
+        </w:trPr>
+        <w:tc>
+          <w:tcPr>
+            <w:tcW w:type="dxa" w:w="2160"/>
+            <w:vAlign w:val="center"/>
+            <w:tcMar>
+              <w:top w:w="80" w:type="dxa"/>
+              <w:bottom w:w="80" w:type="dxa"/>
+              <w:start w:w="120" w:type="dxa"/>
+              <w:end w:w="120" w:type="dxa"/>
+            </w:tcMar>
+          </w:tcPr>
+          <w:p>
+            <w:pPr>
+              <w:spacing w:after="40" w:line="264" w:lineRule="auto"/>
+            </w:pPr>
+            <w:r>
+              <w:rPr>
+                <w:rFonts w:ascii="Calibri" w:hAnsi="Calibri"/>
+                <w:sz w:val="16"/>
+              </w:rPr>
+              <w:t>GitHub Actions</w:t>
+            </w:r>
+          </w:p>
+        </w:tc>
+        <w:tc>
+          <w:tcPr>
+            <w:tcW w:type="dxa" w:w="7128"/>
+            <w:vAlign w:val="center"/>
+            <w:tcMar>
+              <w:top w:w="80" w:type="dxa"/>
+              <w:bottom w:w="80" w:type="dxa"/>
+              <w:start w:w="120" w:type="dxa"/>
+              <w:end w:w="120" w:type="dxa"/>
+            </w:tcMar>
+          </w:tcPr>
+          <w:p>
+            <w:pPr>
+              <w:spacing w:after="40" w:line="264" w:lineRule="auto"/>
+            </w:pPr>
+            <w:r>
+              <w:rPr>
+                <w:rFonts w:ascii="Calibri" w:hAnsi="Calibri"/>
+                <w:sz w:val="16"/>
+              </w:rPr>
+              <w:t>Commit 0e019c1 passed five CI jobs: CPU core on Ubuntu and macOS, native Metal on macOS, R package build/check on Ubuntu, and Python installation/pytest on Ubuntu. Separate coverage and API-documentation workflows also passed.</w:t>
+            </w:r>
+          </w:p>
+        </w:tc>
+      </w:tr>
     </w:tbl>
     <w:p>
       <w:pPr>
@@ -25107,6 +25918,11 @@
     <w:p>
       <w:r>
         <w:t>The main engineering limitation is that KODAMA performs many cross-validation fits. This makes memory locality, buffer reuse, label compaction, and GPU scheduling as important as asymptotic complexity. The present release includes float32 buffers, fold reuse, label compaction, CUDA kernels, and native Metal KNN and PLS-LDA kernels, but full accelerator-resident batching of independent M runs remains an engineering extension rather than a claim of the current manuscript.</w:t>
+      </w:r>
+    </w:p>
+    <w:p>
+      <w:r>
+        <w:t>The native CUDA neighbor-graph builder currently supports at most 256 retained neighbors per sample, whereas the CPU path supports larger rows. The implementation raises an error rather than silently truncating k. This matters when comparing with interfaces that couple landmark count and graph size; the current-CRAN MetRef systems comparison therefore reports the exactly matched CPU4 path and does not manufacture an unmatched CUDA row.</w:t>
       </w:r>
     </w:p>
     <w:p>

</xml_diff>

<commit_message>
Match manuscript author block to supplied format
</commit_message>
<xml_diff>
--- a/manuscript/kodama_cpp_jmlr_manuscript.docx
+++ b/manuscript/kodama_cpp_jmlr_manuscript.docx
@@ -29,142 +29,509 @@
         <w:t>Manuscript for the Journal of Machine Learning Research Machine Learning Open Source Software track</w:t>
       </w:r>
     </w:p>
-    <w:p>
-      <w:pPr>
-        <w:spacing w:after="80"/>
-      </w:pPr>
-      <w:r>
-        <w:rPr>
-          <w:rFonts w:ascii="Calibri" w:hAnsi="Calibri"/>
-          <w:b w:val="0"/>
-          <w:color w:val="555555"/>
-          <w:sz w:val="20"/>
-        </w:rPr>
-        <w:t>Moussa Kassim</w:t>
-      </w:r>
-      <w:r>
-        <w:rPr>
-          <w:rFonts w:ascii="Calibri" w:hAnsi="Calibri"/>
-          <w:b w:val="0"/>
-          <w:color w:val="555555"/>
-          <w:sz w:val="16"/>
-          <w:vertAlign w:val="superscript"/>
-        </w:rPr>
-        <w:t>1,2</w:t>
-      </w:r>
-      <w:r>
-        <w:rPr>
-          <w:rFonts w:ascii="Calibri" w:hAnsi="Calibri"/>
-          <w:b w:val="0"/>
-          <w:color w:val="555555"/>
-          <w:sz w:val="20"/>
-        </w:rPr>
-        <w:t xml:space="preserve">, </w:t>
-      </w:r>
-      <w:r>
-        <w:rPr>
-          <w:rFonts w:ascii="Calibri" w:hAnsi="Calibri"/>
-          <w:b w:val="0"/>
-          <w:color w:val="555555"/>
-          <w:sz w:val="20"/>
-        </w:rPr>
-        <w:t>Martin Ocharo</w:t>
-      </w:r>
-      <w:r>
-        <w:rPr>
-          <w:rFonts w:ascii="Calibri" w:hAnsi="Calibri"/>
-          <w:b w:val="0"/>
-          <w:color w:val="555555"/>
-          <w:sz w:val="16"/>
-          <w:vertAlign w:val="superscript"/>
-        </w:rPr>
-        <w:t>1,2</w:t>
-      </w:r>
-      <w:r>
-        <w:rPr>
-          <w:rFonts w:ascii="Calibri" w:hAnsi="Calibri"/>
-          <w:b w:val="0"/>
-          <w:color w:val="555555"/>
-          <w:sz w:val="20"/>
-        </w:rPr>
-        <w:t xml:space="preserve">, </w:t>
-      </w:r>
-      <w:r>
-        <w:rPr>
-          <w:rFonts w:ascii="Calibri" w:hAnsi="Calibri"/>
-          <w:b w:val="0"/>
-          <w:color w:val="555555"/>
-          <w:sz w:val="20"/>
-        </w:rPr>
-        <w:t>Alessia Vignoli</w:t>
-      </w:r>
-      <w:r>
-        <w:rPr>
-          <w:rFonts w:ascii="Calibri" w:hAnsi="Calibri"/>
-          <w:b w:val="0"/>
-          <w:color w:val="555555"/>
-          <w:sz w:val="16"/>
-          <w:vertAlign w:val="superscript"/>
-        </w:rPr>
-        <w:t>3,4</w:t>
-      </w:r>
-      <w:r>
-        <w:rPr>
-          <w:rFonts w:ascii="Calibri" w:hAnsi="Calibri"/>
-          <w:b w:val="0"/>
-          <w:color w:val="555555"/>
-          <w:sz w:val="20"/>
-        </w:rPr>
-        <w:t xml:space="preserve">, </w:t>
-      </w:r>
-      <w:r>
-        <w:rPr>
-          <w:rFonts w:ascii="Calibri" w:hAnsi="Calibri"/>
-          <w:b w:val="0"/>
-          <w:color w:val="555555"/>
-          <w:sz w:val="20"/>
-        </w:rPr>
-        <w:t>Leonardo Tenori</w:t>
-      </w:r>
-      <w:r>
-        <w:rPr>
-          <w:rFonts w:ascii="Calibri" w:hAnsi="Calibri"/>
-          <w:b w:val="0"/>
-          <w:color w:val="555555"/>
-          <w:sz w:val="16"/>
-          <w:vertAlign w:val="superscript"/>
-        </w:rPr>
-        <w:t>3,4</w:t>
-      </w:r>
-      <w:r>
-        <w:rPr>
-          <w:rFonts w:ascii="Calibri" w:hAnsi="Calibri"/>
-          <w:b w:val="0"/>
-          <w:color w:val="555555"/>
-          <w:sz w:val="20"/>
-        </w:rPr>
-        <w:t xml:space="preserve">, and </w:t>
-      </w:r>
-      <w:r>
-        <w:rPr>
-          <w:rFonts w:ascii="Calibri" w:hAnsi="Calibri"/>
-          <w:b w:val="0"/>
-          <w:color w:val="555555"/>
-          <w:sz w:val="20"/>
-        </w:rPr>
-        <w:t>Stefano Cacciatore</w:t>
-      </w:r>
-      <w:r>
-        <w:rPr>
-          <w:rFonts w:ascii="Calibri" w:hAnsi="Calibri"/>
-          <w:b w:val="0"/>
-          <w:color w:val="555555"/>
-          <w:sz w:val="16"/>
-          <w:vertAlign w:val="superscript"/>
-        </w:rPr>
-        <w:t>1,2</w:t>
-      </w:r>
-    </w:p>
+    <w:tbl>
+      <w:tblPr>
+        <w:tblW w:type="auto" w:w="0"/>
+        <w:jc w:val="center"/>
+        <w:tblLayout w:type="fixed"/>
+        <w:tblLook w:firstColumn="1" w:firstRow="1" w:lastColumn="0" w:lastRow="0" w:noHBand="0" w:noVBand="1" w:val="04A0"/>
+        <w:tblBorders>
+          <w:top w:val="single" w:sz="0" w:space="0" w:color="FFFFFF"/>
+          <w:left w:val="single" w:sz="0" w:space="0" w:color="FFFFFF"/>
+          <w:bottom w:val="single" w:sz="0" w:space="0" w:color="FFFFFF"/>
+          <w:right w:val="single" w:sz="0" w:space="0" w:color="FFFFFF"/>
+          <w:insideH w:val="single" w:sz="0" w:space="0" w:color="FFFFFF"/>
+          <w:insideV w:val="single" w:sz="0" w:space="0" w:color="FFFFFF"/>
+        </w:tblBorders>
+      </w:tblPr>
+      <w:tblGrid>
+        <w:gridCol w:w="4680"/>
+        <w:gridCol w:w="4680"/>
+      </w:tblGrid>
+      <w:tr>
+        <w:trPr>
+          <w:cantSplit/>
+        </w:trPr>
+        <w:tc>
+          <w:tcPr>
+            <w:tcW w:type="dxa" w:w="4464"/>
+            <w:tcMar>
+              <w:top w:w="80" w:type="dxa"/>
+              <w:bottom w:w="80" w:type="dxa"/>
+              <w:start w:w="120" w:type="dxa"/>
+              <w:end w:w="120" w:type="dxa"/>
+            </w:tcMar>
+            <w:vAlign w:val="center"/>
+          </w:tcPr>
+          <w:p>
+            <w:pPr>
+              <w:spacing w:after="0"/>
+            </w:pPr>
+            <w:r>
+              <w:rPr>
+                <w:rFonts w:ascii="Calibri" w:hAnsi="Calibri"/>
+                <w:b/>
+                <w:color w:val="555555"/>
+                <w:sz w:val="20"/>
+              </w:rPr>
+              <w:t>Moussa Kassim</w:t>
+            </w:r>
+            <w:r>
+              <w:rPr>
+                <w:rFonts w:ascii="Calibri" w:hAnsi="Calibri"/>
+                <w:b w:val="0"/>
+                <w:color w:val="555555"/>
+                <w:sz w:val="16"/>
+                <w:vertAlign w:val="superscript"/>
+              </w:rPr>
+              <w:t>1,2</w:t>
+            </w:r>
+          </w:p>
+        </w:tc>
+        <w:tc>
+          <w:tcPr>
+            <w:tcW w:type="dxa" w:w="4824"/>
+            <w:tcMar>
+              <w:top w:w="80" w:type="dxa"/>
+              <w:bottom w:w="80" w:type="dxa"/>
+              <w:start w:w="120" w:type="dxa"/>
+              <w:end w:w="120" w:type="dxa"/>
+            </w:tcMar>
+            <w:vAlign w:val="center"/>
+          </w:tcPr>
+          <w:p>
+            <w:pPr>
+              <w:spacing w:after="0"/>
+              <w:jc w:val="right"/>
+            </w:pPr>
+            <w:r>
+              <w:rPr>
+                <w:rFonts w:ascii="Calibri" w:hAnsi="Calibri"/>
+                <w:b w:val="0"/>
+                <w:smallCaps/>
+                <w:color w:val="555555"/>
+                <w:sz w:val="17"/>
+              </w:rPr>
+              <w:t>moussa.kassim@icgeb.org</w:t>
+            </w:r>
+          </w:p>
+        </w:tc>
+      </w:tr>
+      <w:tr>
+        <w:trPr>
+          <w:cantSplit/>
+        </w:trPr>
+        <w:tc>
+          <w:tcPr>
+            <w:tcW w:type="dxa" w:w="4464"/>
+            <w:tcMar>
+              <w:top w:w="80" w:type="dxa"/>
+              <w:bottom w:w="80" w:type="dxa"/>
+              <w:start w:w="120" w:type="dxa"/>
+              <w:end w:w="120" w:type="dxa"/>
+            </w:tcMar>
+            <w:vAlign w:val="center"/>
+          </w:tcPr>
+          <w:p>
+            <w:pPr>
+              <w:spacing w:after="0"/>
+            </w:pPr>
+            <w:r>
+              <w:rPr>
+                <w:rFonts w:ascii="Calibri" w:hAnsi="Calibri"/>
+                <w:b/>
+                <w:color w:val="555555"/>
+                <w:sz w:val="20"/>
+              </w:rPr>
+              <w:t>Martin Ocharo</w:t>
+            </w:r>
+            <w:r>
+              <w:rPr>
+                <w:rFonts w:ascii="Calibri" w:hAnsi="Calibri"/>
+                <w:b w:val="0"/>
+                <w:color w:val="555555"/>
+                <w:sz w:val="16"/>
+                <w:vertAlign w:val="superscript"/>
+              </w:rPr>
+              <w:t>1,2</w:t>
+            </w:r>
+          </w:p>
+        </w:tc>
+        <w:tc>
+          <w:tcPr>
+            <w:tcW w:type="dxa" w:w="4824"/>
+            <w:tcMar>
+              <w:top w:w="80" w:type="dxa"/>
+              <w:bottom w:w="80" w:type="dxa"/>
+              <w:start w:w="120" w:type="dxa"/>
+              <w:end w:w="120" w:type="dxa"/>
+            </w:tcMar>
+            <w:vAlign w:val="center"/>
+          </w:tcPr>
+          <w:p>
+            <w:pPr>
+              <w:spacing w:after="0"/>
+              <w:jc w:val="right"/>
+            </w:pPr>
+            <w:r>
+              <w:rPr>
+                <w:rFonts w:ascii="Calibri" w:hAnsi="Calibri"/>
+                <w:b w:val="0"/>
+                <w:smallCaps/>
+                <w:color w:val="555555"/>
+                <w:sz w:val="17"/>
+              </w:rPr>
+              <w:t>martin.ocharo@icgeb.org</w:t>
+            </w:r>
+          </w:p>
+        </w:tc>
+      </w:tr>
+      <w:tr>
+        <w:trPr>
+          <w:cantSplit/>
+        </w:trPr>
+        <w:tc>
+          <w:tcPr>
+            <w:tcW w:type="dxa" w:w="4464"/>
+            <w:tcMar>
+              <w:top w:w="80" w:type="dxa"/>
+              <w:bottom w:w="80" w:type="dxa"/>
+              <w:start w:w="120" w:type="dxa"/>
+              <w:end w:w="120" w:type="dxa"/>
+            </w:tcMar>
+            <w:vAlign w:val="center"/>
+          </w:tcPr>
+          <w:p>
+            <w:pPr>
+              <w:spacing w:after="0"/>
+            </w:pPr>
+            <w:r>
+              <w:rPr>
+                <w:rFonts w:ascii="Calibri" w:hAnsi="Calibri"/>
+                <w:b/>
+                <w:color w:val="555555"/>
+                <w:sz w:val="20"/>
+              </w:rPr>
+              <w:t>Dalia Ahmed</w:t>
+            </w:r>
+            <w:r>
+              <w:rPr>
+                <w:rFonts w:ascii="Calibri" w:hAnsi="Calibri"/>
+                <w:b w:val="0"/>
+                <w:color w:val="555555"/>
+                <w:sz w:val="16"/>
+                <w:vertAlign w:val="superscript"/>
+              </w:rPr>
+              <w:t>1</w:t>
+            </w:r>
+          </w:p>
+        </w:tc>
+        <w:tc>
+          <w:tcPr>
+            <w:tcW w:type="dxa" w:w="4824"/>
+            <w:tcMar>
+              <w:top w:w="80" w:type="dxa"/>
+              <w:bottom w:w="80" w:type="dxa"/>
+              <w:start w:w="120" w:type="dxa"/>
+              <w:end w:w="120" w:type="dxa"/>
+            </w:tcMar>
+            <w:vAlign w:val="center"/>
+          </w:tcPr>
+          <w:p>
+            <w:pPr>
+              <w:spacing w:after="0"/>
+              <w:jc w:val="right"/>
+            </w:pPr>
+            <w:r>
+              <w:rPr>
+                <w:rFonts w:ascii="Calibri" w:hAnsi="Calibri"/>
+                <w:b w:val="0"/>
+                <w:smallCaps/>
+                <w:color w:val="555555"/>
+                <w:sz w:val="17"/>
+              </w:rPr>
+              <w:t>dalia.ahmed@icgeb.org</w:t>
+            </w:r>
+          </w:p>
+        </w:tc>
+      </w:tr>
+      <w:tr>
+        <w:trPr>
+          <w:cantSplit/>
+        </w:trPr>
+        <w:tc>
+          <w:tcPr>
+            <w:tcW w:type="dxa" w:w="4464"/>
+            <w:tcMar>
+              <w:top w:w="80" w:type="dxa"/>
+              <w:bottom w:w="80" w:type="dxa"/>
+              <w:start w:w="120" w:type="dxa"/>
+              <w:end w:w="120" w:type="dxa"/>
+            </w:tcMar>
+            <w:vAlign w:val="center"/>
+          </w:tcPr>
+          <w:p>
+            <w:pPr>
+              <w:spacing w:after="0"/>
+            </w:pPr>
+            <w:r>
+              <w:rPr>
+                <w:rFonts w:ascii="Calibri" w:hAnsi="Calibri"/>
+                <w:b/>
+                <w:color w:val="555555"/>
+                <w:sz w:val="20"/>
+              </w:rPr>
+              <w:t>Dupe Ojo</w:t>
+            </w:r>
+            <w:r>
+              <w:rPr>
+                <w:rFonts w:ascii="Calibri" w:hAnsi="Calibri"/>
+                <w:b w:val="0"/>
+                <w:color w:val="555555"/>
+                <w:sz w:val="16"/>
+                <w:vertAlign w:val="superscript"/>
+              </w:rPr>
+              <w:t>1</w:t>
+            </w:r>
+          </w:p>
+        </w:tc>
+        <w:tc>
+          <w:tcPr>
+            <w:tcW w:type="dxa" w:w="4824"/>
+            <w:tcMar>
+              <w:top w:w="80" w:type="dxa"/>
+              <w:bottom w:w="80" w:type="dxa"/>
+              <w:start w:w="120" w:type="dxa"/>
+              <w:end w:w="120" w:type="dxa"/>
+            </w:tcMar>
+            <w:vAlign w:val="center"/>
+          </w:tcPr>
+          <w:p>
+            <w:pPr>
+              <w:spacing w:after="0"/>
+              <w:jc w:val="right"/>
+            </w:pPr>
+            <w:r>
+              <w:rPr>
+                <w:rFonts w:ascii="Calibri" w:hAnsi="Calibri"/>
+                <w:b w:val="0"/>
+                <w:smallCaps/>
+                <w:color w:val="555555"/>
+                <w:sz w:val="17"/>
+              </w:rPr>
+              <w:t>dupe.ojo@icgeb.org</w:t>
+            </w:r>
+          </w:p>
+        </w:tc>
+      </w:tr>
+      <w:tr>
+        <w:trPr>
+          <w:cantSplit/>
+        </w:trPr>
+        <w:tc>
+          <w:tcPr>
+            <w:tcW w:type="dxa" w:w="4464"/>
+            <w:tcMar>
+              <w:top w:w="80" w:type="dxa"/>
+              <w:bottom w:w="80" w:type="dxa"/>
+              <w:start w:w="120" w:type="dxa"/>
+              <w:end w:w="120" w:type="dxa"/>
+            </w:tcMar>
+            <w:vAlign w:val="center"/>
+          </w:tcPr>
+          <w:p>
+            <w:pPr>
+              <w:spacing w:after="0"/>
+            </w:pPr>
+            <w:r>
+              <w:rPr>
+                <w:rFonts w:ascii="Calibri" w:hAnsi="Calibri"/>
+                <w:b/>
+                <w:color w:val="555555"/>
+                <w:sz w:val="20"/>
+              </w:rPr>
+              <w:t>Alessia Vignoli</w:t>
+            </w:r>
+            <w:r>
+              <w:rPr>
+                <w:rFonts w:ascii="Calibri" w:hAnsi="Calibri"/>
+                <w:b w:val="0"/>
+                <w:color w:val="555555"/>
+                <w:sz w:val="16"/>
+                <w:vertAlign w:val="superscript"/>
+              </w:rPr>
+              <w:t>3,4</w:t>
+            </w:r>
+          </w:p>
+        </w:tc>
+        <w:tc>
+          <w:tcPr>
+            <w:tcW w:type="dxa" w:w="4824"/>
+            <w:tcMar>
+              <w:top w:w="80" w:type="dxa"/>
+              <w:bottom w:w="80" w:type="dxa"/>
+              <w:start w:w="120" w:type="dxa"/>
+              <w:end w:w="120" w:type="dxa"/>
+            </w:tcMar>
+            <w:vAlign w:val="center"/>
+          </w:tcPr>
+          <w:p>
+            <w:pPr>
+              <w:spacing w:after="0"/>
+              <w:jc w:val="right"/>
+            </w:pPr>
+            <w:r>
+              <w:rPr>
+                <w:rFonts w:ascii="Calibri" w:hAnsi="Calibri"/>
+                <w:b w:val="0"/>
+                <w:smallCaps/>
+                <w:color w:val="555555"/>
+                <w:sz w:val="17"/>
+              </w:rPr>
+              <w:t>vignoli@cerm.unifi.it</w:t>
+            </w:r>
+          </w:p>
+        </w:tc>
+      </w:tr>
+      <w:tr>
+        <w:trPr>
+          <w:cantSplit/>
+        </w:trPr>
+        <w:tc>
+          <w:tcPr>
+            <w:tcW w:type="dxa" w:w="4464"/>
+            <w:tcMar>
+              <w:top w:w="80" w:type="dxa"/>
+              <w:bottom w:w="80" w:type="dxa"/>
+              <w:start w:w="120" w:type="dxa"/>
+              <w:end w:w="120" w:type="dxa"/>
+            </w:tcMar>
+            <w:vAlign w:val="center"/>
+          </w:tcPr>
+          <w:p>
+            <w:pPr>
+              <w:spacing w:after="0"/>
+            </w:pPr>
+            <w:r>
+              <w:rPr>
+                <w:rFonts w:ascii="Calibri" w:hAnsi="Calibri"/>
+                <w:b/>
+                <w:color w:val="555555"/>
+                <w:sz w:val="20"/>
+              </w:rPr>
+              <w:t>Leonardo Tenori</w:t>
+            </w:r>
+            <w:r>
+              <w:rPr>
+                <w:rFonts w:ascii="Calibri" w:hAnsi="Calibri"/>
+                <w:b w:val="0"/>
+                <w:color w:val="555555"/>
+                <w:sz w:val="16"/>
+                <w:vertAlign w:val="superscript"/>
+              </w:rPr>
+              <w:t>3,4</w:t>
+            </w:r>
+          </w:p>
+        </w:tc>
+        <w:tc>
+          <w:tcPr>
+            <w:tcW w:type="dxa" w:w="4824"/>
+            <w:tcMar>
+              <w:top w:w="80" w:type="dxa"/>
+              <w:bottom w:w="80" w:type="dxa"/>
+              <w:start w:w="120" w:type="dxa"/>
+              <w:end w:w="120" w:type="dxa"/>
+            </w:tcMar>
+            <w:vAlign w:val="center"/>
+          </w:tcPr>
+          <w:p>
+            <w:pPr>
+              <w:spacing w:after="0"/>
+              <w:jc w:val="right"/>
+            </w:pPr>
+            <w:r>
+              <w:rPr>
+                <w:rFonts w:ascii="Calibri" w:hAnsi="Calibri"/>
+                <w:b w:val="0"/>
+                <w:smallCaps/>
+                <w:color w:val="555555"/>
+                <w:sz w:val="17"/>
+              </w:rPr>
+              <w:t>tenori@cerm.unifi.it</w:t>
+            </w:r>
+          </w:p>
+        </w:tc>
+      </w:tr>
+      <w:tr>
+        <w:trPr>
+          <w:cantSplit/>
+        </w:trPr>
+        <w:tc>
+          <w:tcPr>
+            <w:tcW w:type="dxa" w:w="4464"/>
+            <w:tcMar>
+              <w:top w:w="80" w:type="dxa"/>
+              <w:bottom w:w="80" w:type="dxa"/>
+              <w:start w:w="120" w:type="dxa"/>
+              <w:end w:w="120" w:type="dxa"/>
+            </w:tcMar>
+            <w:vAlign w:val="center"/>
+          </w:tcPr>
+          <w:p>
+            <w:pPr>
+              <w:spacing w:after="0"/>
+            </w:pPr>
+            <w:r>
+              <w:rPr>
+                <w:rFonts w:ascii="Calibri" w:hAnsi="Calibri"/>
+                <w:b/>
+                <w:color w:val="555555"/>
+                <w:sz w:val="20"/>
+              </w:rPr>
+              <w:t>Stefano Cacciatore</w:t>
+            </w:r>
+            <w:r>
+              <w:rPr>
+                <w:rFonts w:ascii="Calibri" w:hAnsi="Calibri"/>
+                <w:b w:val="0"/>
+                <w:color w:val="555555"/>
+                <w:sz w:val="16"/>
+                <w:vertAlign w:val="superscript"/>
+              </w:rPr>
+              <w:t>1,2</w:t>
+            </w:r>
+          </w:p>
+        </w:tc>
+        <w:tc>
+          <w:tcPr>
+            <w:tcW w:type="dxa" w:w="4824"/>
+            <w:tcMar>
+              <w:top w:w="80" w:type="dxa"/>
+              <w:bottom w:w="80" w:type="dxa"/>
+              <w:start w:w="120" w:type="dxa"/>
+              <w:end w:w="120" w:type="dxa"/>
+            </w:tcMar>
+            <w:vAlign w:val="center"/>
+          </w:tcPr>
+          <w:p>
+            <w:pPr>
+              <w:spacing w:after="0"/>
+              <w:jc w:val="right"/>
+            </w:pPr>
+            <w:r>
+              <w:rPr>
+                <w:rFonts w:ascii="Calibri" w:hAnsi="Calibri"/>
+                <w:b w:val="0"/>
+                <w:smallCaps/>
+                <w:color w:val="555555"/>
+                <w:sz w:val="17"/>
+              </w:rPr>
+              <w:t>stefano.cacciatore@icgeb.org</w:t>
+            </w:r>
+          </w:p>
+        </w:tc>
+      </w:tr>
+    </w:tbl>
     <w:p>
       <w:pPr>
         <w:spacing w:after="20" w:line="240" w:lineRule="auto"/>
@@ -183,10 +550,11 @@
         <w:rPr>
           <w:rFonts w:ascii="Calibri" w:hAnsi="Calibri"/>
           <w:b w:val="0"/>
+          <w:i/>
           <w:color w:val="555555"/>
           <w:sz w:val="17"/>
         </w:rPr>
-        <w:t xml:space="preserve"> Bioinformatics Unit, International Center for Genetic Engineering and Biotechnology, Cape Town 7925, South Africa.</w:t>
+        <w:t xml:space="preserve"> Bioinformatics Unit, International Centre for Genetic Engineering and Biotechnology (ICGEB), Cape Town 7925, South Africa</w:t>
       </w:r>
     </w:p>
     <w:p>
@@ -207,10 +575,11 @@
         <w:rPr>
           <w:rFonts w:ascii="Calibri" w:hAnsi="Calibri"/>
           <w:b w:val="0"/>
+          <w:i/>
           <w:color w:val="555555"/>
           <w:sz w:val="17"/>
         </w:rPr>
-        <w:t xml:space="preserve"> Department of Integrative Biomedical Sciences, Institute of Infectious Disease &amp; Molecular Medicine (IDM), University of Cape Town, Cape Town 7925, South Africa.</w:t>
+        <w:t xml:space="preserve"> Department of Integrative Biomedical Sciences, Institute of Infectious Disease &amp; Molecular Medicine (IDM), University of Cape Town, Cape Town 7925, South Africa</w:t>
       </w:r>
     </w:p>
     <w:p>
@@ -231,10 +600,11 @@
         <w:rPr>
           <w:rFonts w:ascii="Calibri" w:hAnsi="Calibri"/>
           <w:b w:val="0"/>
+          <w:i/>
           <w:color w:val="555555"/>
           <w:sz w:val="17"/>
         </w:rPr>
-        <w:t xml:space="preserve"> Department of Chemistry "Ugo Schiff", University of Florence, Sesto Fiorentino, Italy.</w:t>
+        <w:t xml:space="preserve"> Department of Chemistry "Ugo Schiff", University of Florence, Sesto Fiorentino, Italy</w:t>
       </w:r>
     </w:p>
     <w:p>
@@ -255,24 +625,11 @@
         <w:rPr>
           <w:rFonts w:ascii="Calibri" w:hAnsi="Calibri"/>
           <w:b w:val="0"/>
+          <w:i/>
           <w:color w:val="555555"/>
           <w:sz w:val="17"/>
         </w:rPr>
-        <w:t xml:space="preserve"> Magnetic Resonance Center (CERM), University of Florence, Sesto Fiorentino, Italy.</w:t>
-      </w:r>
-    </w:p>
-    <w:p>
-      <w:pPr>
-        <w:spacing w:before="40" w:after="200"/>
-      </w:pPr>
-      <w:r>
-        <w:rPr>
-          <w:rFonts w:ascii="Calibri" w:hAnsi="Calibri"/>
-          <w:b w:val="0"/>
-          <w:color w:val="555555"/>
-          <w:sz w:val="17"/>
-        </w:rPr>
-        <w:t>Corresponding author: Stefano Cacciatore, stefano.cacciatore@icgeb.org</w:t>
+        <w:t xml:space="preserve"> Magnetic Resonance Center (CERM), University of Florence, Sesto Fiorentino, Italy</w:t>
       </w:r>
     </w:p>
     <w:p>

</xml_diff>

<commit_message>
Optimize float32 PLS-LDA across CPU CUDA and Metal
</commit_message>
<xml_diff>
--- a/manuscript/kodama_cpp_jmlr_manuscript.docx
+++ b/manuscript/kodama_cpp_jmlr_manuscript.docx
@@ -1250,6 +1250,11 @@
     <w:p>
       <w:r>
         <w:t>The public KODAMA.matrix routine is reproducible from the following option definitions and run-level procedure. The description below names the C++ options because the R and Python wrappers should expose the same contract.</w:t>
+      </w:r>
+    </w:p>
+    <w:p>
+      <w:r>
+        <w:br w:type="page"/>
       </w:r>
     </w:p>
     <w:tbl>
@@ -1922,6 +1927,11 @@
     </w:p>
     <w:p>
       <w:r>
+        <w:t>Latent-space LDA is fitted from sufficient statistics. For training scores T, class counts n_c, class means mu_c, q retained components, and C active classes, the pooled within-class covariance is [T' T - sum_c n_c mu_c mu_c'] / max(1, n - C). Each discriminant direction solves Sigma w_c = mu_c by Cholesky factorization and triangular substitution; Sigma is never explicitly inverted. The diagonal regularizer is lambda = rho s, where s = trace(Sigma) / q when finite and positive and s = 1 otherwise. The deterministic sequence rho in {1e-8, 1e-6, 1e-5, 1e-4, 1e-3, 1e-2} is advanced only when Cholesky fails. Prediction retains the ordinary LDA discriminant t' w_c - 0.5 mu_c' w_c + log(n_c / n); the sequence is a numerical safeguard, not a tuned parameter.</w:t>
+      </w:r>
+    </w:p>
+    <w:p>
+      <w:r>
         <w:t>The library also exposes float32 randomized PCA as a preprocessing and embedding-initialization primitive. A Gaussian range sketch, backend-specific automatic oversampling and power-iteration policy, orthonormal basis, and compact eigensolve produce scores, loadings, singular values, and explained variance. CPU, CUDA, and Metal entry points share this contract. The implementation follows the current fastEmbedR/fastPLS strategy but is standalone and does not link either package, Armadillo, Eigen, or RAFT.</w:t>
       </w:r>
     </w:p>
@@ -2043,6 +2053,11 @@
     </w:p>
     <w:p>
       <w:r>
+        <w:t>The default rank-one randomized SIMPLS refresh uses two power iterations. CUDA dispatches the resulting rank-one products as matrix-vector operations and omits the algebraically redundant 1-by-1 block eigensolve. After the first component, the preceding weight is the defined warm start, so the implementation also omits generation of a random vector that would be overwritten before use; this removes launches without changing any SIMPLS value. The multi-vector refresh remains available under the same deflation equations. Latent LDA forms pooled covariance from score and class-sum statistics, retries the trace-normalized ridge sequence only after a failed Cholesky factorization, and copies back predicted codes rather than score matrices.</w:t>
+      </w:r>
+    </w:p>
+    <w:p>
+      <w:r>
         <w:t>The CUDA backend reduces allocation and transfer costs but the present release does not claim that the complete M-run ensemble is permanently device resident. Independent runs are scheduled without changing their seeds or proposal trajectories, and small control decisions remain host orchestrated. Fully batched resident M execution is therefore treated as future engineering work, not as evidence used in the current speedup claims.</w:t>
       </w:r>
     </w:p>
@@ -2061,12 +2076,12 @@
     </w:p>
     <w:p>
       <w:r>
-        <w:t>The Metal PLS-LDA path uses float32 class-label cross-products and the same SIMPLS component limit as CPU and CUDA. Metal Performance Shaders execute the dominant Xw and X't matrix products through MPSMatrixMultiplication. The comparatively small response-space power iterations and SIMPLS deflation updates remain host operations. This division is stated explicitly because a native Metal backend does not imply that every scalar operation is a GPU kernel.</w:t>
+        <w:t>The Metal PLS-LDA path uses float32 class-label cross-products and the same SIMPLS component limit as CPU and CUDA. Metal Performance Shaders execute the dominant Xw and X't matrix products through MPSMatrixMultiplication. The same two-iteration incremental refresh and SIMPLS loading deflation are used on all three backends; the comparatively small response-space products and deflation updates remain host operations. This division is stated explicitly because a native Metal backend does not imply that every scalar operation is a GPU kernel.</w:t>
       </w:r>
     </w:p>
     <w:p>
       <w:r>
-        <w:t>Metal is a first-class backend contract: it has named KNNCV, PLSLDACV, CoreKNN, CorePLSLDA, and KODAMAMatrix entry points, reports Metal in result metadata, and is covered by dedicated parity tests. Unsupported Metal operations fail explicitly instead of being relabeled CPU execution. This makes Apple GPU results auditable in the same manner as CUDA results.</w:t>
+        <w:t>Metal is a first-class backend contract: it has named KNNCV, PLSLDACV, CoreKNN, CorePLSLDA, and KODAMAMatrix entry points, reports Metal in result metadata, and is covered by dedicated parity tests. Unsupported Metal operations fail explicitly instead of being relabeled CPU execution. The R integration layer accepts backend = 'metal' explicitly and links the Metal, MetalPerformanceShaders, and Foundation system frameworks without FAISS or cuVS link flags. This makes Apple GPU results auditable in the same manner as CUDA results.</w:t>
       </w:r>
     </w:p>
     <w:p>
@@ -5939,7 +5954,7 @@
                 <w:rFonts w:ascii="Calibri" w:hAnsi="Calibri"/>
                 <w:sz w:val="16"/>
               </w:rPr>
-              <w:t>2026-07-19 UTC for current-CRAN and CI/coverage validation; 2026-07-18 UTC for CUDA visualization validation; M/Tcycle validation dated 2026-07-16 UTC; earlier broad kernel snapshot dated 2026-07-06 UTC</w:t>
+              <w:t>2026-07-20 UTC for current CPU/CUDA/Metal PLS-LDA validation; 2026-07-19 UTC for current-CRAN and CI/coverage validation; earlier release-validation snapshots are dated explicitly</w:t>
             </w:r>
           </w:p>
         </w:tc>
@@ -8918,7 +8933,7 @@
     </w:p>
     <w:p>
       <w:r>
-        <w:t>The dependency-light backend experiment was run on macOS with CUDA and OpenMP disabled. The CPU build therefore measures the package-owned HNSW and float32 SIMPLS/LDA implementations, while the Metal build links only Apple system frameworks. Exact CPU/Metal equality of the reported classification metrics is the primary acceptance criterion; timings are secondary evidence.</w:t>
+        <w:t>The dependency-light backend experiment was run on macOS with CUDA and OpenMP disabled. The CPU build therefore measures the package-owned HNSW and float32 SIMPLS/LDA implementations, while the Metal build links only Apple system frameworks. CPU/Metal agreement within the documented float32 tolerance is the primary acceptance criterion; timings are secondary evidence.</w:t>
       </w:r>
     </w:p>
     <w:p>
@@ -9308,7 +9323,7 @@
                 <w:rFonts w:ascii="Calibri" w:hAnsi="Calibri"/>
                 <w:sz w:val="13"/>
               </w:rPr>
-              <w:t>PLSLDACV, 50 components</w:t>
+              <w:t>PLSLDACV, 50 components, five-run median</w:t>
             </w:r>
           </w:p>
         </w:tc>
@@ -9332,7 +9347,7 @@
                 <w:rFonts w:ascii="Calibri" w:hAnsi="Calibri"/>
                 <w:sz w:val="13"/>
               </w:rPr>
-              <w:t>3.395</w:t>
+              <w:t>0.790</w:t>
             </w:r>
           </w:p>
         </w:tc>
@@ -9356,7 +9371,7 @@
                 <w:rFonts w:ascii="Calibri" w:hAnsi="Calibri"/>
                 <w:sz w:val="13"/>
               </w:rPr>
-              <w:t>1.054</w:t>
+              <w:t>0.202</w:t>
             </w:r>
           </w:p>
         </w:tc>
@@ -9380,7 +9395,7 @@
                 <w:rFonts w:ascii="Calibri" w:hAnsi="Calibri"/>
                 <w:sz w:val="13"/>
               </w:rPr>
-              <w:t>3.2x</w:t>
+              <w:t>3.90x</w:t>
             </w:r>
           </w:p>
         </w:tc>
@@ -9404,7 +9419,7 @@
                 <w:rFonts w:ascii="Calibri" w:hAnsi="Calibri"/>
                 <w:sz w:val="13"/>
               </w:rPr>
-              <w:t>accuracy 0.991982 / 0.991982</w:t>
+              <w:t>accuracy 0.990836 / 0.989691</w:t>
             </w:r>
           </w:p>
         </w:tc>
@@ -9606,7 +9621,7 @@
                 <w:rFonts w:ascii="Calibri" w:hAnsi="Calibri"/>
                 <w:sz w:val="13"/>
               </w:rPr>
-              <w:t>KODAMA PLS-LDA, M=10 T=20</w:t>
+              <w:t>KODAMA PLS-LDA, M=8 T=20</w:t>
             </w:r>
           </w:p>
         </w:tc>
@@ -9630,7 +9645,7 @@
                 <w:rFonts w:ascii="Calibri" w:hAnsi="Calibri"/>
                 <w:sz w:val="13"/>
               </w:rPr>
-              <w:t>178.403</w:t>
+              <w:t>14.930</w:t>
             </w:r>
           </w:p>
         </w:tc>
@@ -9654,7 +9669,7 @@
                 <w:rFonts w:ascii="Calibri" w:hAnsi="Calibri"/>
                 <w:sz w:val="13"/>
               </w:rPr>
-              <w:t>78.746</w:t>
+              <w:t>6.900</w:t>
             </w:r>
           </w:p>
         </w:tc>
@@ -9678,7 +9693,7 @@
                 <w:rFonts w:ascii="Calibri" w:hAnsi="Calibri"/>
                 <w:sz w:val="13"/>
               </w:rPr>
-              <w:t>2.27x</w:t>
+              <w:t>2.16x</w:t>
             </w:r>
           </w:p>
         </w:tc>
@@ -9702,7 +9717,7 @@
                 <w:rFonts w:ascii="Calibri" w:hAnsi="Calibri"/>
                 <w:sz w:val="13"/>
               </w:rPr>
-              <w:t>CV 0.983206; ARI 0.835153; 32 classes</w:t>
+              <w:t>best CV 0.963359 / 0.969466; ARI 0.741026 / 0.849732</w:t>
             </w:r>
           </w:p>
         </w:tc>
@@ -9728,7 +9743,7 @@
     </w:p>
     <w:p>
       <w:r>
-        <w:t>The M = 100, Tcycle = 100 MetRef validation shows why cross-validated accuracy is reported together with label-quality diagnostics. Both optimizers reached best CV accuracy 1.000, but KNN selected only three classes and had ARI 0.052. PLS-LDA selected 21 classes against 22 reference classes, attained ARI 0.770, and increased truth-label UMAP silhouette from 0.129 for the classic graph to 0.783 for the KODAMA graph. These reference labels were never supplied to optimization. We therefore report CV accuracy, active classes, external-label agreement when available, and downstream compactness as complementary rather than interchangeable diagnostics.</w:t>
+        <w:t>The current M = 100, Tcycle = 100 MetRef validation shows why cross-validated accuracy is reported together with label-quality diagnostics. Optimized CPU and CUDA PLS-LDA both reached maximum CV accuracy 1.000 and median CV accuracy 0.992366. The CV-selected CPU/CUDA runs contained 24/21 classes and attained ARI 0.7654/0.8322 against the 22 reference classes. With one exact k = 30 UMAP implementation, a shared original-data PCA initialization, and reference labels withheld until evaluation, truth-label silhouette increased from 0.119 for the classic graph to 0.8303/0.8441 for the CPU/CUDA KODAMA graphs. We therefore report CV accuracy, active classes, external-label agreement when available, and downstream compactness as complementary rather than interchangeable diagnostics.</w:t>
       </w:r>
     </w:p>
     <w:p>
@@ -16931,7 +16946,7 @@
                 <w:rFonts w:ascii="Calibri" w:hAnsi="Calibri"/>
                 <w:sz w:val="14"/>
               </w:rPr>
-              <w:t>584.089</w:t>
+              <w:t>177.131</w:t>
             </w:r>
           </w:p>
         </w:tc>
@@ -16955,7 +16970,7 @@
                 <w:rFonts w:ascii="Calibri" w:hAnsi="Calibri"/>
                 <w:sz w:val="14"/>
               </w:rPr>
-              <w:t>584.074</w:t>
+              <w:t>173.104</w:t>
             </w:r>
           </w:p>
         </w:tc>
@@ -17003,7 +17018,7 @@
                 <w:rFonts w:ascii="Calibri" w:hAnsi="Calibri"/>
                 <w:sz w:val="14"/>
               </w:rPr>
-              <w:t>0.7700/0.7048</w:t>
+              <w:t>0.9171/0.7095</w:t>
             </w:r>
           </w:p>
         </w:tc>
@@ -17051,12 +17066,60 @@
                 <w:rFonts w:ascii="Calibri" w:hAnsi="Calibri"/>
                 <w:sz w:val="14"/>
               </w:rPr>
-              <w:t>15-34</w:t>
+              <w:t>11-33</w:t>
             </w:r>
           </w:p>
         </w:tc>
       </w:tr>
     </w:tbl>
+    <w:p>
+      <w:pPr>
+        <w:spacing w:before="120"/>
+        <w:jc w:val="center"/>
+      </w:pPr>
+      <w:r>
+        <w:drawing>
+          <wp:inline xmlns:a="http://schemas.openxmlformats.org/drawingml/2006/main" xmlns:pic="http://schemas.openxmlformats.org/drawingml/2006/picture">
+            <wp:extent cx="5897880" cy="2015109"/>
+            <wp:docPr id="2" name="Picture 2"/>
+            <wp:cNvGraphicFramePr>
+              <a:graphicFrameLocks noChangeAspect="1"/>
+            </wp:cNvGraphicFramePr>
+            <a:graphic>
+              <a:graphicData uri="http://schemas.openxmlformats.org/drawingml/2006/picture">
+                <pic:pic>
+                  <pic:nvPicPr>
+                    <pic:cNvPr id="0" name="MetRef__pls_lda__cpu_cuda_optimized_20260720.png"/>
+                    <pic:cNvPicPr/>
+                  </pic:nvPicPr>
+                  <pic:blipFill>
+                    <a:blip r:embed="rId10"/>
+                    <a:stretch>
+                      <a:fillRect/>
+                    </a:stretch>
+                  </pic:blipFill>
+                  <pic:spPr>
+                    <a:xfrm>
+                      <a:off x="0" y="0"/>
+                      <a:ext cx="5897880" cy="2015109"/>
+                    </a:xfrm>
+                    <a:prstGeom prst="rect"/>
+                  </pic:spPr>
+                </pic:pic>
+              </a:graphicData>
+            </a:graphic>
+          </wp:inline>
+        </w:drawing>
+      </w:r>
+    </w:p>
+    <w:p>
+      <w:pPr>
+        <w:pStyle w:val="Caption"/>
+      </w:pPr>
+      <w:r>
+        <w:t>Figure 2. Matched MetRef UMAP validation after the float32 PLS-LDA optimization. Classic data, CPU KODAMA, and CUDA KODAMA use exact k = 30, the same original-data PCA initialization, seed, epochs, and CPU embedding implementation. Colors are external reference labels withheld from optimization.</w:t>
+      </w:r>
+    </w:p>
     <w:p>
       <w:pPr>
         <w:pStyle w:val="Heading3"/>
@@ -17077,7 +17140,7 @@
     </w:p>
     <w:p>
       <w:r>
-        <w:t>The result is deliberately mixed. PLS-LDA increased truth-label silhouette on both embeddings for MetRef (UMAP 0.105 to 0.815; openTSNE 0.067 to 0.530) and PBMC3K PCA50 (0.410 to 0.484; 0.349 to 0.402), but reduced it on OptDigits, USPS, and Macosko2015 retina. KNN reduced silhouette on all five datasets despite best CV accuracy between 0.9927 and 1.0000. Thus a highly predictable optimized label vector is not sufficient evidence of improved external-label recovery or visualization, and no universal visualization-improvement claim is made.</w:t>
+        <w:t>The result is deliberately mixed. PLS-LDA increased truth-label silhouette on both embeddings for MetRef (the current matched UMAP check changed 0.119 to 0.844; the earlier openTSNE check changed 0.067 to 0.530) and PBMC3K PCA50 (0.410 to 0.484; 0.349 to 0.402), but reduced it on OptDigits, USPS, and Macosko2015 retina. KNN reduced silhouette on all five datasets despite best CV accuracy between 0.9927 and 1.0000. Thus a highly predictable optimized label vector is not sufficient evidence of improved external-label recovery or visualization, and no universal visualization-improvement claim is made.</w:t>
       </w:r>
     </w:p>
     <w:p>
@@ -17814,7 +17877,7 @@
                 <w:rFonts w:ascii="Calibri" w:hAnsi="Calibri"/>
                 <w:sz w:val="13"/>
               </w:rPr>
-              <w:t>0.105 -&gt; 0.815</w:t>
+              <w:t>0.119 -&gt; 0.844</w:t>
             </w:r>
           </w:p>
         </w:tc>
@@ -17838,7 +17901,7 @@
                 <w:rFonts w:ascii="Calibri" w:hAnsi="Calibri"/>
                 <w:sz w:val="13"/>
               </w:rPr>
-              <w:t>+0.709</w:t>
+              <w:t>+0.725</w:t>
             </w:r>
           </w:p>
         </w:tc>
@@ -17862,7 +17925,7 @@
                 <w:rFonts w:ascii="Calibri" w:hAnsi="Calibri"/>
                 <w:sz w:val="13"/>
               </w:rPr>
-              <w:t>0.590 -&gt; 0.966</w:t>
+              <w:t>not recomputed</w:t>
             </w:r>
           </w:p>
         </w:tc>
@@ -17886,7 +17949,7 @@
                 <w:rFonts w:ascii="Calibri" w:hAnsi="Calibri"/>
                 <w:sz w:val="13"/>
               </w:rPr>
-              <w:t>0.879 / 28</w:t>
+              <w:t>0.832 / 21</w:t>
             </w:r>
           </w:p>
         </w:tc>
@@ -17910,7 +17973,7 @@
                 <w:rFonts w:ascii="Calibri" w:hAnsi="Calibri"/>
                 <w:sz w:val="13"/>
               </w:rPr>
-              <w:t>589.633</w:t>
+              <w:t>173.104</w:t>
             </w:r>
           </w:p>
         </w:tc>
@@ -21274,7 +21337,7 @@
         <w:drawing>
           <wp:inline xmlns:a="http://schemas.openxmlformats.org/drawingml/2006/main" xmlns:pic="http://schemas.openxmlformats.org/drawingml/2006/picture">
             <wp:extent cx="5897880" cy="3563303"/>
-            <wp:docPr id="2" name="Picture 2"/>
+            <wp:docPr id="3" name="Picture 3"/>
             <wp:cNvGraphicFramePr>
               <a:graphicFrameLocks noChangeAspect="1"/>
             </wp:cNvGraphicFramePr>
@@ -21286,7 +21349,7 @@
                     <pic:cNvPicPr/>
                   </pic:nvPicPr>
                   <pic:blipFill>
-                    <a:blip r:embed="rId10"/>
+                    <a:blip r:embed="rId11"/>
                     <a:stretch>
                       <a:fillRect/>
                     </a:stretch>
@@ -21317,7 +21380,7 @@
           <w:color w:val="555555"/>
           <w:sz w:val="18"/>
         </w:rPr>
-        <w:t>Figure 2. Fixed M = 100 and Tcycle = 100 nonspatial visualization validation. Panels A and B compare truth-label silhouette; panel C reports complete KODAMA.matrix wall time on a logarithmic scale; panel D reports selected-run ARI. Reference labels were used only after optimization.</w:t>
+        <w:t>Figure 3. Fixed M = 100 and Tcycle = 100 nonspatial visualization validation. Panels A and B compare truth-label silhouette; panel C reports complete KODAMA.matrix wall time on a logarithmic scale; panel D reports selected-run ARI. Reference labels were used only after optimization.</w:t>
       </w:r>
     </w:p>
     <w:p>
@@ -22921,7 +22984,7 @@
         <w:drawing>
           <wp:inline xmlns:a="http://schemas.openxmlformats.org/drawingml/2006/main" xmlns:pic="http://schemas.openxmlformats.org/drawingml/2006/picture">
             <wp:extent cx="5897880" cy="3753196"/>
-            <wp:docPr id="3" name="Picture 3"/>
+            <wp:docPr id="4" name="Picture 4"/>
             <wp:cNvGraphicFramePr>
               <a:graphicFrameLocks noChangeAspect="1"/>
             </wp:cNvGraphicFramePr>
@@ -22933,7 +22996,7 @@
                     <pic:cNvPicPr/>
                   </pic:nvPicPr>
                   <pic:blipFill>
-                    <a:blip r:embed="rId11"/>
+                    <a:blip r:embed="rId12"/>
                     <a:stretch>
                       <a:fillRect/>
                     </a:stretch>
@@ -22964,7 +23027,7 @@
           <w:color w:val="555555"/>
           <w:sz w:val="18"/>
         </w:rPr>
-        <w:t>Figure 3. Sensitivity of KODAMA quality and runtime to Tcycle and M on named nonspatial datasets.</w:t>
+        <w:t>Figure 4. Sensitivity of KODAMA quality and runtime to Tcycle and M on named nonspatial datasets.</w:t>
       </w:r>
     </w:p>
     <w:p>
@@ -23520,7 +23583,7 @@
         <w:drawing>
           <wp:inline xmlns:a="http://schemas.openxmlformats.org/drawingml/2006/main" xmlns:pic="http://schemas.openxmlformats.org/drawingml/2006/picture">
             <wp:extent cx="5897880" cy="2621280"/>
-            <wp:docPr id="4" name="Picture 4"/>
+            <wp:docPr id="5" name="Picture 5"/>
             <wp:cNvGraphicFramePr>
               <a:graphicFrameLocks noChangeAspect="1"/>
             </wp:cNvGraphicFramePr>
@@ -23532,7 +23595,7 @@
                     <pic:cNvPicPr/>
                   </pic:nvPicPr>
                   <pic:blipFill>
-                    <a:blip r:embed="rId12"/>
+                    <a:blip r:embed="rId13"/>
                     <a:stretch>
                       <a:fillRect/>
                     </a:stretch>
@@ -23563,7 +23626,7 @@
           <w:color w:val="555555"/>
           <w:sz w:val="18"/>
         </w:rPr>
-        <w:t>Figure 4. Convergence of edge-agreement weights as independent KODAMA runs are added. RMSE is measured against the M = 100 ensemble; the right panel shows the Bernoulli worst-case Monte Carlo standard error.</w:t>
+        <w:t>Figure 5. Convergence of edge-agreement weights as independent KODAMA runs are added. RMSE is measured against the M = 100 ensemble; the right panel shows the Bernoulli worst-case Monte Carlo standard error.</w:t>
       </w:r>
     </w:p>
     <w:p>
@@ -24104,7 +24167,7 @@
                 <w:rFonts w:ascii="Calibri" w:hAnsi="Calibri"/>
                 <w:sz w:val="14"/>
               </w:rPr>
-              <w:t>CUDA PLSLDACV rows report 27.2x speedup on MetRef; Metal reproduced 50-component MetRef accuracy exactly with a 3.2x speedup over the dependency-free CPU build.</w:t>
+              <w:t>The current MetRef M = 100, Tcycle = 100 PLS-LDA run required 340.451 s on four CPU cores and 177.131 s on CUDA, a 1.92x end-to-end speedup with identical median CV accuracy 0.992366. In a fresh five-run fixed-50-component check, median PLSLDACV time was 0.790 s on four Mac CPU threads and 0.202 s on Metal (3.90x), with accuracy 0.990836 and 0.989691; the one-sample difference is within the documented float32 backend tolerance. On chiamaka, the corresponding medians were 1.294 s on four CPU threads and 0.308 s on CUDA (4.20x), with accuracy differing by at most one sample.</w:t>
             </w:r>
           </w:p>
         </w:tc>
@@ -26259,6 +26322,11 @@
         </w:tc>
       </w:tr>
     </w:tbl>
+    <w:p>
+      <w:r>
+        <w:br w:type="page"/>
+      </w:r>
+    </w:p>
     <w:p>
       <w:pPr>
         <w:pStyle w:val="Heading1"/>
@@ -28988,7 +29056,7 @@
       </w:r>
     </w:p>
     <w:sectPr>
-      <w:footerReference w:type="default" r:id="rId13"/>
+      <w:footerReference w:type="default" r:id="rId14"/>
       <w:pgSz w:w="12240" w:h="15840"/>
       <w:pgMar w:top="1440" w:right="1440" w:bottom="1440" w:left="1440" w:header="708" w:footer="708" w:gutter="0"/>
       <w:cols w:space="720"/>

</xml_diff>

<commit_message>
Clarify raw data and graph matrix inputs
</commit_message>
<xml_diff>
--- a/manuscript/kodama_cpp_jmlr_manuscript.docx
+++ b/manuscript/kodama_cpp_jmlr_manuscript.docx
@@ -7391,7 +7391,7 @@
           <w:rFonts w:ascii="Courier New" w:hAnsi="Courier New"/>
           <w:sz w:val="13"/>
         </w:rPr>
-        <w:t>fit_graph &lt;- KODAMA.matrix(p, classifier = "knn")</w:t>
+        <w:t>fit_graph &lt;- KODAMA.matrix(graph = p, classifier = "knn")</w:t>
       </w:r>
     </w:p>
     <w:p>
@@ -7406,7 +7406,7 @@
           <w:rFonts w:ascii="Courier New" w:hAnsi="Courier New"/>
           <w:sz w:val="13"/>
         </w:rPr>
-        <w:t>fit_graph_x &lt;- KODAMA.matrix(p, raw.data = X, classifier = "pls_lda")</w:t>
+        <w:t>fit_graph_x &lt;- KODAMA.matrix(data = X, graph = p, classifier = "pls_lda")</w:t>
       </w:r>
     </w:p>
     <w:p>
@@ -7421,7 +7421,7 @@
           <w:rFonts w:ascii="Courier New" w:hAnsi="Courier New"/>
           <w:sz w:val="13"/>
         </w:rPr>
-        <w:t>fit_raw &lt;- KODAMA.matrix(X, classifier = "pls_lda")</w:t>
+        <w:t>fit_raw &lt;- KODAMA.matrix(data = X, classifier = "pls_lda")</w:t>
       </w:r>
     </w:p>
     <w:p>
@@ -7436,7 +7436,7 @@
           <w:rFonts w:ascii="Courier New" w:hAnsi="Courier New"/>
           <w:sz w:val="13"/>
         </w:rPr>
-        <w:t>fit_bare &lt;- KODAMA.matrix(list(indices = I, distances = D), classifier = "knn")</w:t>
+        <w:t>fit_bare &lt;- KODAMA.matrix(graph = list(indices = I, distances = D), classifier = "knn")</w:t>
       </w:r>
     </w:p>
     <w:p>
@@ -7496,7 +7496,7 @@
           <w:rFonts w:ascii="Courier New" w:hAnsi="Courier New"/>
           <w:sz w:val="13"/>
         </w:rPr>
-        <w:t>fit_graph = kodama.matrix(p, classifier="knn")</w:t>
+        <w:t>fit_graph = kodama.matrix(graph=p, classifier="knn")</w:t>
       </w:r>
     </w:p>
     <w:p>
@@ -7511,7 +7511,7 @@
           <w:rFonts w:ascii="Courier New" w:hAnsi="Courier New"/>
           <w:sz w:val="13"/>
         </w:rPr>
-        <w:t>fit_graph_x = kodama.matrix(p, raw_data=X, classifier="pls_lda")</w:t>
+        <w:t>fit_graph_x = kodama.matrix(data=X, graph=p, classifier="pls_lda")</w:t>
       </w:r>
     </w:p>
     <w:p>
@@ -7526,7 +7526,7 @@
           <w:rFonts w:ascii="Courier New" w:hAnsi="Courier New"/>
           <w:sz w:val="13"/>
         </w:rPr>
-        <w:t>fit_raw = kodama.matrix(X, classifier="pls_lda")</w:t>
+        <w:t>fit_raw = kodama.matrix(data=X, classifier="pls_lda")</w:t>
       </w:r>
     </w:p>
     <w:p>
@@ -7541,7 +7541,7 @@
           <w:rFonts w:ascii="Courier New" w:hAnsi="Courier New"/>
           <w:sz w:val="13"/>
         </w:rPr>
-        <w:t>fit_bare = kodama.matrix({"indices": I, "distances": D}, classifier="knn")</w:t>
+        <w:t>fit_bare = kodama.matrix(graph={"indices": I, "distances": D}, classifier="knn")</w:t>
       </w:r>
     </w:p>
     <w:p>

</xml_diff>